<commit_message>
Full abstract first draft
</commit_message>
<xml_diff>
--- a/Toxicity analysis in Greek text.docx
+++ b/Toxicity analysis in Greek text.docx
@@ -228,7 +228,6 @@
           <w:b/>
           <w:sz w:val="28"/>
           <w:szCs w:val="28"/>
-          <w:lang w:val="en-US"/>
         </w:rPr>
       </w:pPr>
       <w:r>
@@ -1622,26 +1621,41 @@
           <w:rFonts w:ascii="Times New Roman" w:hAnsi="Times New Roman" w:cs="Times New Roman"/>
           <w:sz w:val="28"/>
           <w:szCs w:val="28"/>
-          <w:lang w:val="en-US"/>
-        </w:rPr>
-      </w:pPr>
-    </w:p>
-    <w:p>
-      <w:pPr>
-        <w:ind w:right="282"/>
-        <w:rPr>
-          <w:rFonts w:ascii="Times New Roman" w:hAnsi="Times New Roman" w:cs="Times New Roman"/>
-          <w:sz w:val="24"/>
-          <w:szCs w:val="24"/>
-        </w:rPr>
-      </w:pPr>
-      <w:r>
-        <w:rPr>
-          <w:rFonts w:ascii="Times New Roman" w:hAnsi="Times New Roman" w:cs="Times New Roman"/>
-          <w:sz w:val="24"/>
-          <w:szCs w:val="24"/>
-        </w:rPr>
-        <w:t xml:space="preserve">Η τοξική συμπεριφορά στο διαδίκτυο γίνεται όλο ένα και περισσότερη. Η μηχανική μάθηση μας προσφέρει εργαλεία για την αποτελεσματική ανίχνευση και πρόληψη τοξικών σχόλιων με την χρήση </w:t>
+        </w:rPr>
+      </w:pPr>
+    </w:p>
+    <w:p>
+      <w:pPr>
+        <w:ind w:right="282"/>
+        <w:rPr>
+          <w:rFonts w:ascii="Times New Roman" w:hAnsi="Times New Roman" w:cs="Times New Roman"/>
+          <w:sz w:val="24"/>
+          <w:szCs w:val="24"/>
+        </w:rPr>
+      </w:pPr>
+      <w:r>
+        <w:rPr>
+          <w:rFonts w:ascii="Times New Roman" w:hAnsi="Times New Roman" w:cs="Times New Roman"/>
+          <w:sz w:val="24"/>
+          <w:szCs w:val="24"/>
+        </w:rPr>
+        <w:t xml:space="preserve">Η τοξική συμπεριφορά στο διαδίκτυο όλο ένα και </w:t>
+      </w:r>
+      <w:r>
+        <w:rPr>
+          <w:rFonts w:ascii="Times New Roman" w:hAnsi="Times New Roman" w:cs="Times New Roman"/>
+          <w:sz w:val="24"/>
+          <w:szCs w:val="24"/>
+        </w:rPr>
+        <w:t>πολλαπλασιάζεται</w:t>
+      </w:r>
+      <w:r>
+        <w:rPr>
+          <w:rFonts w:ascii="Times New Roman" w:hAnsi="Times New Roman" w:cs="Times New Roman"/>
+          <w:sz w:val="24"/>
+          <w:szCs w:val="24"/>
+        </w:rPr>
+        <w:t xml:space="preserve">. Η μηχανική μάθηση μας προσφέρει εργαλεία για την αποτελεσματική ανίχνευση και πρόληψη τοξικών σχόλιων με την χρήση </w:t>
       </w:r>
       <w:r>
         <w:rPr>
@@ -1665,7 +1679,7 @@
           <w:sz w:val="24"/>
           <w:szCs w:val="24"/>
         </w:rPr>
-        <w:t xml:space="preserve">Τα δεδομένα που υπάρχουν για την εκμάθηση αλγορίθμων στον τομέα της τοξικότητας και πιο συγκεκριμένα στα Ελληνικά είναι ελάχιστα σε σχέση με την πληθώρα δεδομένων στα αγγλικά. Σε αυτή την εργασία θα εξετάσουμε πως </w:t>
+        <w:t xml:space="preserve">Τα δεδομένα που υπάρχουν για την εκμάθηση αλγορίθμων στον τομέα της τοξικότητας στα Ελληνικά είναι ελάχιστα σε σχέση με την πληθώρα δεδομένων στα αγγλικά. Σε αυτή την εργασία θα εξετάσουμε πως </w:t>
       </w:r>
       <w:r>
         <w:rPr>
@@ -1689,15 +1703,135 @@
           <w:sz w:val="24"/>
           <w:szCs w:val="24"/>
         </w:rPr>
-        <w:t>τα εν λόγο δεδομένα. Συγκεκριμένα θα χρησιμοποιήσουμε τρείς αλγόριθμους ξεκινώντας από έναν απλό, συνεχίζοντας σε έναν μεσαίας πολυπλοκότητας και τελειώνοντας στον πιο περίπλοκο</w:t>
-      </w:r>
-      <w:r>
-        <w:rPr>
-          <w:rFonts w:ascii="Times New Roman" w:hAnsi="Times New Roman" w:cs="Times New Roman"/>
-          <w:sz w:val="24"/>
-          <w:szCs w:val="24"/>
-        </w:rPr>
-        <w:t>, θα τους συγκρίνουμε και θα μελετήσουμε τα αποτελέσματα.</w:t>
+        <w:t xml:space="preserve">τα εν λόγο δεδομένα. Συγκεκριμένα θα χρησιμοποιήσουμε έναν </w:t>
+      </w:r>
+      <w:r>
+        <w:rPr>
+          <w:rFonts w:ascii="Times New Roman" w:hAnsi="Times New Roman" w:cs="Times New Roman"/>
+          <w:sz w:val="24"/>
+          <w:szCs w:val="24"/>
+        </w:rPr>
+        <w:t>βασικό αλγόριθμο με απλές μεθόδους</w:t>
+      </w:r>
+      <w:r>
+        <w:rPr>
+          <w:rFonts w:ascii="Times New Roman" w:hAnsi="Times New Roman" w:cs="Times New Roman"/>
+          <w:sz w:val="24"/>
+          <w:szCs w:val="24"/>
+        </w:rPr>
+        <w:t xml:space="preserve">, </w:t>
+      </w:r>
+      <w:r>
+        <w:rPr>
+          <w:rFonts w:ascii="Times New Roman" w:hAnsi="Times New Roman" w:cs="Times New Roman"/>
+          <w:sz w:val="24"/>
+          <w:szCs w:val="24"/>
+        </w:rPr>
+        <w:t>στην συνέχεια</w:t>
+      </w:r>
+      <w:r>
+        <w:rPr>
+          <w:rFonts w:ascii="Times New Roman" w:hAnsi="Times New Roman" w:cs="Times New Roman"/>
+          <w:sz w:val="24"/>
+          <w:szCs w:val="24"/>
+        </w:rPr>
+        <w:t xml:space="preserve"> έναν </w:t>
+      </w:r>
+      <w:r>
+        <w:rPr>
+          <w:rFonts w:ascii="Times New Roman" w:hAnsi="Times New Roman" w:cs="Times New Roman"/>
+          <w:sz w:val="24"/>
+          <w:szCs w:val="24"/>
+        </w:rPr>
+        <w:t>ενδιάμεσο αλγόριθμο</w:t>
+      </w:r>
+      <w:r>
+        <w:rPr>
+          <w:rFonts w:ascii="Times New Roman" w:hAnsi="Times New Roman" w:cs="Times New Roman"/>
+          <w:sz w:val="24"/>
+          <w:szCs w:val="24"/>
+        </w:rPr>
+        <w:t xml:space="preserve"> και τ</w:t>
+      </w:r>
+      <w:r>
+        <w:rPr>
+          <w:rFonts w:ascii="Times New Roman" w:hAnsi="Times New Roman" w:cs="Times New Roman"/>
+          <w:sz w:val="24"/>
+          <w:szCs w:val="24"/>
+        </w:rPr>
+        <w:t>έ</w:t>
+      </w:r>
+      <w:r>
+        <w:rPr>
+          <w:rFonts w:ascii="Times New Roman" w:hAnsi="Times New Roman" w:cs="Times New Roman"/>
+          <w:sz w:val="24"/>
+          <w:szCs w:val="24"/>
+        </w:rPr>
+        <w:t>λ</w:t>
+      </w:r>
+      <w:r>
+        <w:rPr>
+          <w:rFonts w:ascii="Times New Roman" w:hAnsi="Times New Roman" w:cs="Times New Roman"/>
+          <w:sz w:val="24"/>
+          <w:szCs w:val="24"/>
+        </w:rPr>
+        <w:t>ο</w:t>
+      </w:r>
+      <w:r>
+        <w:rPr>
+          <w:rFonts w:ascii="Times New Roman" w:hAnsi="Times New Roman" w:cs="Times New Roman"/>
+          <w:sz w:val="24"/>
+          <w:szCs w:val="24"/>
+        </w:rPr>
+        <w:t xml:space="preserve">ς </w:t>
+      </w:r>
+      <w:r>
+        <w:rPr>
+          <w:rFonts w:ascii="Times New Roman" w:hAnsi="Times New Roman" w:cs="Times New Roman"/>
+          <w:sz w:val="24"/>
+          <w:szCs w:val="24"/>
+        </w:rPr>
+        <w:t>τον</w:t>
+      </w:r>
+      <w:r>
+        <w:rPr>
+          <w:rFonts w:ascii="Times New Roman" w:hAnsi="Times New Roman" w:cs="Times New Roman"/>
+          <w:sz w:val="24"/>
+          <w:szCs w:val="24"/>
+        </w:rPr>
+        <w:t xml:space="preserve"> </w:t>
+      </w:r>
+      <w:r>
+        <w:rPr>
+          <w:rFonts w:ascii="Times New Roman" w:hAnsi="Times New Roman" w:cs="Times New Roman"/>
+          <w:sz w:val="24"/>
+          <w:szCs w:val="24"/>
+        </w:rPr>
+        <w:t>πλέον σύγχρονο.</w:t>
+      </w:r>
+      <w:r>
+        <w:rPr>
+          <w:rFonts w:ascii="Times New Roman" w:hAnsi="Times New Roman" w:cs="Times New Roman"/>
+          <w:sz w:val="24"/>
+          <w:szCs w:val="24"/>
+        </w:rPr>
+        <w:t xml:space="preserve"> </w:t>
+      </w:r>
+      <w:r>
+        <w:rPr>
+          <w:rFonts w:ascii="Times New Roman" w:hAnsi="Times New Roman" w:cs="Times New Roman"/>
+          <w:sz w:val="24"/>
+          <w:szCs w:val="24"/>
+        </w:rPr>
+        <w:t>Θ</w:t>
+      </w:r>
+      <w:r>
+        <w:rPr>
+          <w:rFonts w:ascii="Times New Roman" w:hAnsi="Times New Roman" w:cs="Times New Roman"/>
+          <w:sz w:val="24"/>
+          <w:szCs w:val="24"/>
+        </w:rPr>
+        <w:t>α τους συγκρίνουμε και θα μελετήσουμε τα αποτελέσματα.</w:t>
       </w:r>
     </w:p>
     <w:p>
@@ -1811,20 +1945,289 @@
           <w:rFonts w:ascii="Times New Roman" w:hAnsi="Times New Roman" w:cs="Times New Roman"/>
           <w:sz w:val="28"/>
           <w:szCs w:val="28"/>
+        </w:rPr>
+      </w:pPr>
+    </w:p>
+    <w:p>
+      <w:pPr>
+        <w:ind w:right="282"/>
+        <w:rPr>
+          <w:rFonts w:ascii="Times New Roman" w:hAnsi="Times New Roman" w:cs="Times New Roman"/>
+          <w:sz w:val="24"/>
+          <w:szCs w:val="24"/>
           <w:lang w:val="en-US"/>
         </w:rPr>
       </w:pPr>
-    </w:p>
-    <w:p>
-      <w:pPr>
-        <w:ind w:right="282"/>
+      <w:r>
         <w:rPr>
           <w:rFonts w:ascii="Times New Roman" w:hAnsi="Times New Roman" w:cs="Times New Roman"/>
           <w:sz w:val="24"/>
           <w:szCs w:val="24"/>
           <w:lang w:val="en-US"/>
         </w:rPr>
-      </w:pPr>
+        <w:t>Online</w:t>
+      </w:r>
+      <w:r>
+        <w:rPr>
+          <w:rFonts w:ascii="Times New Roman" w:hAnsi="Times New Roman" w:cs="Times New Roman"/>
+          <w:sz w:val="24"/>
+          <w:szCs w:val="24"/>
+          <w:lang w:val="en-US"/>
+        </w:rPr>
+        <w:t xml:space="preserve"> </w:t>
+      </w:r>
+      <w:r>
+        <w:rPr>
+          <w:rFonts w:ascii="Times New Roman" w:hAnsi="Times New Roman" w:cs="Times New Roman"/>
+          <w:sz w:val="24"/>
+          <w:szCs w:val="24"/>
+          <w:lang w:val="en-US"/>
+        </w:rPr>
+        <w:t>toxicity</w:t>
+      </w:r>
+      <w:r>
+        <w:rPr>
+          <w:rFonts w:ascii="Times New Roman" w:hAnsi="Times New Roman" w:cs="Times New Roman"/>
+          <w:sz w:val="24"/>
+          <w:szCs w:val="24"/>
+          <w:lang w:val="en-US"/>
+        </w:rPr>
+        <w:t xml:space="preserve"> </w:t>
+      </w:r>
+      <w:r>
+        <w:rPr>
+          <w:rFonts w:ascii="Times New Roman" w:hAnsi="Times New Roman" w:cs="Times New Roman"/>
+          <w:sz w:val="24"/>
+          <w:szCs w:val="24"/>
+          <w:lang w:val="en-US"/>
+        </w:rPr>
+        <w:t>is getting more common as time goes on. Machine</w:t>
+      </w:r>
+      <w:r>
+        <w:rPr>
+          <w:rFonts w:ascii="Times New Roman" w:hAnsi="Times New Roman" w:cs="Times New Roman"/>
+          <w:sz w:val="24"/>
+          <w:szCs w:val="24"/>
+          <w:lang w:val="en-US"/>
+        </w:rPr>
+        <w:t xml:space="preserve"> </w:t>
+      </w:r>
+      <w:r>
+        <w:rPr>
+          <w:rFonts w:ascii="Times New Roman" w:hAnsi="Times New Roman" w:cs="Times New Roman"/>
+          <w:sz w:val="24"/>
+          <w:szCs w:val="24"/>
+          <w:lang w:val="en-US"/>
+        </w:rPr>
+        <w:t>learning provides us with effective tools for detecting and preventing online toxicity with the use of Natural Language Processing (NLP). Data used for training algorithms specifically in Greek is scarce in comparison to the plethora of data available for English. In this paper we will be examining how three machine learning algorithms with varying levels of complexity compute toxicity data in Greek text and how accurately they classify this data. Specifically</w:t>
+      </w:r>
+      <w:r>
+        <w:rPr>
+          <w:rFonts w:ascii="Times New Roman" w:hAnsi="Times New Roman" w:cs="Times New Roman"/>
+          <w:sz w:val="24"/>
+          <w:szCs w:val="24"/>
+          <w:lang w:val="en-US"/>
+        </w:rPr>
+        <w:t xml:space="preserve">, </w:t>
+      </w:r>
+      <w:r>
+        <w:rPr>
+          <w:rFonts w:ascii="Times New Roman" w:hAnsi="Times New Roman" w:cs="Times New Roman"/>
+          <w:sz w:val="24"/>
+          <w:szCs w:val="24"/>
+          <w:lang w:val="en-US"/>
+        </w:rPr>
+        <w:t>we</w:t>
+      </w:r>
+      <w:r>
+        <w:rPr>
+          <w:rFonts w:ascii="Times New Roman" w:hAnsi="Times New Roman" w:cs="Times New Roman"/>
+          <w:sz w:val="24"/>
+          <w:szCs w:val="24"/>
+          <w:lang w:val="en-US"/>
+        </w:rPr>
+        <w:t xml:space="preserve"> </w:t>
+      </w:r>
+      <w:r>
+        <w:rPr>
+          <w:rFonts w:ascii="Times New Roman" w:hAnsi="Times New Roman" w:cs="Times New Roman"/>
+          <w:sz w:val="24"/>
+          <w:szCs w:val="24"/>
+          <w:lang w:val="en-US"/>
+        </w:rPr>
+        <w:t>will</w:t>
+      </w:r>
+      <w:r>
+        <w:rPr>
+          <w:rFonts w:ascii="Times New Roman" w:hAnsi="Times New Roman" w:cs="Times New Roman"/>
+          <w:sz w:val="24"/>
+          <w:szCs w:val="24"/>
+          <w:lang w:val="en-US"/>
+        </w:rPr>
+        <w:t xml:space="preserve"> </w:t>
+      </w:r>
+      <w:r>
+        <w:rPr>
+          <w:rFonts w:ascii="Times New Roman" w:hAnsi="Times New Roman" w:cs="Times New Roman"/>
+          <w:sz w:val="24"/>
+          <w:szCs w:val="24"/>
+          <w:lang w:val="en-US"/>
+        </w:rPr>
+        <w:t>use</w:t>
+      </w:r>
+      <w:r>
+        <w:rPr>
+          <w:rFonts w:ascii="Times New Roman" w:hAnsi="Times New Roman" w:cs="Times New Roman"/>
+          <w:sz w:val="24"/>
+          <w:szCs w:val="24"/>
+          <w:lang w:val="en-US"/>
+        </w:rPr>
+        <w:t xml:space="preserve"> </w:t>
+      </w:r>
+      <w:r>
+        <w:rPr>
+          <w:rFonts w:ascii="Times New Roman" w:hAnsi="Times New Roman" w:cs="Times New Roman"/>
+          <w:sz w:val="24"/>
+          <w:szCs w:val="24"/>
+          <w:lang w:val="en-US"/>
+        </w:rPr>
+        <w:t>a</w:t>
+      </w:r>
+      <w:r>
+        <w:rPr>
+          <w:rFonts w:ascii="Times New Roman" w:hAnsi="Times New Roman" w:cs="Times New Roman"/>
+          <w:sz w:val="24"/>
+          <w:szCs w:val="24"/>
+          <w:lang w:val="en-US"/>
+        </w:rPr>
+        <w:t xml:space="preserve"> </w:t>
+      </w:r>
+      <w:r>
+        <w:rPr>
+          <w:rFonts w:ascii="Times New Roman" w:hAnsi="Times New Roman" w:cs="Times New Roman"/>
+          <w:sz w:val="24"/>
+          <w:szCs w:val="24"/>
+          <w:lang w:val="en-US"/>
+        </w:rPr>
+        <w:t>baseline</w:t>
+      </w:r>
+      <w:r>
+        <w:rPr>
+          <w:rFonts w:ascii="Times New Roman" w:hAnsi="Times New Roman" w:cs="Times New Roman"/>
+          <w:sz w:val="24"/>
+          <w:szCs w:val="24"/>
+          <w:lang w:val="en-US"/>
+        </w:rPr>
+        <w:t xml:space="preserve"> </w:t>
+      </w:r>
+      <w:r>
+        <w:rPr>
+          <w:rFonts w:ascii="Times New Roman" w:hAnsi="Times New Roman" w:cs="Times New Roman"/>
+          <w:sz w:val="24"/>
+          <w:szCs w:val="24"/>
+          <w:lang w:val="en-US"/>
+        </w:rPr>
+        <w:t xml:space="preserve">algorithm </w:t>
+      </w:r>
+      <w:r>
+        <w:rPr>
+          <w:rFonts w:ascii="Times New Roman" w:hAnsi="Times New Roman" w:cs="Times New Roman"/>
+          <w:sz w:val="24"/>
+          <w:szCs w:val="24"/>
+          <w:lang w:val="en-US"/>
+        </w:rPr>
+        <w:t>using</w:t>
+      </w:r>
+      <w:r>
+        <w:rPr>
+          <w:rFonts w:ascii="Times New Roman" w:hAnsi="Times New Roman" w:cs="Times New Roman"/>
+          <w:sz w:val="24"/>
+          <w:szCs w:val="24"/>
+          <w:lang w:val="en-US"/>
+        </w:rPr>
+        <w:t xml:space="preserve"> simple methods</w:t>
+      </w:r>
+      <w:r>
+        <w:rPr>
+          <w:rFonts w:ascii="Times New Roman" w:hAnsi="Times New Roman" w:cs="Times New Roman"/>
+          <w:sz w:val="24"/>
+          <w:szCs w:val="24"/>
+          <w:lang w:val="en-US"/>
+        </w:rPr>
+        <w:t xml:space="preserve">, </w:t>
+      </w:r>
+      <w:r>
+        <w:rPr>
+          <w:rFonts w:ascii="Times New Roman" w:hAnsi="Times New Roman" w:cs="Times New Roman"/>
+          <w:sz w:val="24"/>
+          <w:szCs w:val="24"/>
+          <w:lang w:val="en-US"/>
+        </w:rPr>
+        <w:t>then</w:t>
+      </w:r>
+      <w:r>
+        <w:rPr>
+          <w:rFonts w:ascii="Times New Roman" w:hAnsi="Times New Roman" w:cs="Times New Roman"/>
+          <w:sz w:val="24"/>
+          <w:szCs w:val="24"/>
+          <w:lang w:val="en-US"/>
+        </w:rPr>
+        <w:t xml:space="preserve"> </w:t>
+      </w:r>
+      <w:r>
+        <w:rPr>
+          <w:rFonts w:ascii="Times New Roman" w:hAnsi="Times New Roman" w:cs="Times New Roman"/>
+          <w:sz w:val="24"/>
+          <w:szCs w:val="24"/>
+          <w:lang w:val="en-US"/>
+        </w:rPr>
+        <w:t xml:space="preserve">an intermediate algorithm with </w:t>
+      </w:r>
+      <w:r>
+        <w:rPr>
+          <w:rFonts w:ascii="Times New Roman" w:hAnsi="Times New Roman" w:cs="Times New Roman"/>
+          <w:sz w:val="24"/>
+          <w:szCs w:val="24"/>
+          <w:lang w:val="en-US"/>
+        </w:rPr>
+        <w:t>added</w:t>
+      </w:r>
+      <w:r>
+        <w:rPr>
+          <w:rFonts w:ascii="Times New Roman" w:hAnsi="Times New Roman" w:cs="Times New Roman"/>
+          <w:sz w:val="24"/>
+          <w:szCs w:val="24"/>
+          <w:lang w:val="en-US"/>
+        </w:rPr>
+        <w:t xml:space="preserve"> complexity and finally the most </w:t>
+      </w:r>
+      <w:r>
+        <w:rPr>
+          <w:rFonts w:ascii="Times New Roman" w:hAnsi="Times New Roman" w:cs="Times New Roman"/>
+          <w:sz w:val="24"/>
+          <w:szCs w:val="24"/>
+          <w:lang w:val="en-US"/>
+        </w:rPr>
+        <w:t>ultramodern</w:t>
+      </w:r>
+      <w:r>
+        <w:rPr>
+          <w:rFonts w:ascii="Times New Roman" w:hAnsi="Times New Roman" w:cs="Times New Roman"/>
+          <w:sz w:val="24"/>
+          <w:szCs w:val="24"/>
+          <w:lang w:val="en-US"/>
+        </w:rPr>
+        <w:t xml:space="preserve"> algorithm</w:t>
+      </w:r>
+      <w:r>
+        <w:rPr>
+          <w:rFonts w:ascii="Times New Roman" w:hAnsi="Times New Roman" w:cs="Times New Roman"/>
+          <w:sz w:val="24"/>
+          <w:szCs w:val="24"/>
+          <w:lang w:val="en-US"/>
+        </w:rPr>
+        <w:t>, we will compare them and interpret the results.</w:t>
+      </w:r>
     </w:p>
     <w:p>
       <w:pPr>

</xml_diff>

<commit_message>
related works better formatting
</commit_message>
<xml_diff>
--- a/Toxicity analysis in Greek text.docx
+++ b/Toxicity analysis in Greek text.docx
@@ -4425,6 +4425,7 @@
         <w:rPr>
           <w:rFonts w:cs="Times New Roman"/>
           <w:szCs w:val="24"/>
+          <w:lang w:val="en-US"/>
         </w:rPr>
       </w:pPr>
       <w:r>
@@ -4438,6 +4439,7 @@
         <w:rPr>
           <w:rFonts w:cs="Times New Roman"/>
           <w:szCs w:val="24"/>
+          <w:lang w:val="en-US"/>
         </w:rPr>
         <w:t>..………………………………………</w:t>
       </w:r>
@@ -4445,6 +4447,7 @@
         <w:rPr>
           <w:rFonts w:cs="Times New Roman"/>
           <w:szCs w:val="24"/>
+          <w:lang w:val="en-US"/>
         </w:rPr>
         <w:t>………………</w:t>
       </w:r>
@@ -4467,6 +4470,7 @@
         <w:rPr>
           <w:rFonts w:cs="Times New Roman"/>
           <w:szCs w:val="24"/>
+          <w:lang w:val="en-US"/>
         </w:rPr>
         <w:t xml:space="preserve"> </w:t>
       </w:r>
@@ -4481,6 +4485,7 @@
         <w:rPr>
           <w:rFonts w:cs="Times New Roman"/>
           <w:szCs w:val="24"/>
+          <w:lang w:val="en-US"/>
         </w:rPr>
         <w:t xml:space="preserve"> </w:t>
       </w:r>
@@ -4568,6 +4573,60 @@
           <w:lang w:val="en-US"/>
         </w:rPr>
         <w:t>Recurrent Neural Network</w:t>
+      </w:r>
+    </w:p>
+    <w:p>
+      <w:pPr>
+        <w:ind w:right="282"/>
+        <w:rPr>
+          <w:rFonts w:cs="Times New Roman"/>
+          <w:szCs w:val="24"/>
+          <w:lang w:val="en-US"/>
+        </w:rPr>
+      </w:pPr>
+      <w:r>
+        <w:rPr>
+          <w:rFonts w:cs="Times New Roman"/>
+          <w:szCs w:val="24"/>
+          <w:lang w:val="en-US"/>
+        </w:rPr>
+        <w:t>OGTD………………………………………………………Offensive Greek Tweet Dataset</w:t>
+      </w:r>
+    </w:p>
+    <w:p>
+      <w:pPr>
+        <w:ind w:right="282"/>
+        <w:rPr>
+          <w:rFonts w:cs="Times New Roman"/>
+          <w:szCs w:val="24"/>
+          <w:lang w:val="en-US"/>
+        </w:rPr>
+      </w:pPr>
+      <w:r>
+        <w:rPr>
+          <w:rFonts w:cs="Times New Roman"/>
+          <w:szCs w:val="24"/>
+          <w:lang w:val="en-US"/>
+        </w:rPr>
+        <w:t>PTSD……………………………………………</w:t>
+      </w:r>
+      <w:proofErr w:type="gramStart"/>
+      <w:r>
+        <w:rPr>
+          <w:rFonts w:cs="Times New Roman"/>
+          <w:szCs w:val="24"/>
+          <w:lang w:val="en-US"/>
+        </w:rPr>
+        <w:t>…..</w:t>
+      </w:r>
+      <w:proofErr w:type="gramEnd"/>
+      <w:r>
+        <w:rPr>
+          <w:rFonts w:cs="Times New Roman"/>
+          <w:szCs w:val="24"/>
+          <w:lang w:val="en-US"/>
+        </w:rPr>
+        <w:t>…Palo Toxicity and Sentiment Dataset</w:t>
       </w:r>
     </w:p>
     <w:p>
@@ -4881,9 +4940,6 @@
     <w:p>
       <w:pPr>
         <w:pStyle w:val="a"/>
-        <w:rPr>
-          <w:lang w:val="en-US"/>
-        </w:rPr>
       </w:pPr>
       <w:r>
         <w:lastRenderedPageBreak/>
@@ -4908,6 +4964,7 @@
           <w:color w:val="auto"/>
           <w:sz w:val="28"/>
           <w:szCs w:val="28"/>
+          <w:lang w:val="en-US"/>
         </w:rPr>
       </w:pPr>
       <w:bookmarkStart w:id="11" w:name="_Toc476744049"/>
@@ -4946,16 +5003,7 @@
           <w:sz w:val="28"/>
           <w:szCs w:val="28"/>
         </w:rPr>
-        <w:t>Ανίχνευση τοξικότητας στ</w:t>
-      </w:r>
-      <w:r>
-        <w:rPr>
-          <w:rFonts w:ascii="Times New Roman" w:hAnsi="Times New Roman" w:cs="Times New Roman"/>
-          <w:color w:val="auto"/>
-          <w:sz w:val="28"/>
-          <w:szCs w:val="28"/>
-        </w:rPr>
-        <w:t>α Ελληνικά</w:t>
+        <w:t>Ανίχνευση τοξικότητας</w:t>
       </w:r>
     </w:p>
     <w:p>
@@ -5076,6 +5124,25 @@
     </w:p>
     <w:p>
       <w:pPr>
+        <w:pStyle w:val="a0"/>
+      </w:pPr>
+      <w:bookmarkStart w:id="12" w:name="_Toc476744050"/>
+      <w:r>
+        <w:t>1.</w:t>
+      </w:r>
+      <w:r>
+        <w:t>2</w:t>
+      </w:r>
+      <w:r>
+        <w:t xml:space="preserve"> </w:t>
+      </w:r>
+      <w:bookmarkEnd w:id="12"/>
+      <w:r>
+        <w:t>Ανίχνευση τοξικότητας στα Ελληνικά</w:t>
+      </w:r>
+    </w:p>
+    <w:p>
+      <w:pPr>
         <w:ind w:right="282"/>
         <w:jc w:val="both"/>
         <w:rPr>
@@ -5088,14 +5155,1773 @@
           <w:rFonts w:cs="Times New Roman"/>
           <w:szCs w:val="24"/>
         </w:rPr>
-        <w:t>Για την αποφυγή έκθεσης σε βλαβερό περιεχόμενο έχουν υπάρξει πολλαπλές μέθοδοι</w:t>
-      </w:r>
-      <w:r>
-        <w:rPr>
-          <w:rFonts w:cs="Times New Roman"/>
-          <w:szCs w:val="24"/>
-        </w:rPr>
-        <w:t xml:space="preserve"> με την χρήση μοντέρνων τεχνικών και τεχνολογιών.</w:t>
+        <w:t xml:space="preserve">Η Ελλάδα και ο Ελληνικός λαός εκσυγχρονίζεται. Με τους Έλληνες και την Ελληνική νεολαία να σημειώνουν άνοδο χρήσης των </w:t>
+      </w:r>
+      <w:r>
+        <w:rPr>
+          <w:rFonts w:cs="Times New Roman"/>
+          <w:szCs w:val="24"/>
+          <w:lang w:val="en-US"/>
+        </w:rPr>
+        <w:t>social</w:t>
+      </w:r>
+      <w:r>
+        <w:rPr>
+          <w:rFonts w:cs="Times New Roman"/>
+          <w:szCs w:val="24"/>
+        </w:rPr>
+        <w:t xml:space="preserve"> </w:t>
+      </w:r>
+      <w:r>
+        <w:rPr>
+          <w:rFonts w:cs="Times New Roman"/>
+          <w:szCs w:val="24"/>
+          <w:lang w:val="en-US"/>
+        </w:rPr>
+        <w:t>media</w:t>
+      </w:r>
+      <w:r>
+        <w:rPr>
+          <w:rFonts w:cs="Times New Roman"/>
+          <w:szCs w:val="24"/>
+        </w:rPr>
+        <w:t xml:space="preserve"> είναι σημαντικό να υπάρχει αμυντικοί μηχανισμοί ενάντια στο βλαβερό διαδικτυακό υλικό και την τοξικότητα.</w:t>
+      </w:r>
+      <w:r>
+        <w:rPr>
+          <w:rFonts w:cs="Times New Roman"/>
+          <w:szCs w:val="24"/>
+        </w:rPr>
+        <w:t xml:space="preserve"> </w:t>
+      </w:r>
+      <w:r>
+        <w:rPr>
+          <w:rFonts w:cs="Times New Roman"/>
+          <w:szCs w:val="24"/>
+        </w:rPr>
+        <w:t xml:space="preserve">Σύμφωνα με την </w:t>
+      </w:r>
+      <w:sdt>
+        <w:sdtPr>
+          <w:rPr>
+            <w:rFonts w:cs="Times New Roman"/>
+            <w:szCs w:val="24"/>
+          </w:rPr>
+          <w:id w:val="1329874566"/>
+          <w:citation/>
+        </w:sdtPr>
+        <w:sdtContent>
+          <w:r>
+            <w:rPr>
+              <w:rFonts w:cs="Times New Roman"/>
+              <w:szCs w:val="24"/>
+            </w:rPr>
+            <w:fldChar w:fldCharType="begin"/>
+          </w:r>
+          <w:r>
+            <w:rPr>
+              <w:rFonts w:cs="Times New Roman"/>
+              <w:szCs w:val="24"/>
+            </w:rPr>
+            <w:instrText xml:space="preserve"> </w:instrText>
+          </w:r>
+          <w:r>
+            <w:rPr>
+              <w:rFonts w:cs="Times New Roman"/>
+              <w:szCs w:val="24"/>
+              <w:lang w:val="en-US"/>
+            </w:rPr>
+            <w:instrText>CITATION</w:instrText>
+          </w:r>
+          <w:r>
+            <w:rPr>
+              <w:rFonts w:cs="Times New Roman"/>
+              <w:szCs w:val="24"/>
+            </w:rPr>
+            <w:instrText xml:space="preserve"> </w:instrText>
+          </w:r>
+          <w:r>
+            <w:rPr>
+              <w:rFonts w:cs="Times New Roman"/>
+              <w:szCs w:val="24"/>
+              <w:lang w:val="en-US"/>
+            </w:rPr>
+            <w:instrText>ELS</w:instrText>
+          </w:r>
+          <w:r>
+            <w:rPr>
+              <w:rFonts w:cs="Times New Roman"/>
+              <w:szCs w:val="24"/>
+            </w:rPr>
+            <w:instrText>23 \</w:instrText>
+          </w:r>
+          <w:r>
+            <w:rPr>
+              <w:rFonts w:cs="Times New Roman"/>
+              <w:szCs w:val="24"/>
+              <w:lang w:val="en-US"/>
+            </w:rPr>
+            <w:instrText>l</w:instrText>
+          </w:r>
+          <w:r>
+            <w:rPr>
+              <w:rFonts w:cs="Times New Roman"/>
+              <w:szCs w:val="24"/>
+            </w:rPr>
+            <w:instrText xml:space="preserve"> 1033 </w:instrText>
+          </w:r>
+          <w:r>
+            <w:rPr>
+              <w:rFonts w:cs="Times New Roman"/>
+              <w:szCs w:val="24"/>
+            </w:rPr>
+            <w:fldChar w:fldCharType="separate"/>
+          </w:r>
+          <w:r>
+            <w:rPr>
+              <w:rFonts w:cs="Times New Roman"/>
+              <w:noProof/>
+              <w:szCs w:val="24"/>
+            </w:rPr>
+            <w:t>(</w:t>
+          </w:r>
+          <w:r>
+            <w:rPr>
+              <w:rFonts w:cs="Times New Roman"/>
+              <w:noProof/>
+              <w:szCs w:val="24"/>
+              <w:lang w:val="en-US"/>
+            </w:rPr>
+            <w:t>ELSTAT</w:t>
+          </w:r>
+          <w:r>
+            <w:rPr>
+              <w:rFonts w:cs="Times New Roman"/>
+              <w:noProof/>
+              <w:szCs w:val="24"/>
+            </w:rPr>
+            <w:t>, 2023)</w:t>
+          </w:r>
+          <w:r>
+            <w:rPr>
+              <w:rFonts w:cs="Times New Roman"/>
+              <w:szCs w:val="24"/>
+            </w:rPr>
+            <w:fldChar w:fldCharType="end"/>
+          </w:r>
+        </w:sdtContent>
+      </w:sdt>
+      <w:r>
+        <w:rPr>
+          <w:rFonts w:cs="Times New Roman"/>
+          <w:szCs w:val="24"/>
+        </w:rPr>
+        <w:t>, το 2013 το ποσοστό των νοικοκυριών που είχε πρόσβαση στο διαδίκτυο ήταν 56.3% ενώ το 2023 ήταν 86.9%</w:t>
+      </w:r>
+      <w:r>
+        <w:rPr>
+          <w:rFonts w:cs="Times New Roman"/>
+          <w:szCs w:val="24"/>
+        </w:rPr>
+        <w:t xml:space="preserve"> και από αυτούς που χρησιμοποίησαν το διαδίκτυο, το 94.1% το χρησιμοποιεί καθημερινά ή σχεδόν καθημερινά. Στην ίδια έρευνα, για πρώτη φορά, καταγράφτηκε το ποσοστό χρηστών που συνάντησαν εξευτελιστικά ή εχθρικά μηνύματα και ειδήσεις. Τουλάχιστον το 30% των χρηστών ήρθαν αντιμέτωποι με κάποιου είδους τοξικότητα για διάφορους λόγους που αναγράφονται στο παρακάτω γράφημα.</w:t>
+      </w:r>
+    </w:p>
+    <w:p>
+      <w:pPr>
+        <w:ind w:right="282"/>
+        <w:jc w:val="center"/>
+        <w:rPr>
+          <w:rFonts w:cs="Times New Roman"/>
+          <w:szCs w:val="24"/>
+        </w:rPr>
+      </w:pPr>
+      <w:r>
+        <w:rPr>
+          <w:rFonts w:cs="Times New Roman"/>
+          <w:szCs w:val="24"/>
+        </w:rPr>
+        <w:drawing>
+          <wp:inline distT="0" distB="0" distL="0" distR="0" wp14:anchorId="0FB711A5" wp14:editId="11ECA436">
+            <wp:extent cx="3822700" cy="3066252"/>
+            <wp:effectExtent l="0" t="0" r="6350" b="1270"/>
+            <wp:docPr id="1334498385" name="Picture 1" descr="A graph with colorful bars&#10;&#10;AI-generated content may be incorrect."/>
+            <wp:cNvGraphicFramePr>
+              <a:graphicFrameLocks xmlns:a="http://schemas.openxmlformats.org/drawingml/2006/main" noChangeAspect="1"/>
+            </wp:cNvGraphicFramePr>
+            <a:graphic xmlns:a="http://schemas.openxmlformats.org/drawingml/2006/main">
+              <a:graphicData uri="http://schemas.openxmlformats.org/drawingml/2006/picture">
+                <pic:pic xmlns:pic="http://schemas.openxmlformats.org/drawingml/2006/picture">
+                  <pic:nvPicPr>
+                    <pic:cNvPr id="1334498385" name="Picture 1" descr="A graph with colorful bars&#10;&#10;AI-generated content may be incorrect."/>
+                    <pic:cNvPicPr/>
+                  </pic:nvPicPr>
+                  <pic:blipFill>
+                    <a:blip r:embed="rId9"/>
+                    <a:stretch>
+                      <a:fillRect/>
+                    </a:stretch>
+                  </pic:blipFill>
+                  <pic:spPr>
+                    <a:xfrm>
+                      <a:off x="0" y="0"/>
+                      <a:ext cx="3826802" cy="3069543"/>
+                    </a:xfrm>
+                    <a:prstGeom prst="rect">
+                      <a:avLst/>
+                    </a:prstGeom>
+                  </pic:spPr>
+                </pic:pic>
+              </a:graphicData>
+            </a:graphic>
+          </wp:inline>
+        </w:drawing>
+      </w:r>
+    </w:p>
+    <w:p>
+      <w:pPr>
+        <w:ind w:right="282"/>
+        <w:jc w:val="both"/>
+        <w:rPr>
+          <w:rFonts w:cs="Times New Roman"/>
+          <w:szCs w:val="24"/>
+        </w:rPr>
+      </w:pPr>
+      <w:r>
+        <w:rPr>
+          <w:rFonts w:cs="Times New Roman"/>
+          <w:szCs w:val="24"/>
+        </w:rPr>
+        <w:lastRenderedPageBreak/>
+        <w:t xml:space="preserve">Για την αντιμετώπιση αυτού του προβλήματος έχουν υπάρξει σημαντικές προσπάθειες. </w:t>
+      </w:r>
+      <w:r>
+        <w:rPr>
+          <w:rFonts w:cs="Times New Roman"/>
+          <w:szCs w:val="24"/>
+        </w:rPr>
+        <w:t>Στ</w:t>
+      </w:r>
+      <w:r>
+        <w:rPr>
+          <w:rFonts w:cs="Times New Roman"/>
+          <w:szCs w:val="24"/>
+        </w:rPr>
+        <w:t>ο</w:t>
+      </w:r>
+      <w:r>
+        <w:rPr>
+          <w:rFonts w:cs="Times New Roman"/>
+          <w:szCs w:val="24"/>
+        </w:rPr>
+        <w:t xml:space="preserve"> </w:t>
+      </w:r>
+      <w:r>
+        <w:rPr>
+          <w:rFonts w:cs="Times New Roman"/>
+          <w:szCs w:val="24"/>
+          <w:lang w:val="en-US"/>
+        </w:rPr>
+        <w:t>Offensive</w:t>
+      </w:r>
+      <w:r>
+        <w:rPr>
+          <w:rFonts w:cs="Times New Roman"/>
+          <w:szCs w:val="24"/>
+        </w:rPr>
+        <w:t xml:space="preserve"> </w:t>
+      </w:r>
+      <w:r>
+        <w:rPr>
+          <w:rFonts w:cs="Times New Roman"/>
+          <w:szCs w:val="24"/>
+          <w:lang w:val="en-US"/>
+        </w:rPr>
+        <w:t>Language</w:t>
+      </w:r>
+      <w:r>
+        <w:rPr>
+          <w:rFonts w:cs="Times New Roman"/>
+          <w:szCs w:val="24"/>
+        </w:rPr>
+        <w:t xml:space="preserve"> </w:t>
+      </w:r>
+      <w:r>
+        <w:rPr>
+          <w:rFonts w:cs="Times New Roman"/>
+          <w:szCs w:val="24"/>
+          <w:lang w:val="en-US"/>
+        </w:rPr>
+        <w:t>Identification</w:t>
+      </w:r>
+      <w:r>
+        <w:rPr>
+          <w:rFonts w:cs="Times New Roman"/>
+          <w:szCs w:val="24"/>
+        </w:rPr>
+        <w:t xml:space="preserve"> </w:t>
+      </w:r>
+      <w:r>
+        <w:rPr>
+          <w:rFonts w:cs="Times New Roman"/>
+          <w:szCs w:val="24"/>
+          <w:lang w:val="en-US"/>
+        </w:rPr>
+        <w:t>in</w:t>
+      </w:r>
+      <w:r>
+        <w:rPr>
+          <w:rFonts w:cs="Times New Roman"/>
+          <w:szCs w:val="24"/>
+        </w:rPr>
+        <w:t xml:space="preserve"> </w:t>
+      </w:r>
+      <w:r>
+        <w:rPr>
+          <w:rFonts w:cs="Times New Roman"/>
+          <w:szCs w:val="24"/>
+          <w:lang w:val="en-US"/>
+        </w:rPr>
+        <w:t>Greek</w:t>
+      </w:r>
+      <w:r>
+        <w:rPr>
+          <w:rFonts w:cs="Times New Roman"/>
+          <w:szCs w:val="24"/>
+        </w:rPr>
+        <w:t xml:space="preserve"> </w:t>
+      </w:r>
+      <w:sdt>
+        <w:sdtPr>
+          <w:rPr>
+            <w:rFonts w:cs="Times New Roman"/>
+            <w:szCs w:val="24"/>
+          </w:rPr>
+          <w:id w:val="-630165106"/>
+          <w:citation/>
+        </w:sdtPr>
+        <w:sdtContent>
+          <w:r>
+            <w:rPr>
+              <w:rFonts w:cs="Times New Roman"/>
+              <w:szCs w:val="24"/>
+            </w:rPr>
+            <w:fldChar w:fldCharType="begin"/>
+          </w:r>
+          <w:r>
+            <w:rPr>
+              <w:rFonts w:cs="Times New Roman"/>
+              <w:szCs w:val="24"/>
+            </w:rPr>
+            <w:instrText xml:space="preserve"> </w:instrText>
+          </w:r>
+          <w:r>
+            <w:rPr>
+              <w:rFonts w:cs="Times New Roman"/>
+              <w:szCs w:val="24"/>
+              <w:lang w:val="en-US"/>
+            </w:rPr>
+            <w:instrText>CITATION</w:instrText>
+          </w:r>
+          <w:r>
+            <w:rPr>
+              <w:rFonts w:cs="Times New Roman"/>
+              <w:szCs w:val="24"/>
+            </w:rPr>
+            <w:instrText xml:space="preserve"> </w:instrText>
+          </w:r>
+          <w:r>
+            <w:rPr>
+              <w:rFonts w:cs="Times New Roman"/>
+              <w:szCs w:val="24"/>
+              <w:lang w:val="en-US"/>
+            </w:rPr>
+            <w:instrText>Zes</w:instrText>
+          </w:r>
+          <w:r>
+            <w:rPr>
+              <w:rFonts w:cs="Times New Roman"/>
+              <w:szCs w:val="24"/>
+            </w:rPr>
+            <w:instrText>20 \</w:instrText>
+          </w:r>
+          <w:r>
+            <w:rPr>
+              <w:rFonts w:cs="Times New Roman"/>
+              <w:szCs w:val="24"/>
+              <w:lang w:val="en-US"/>
+            </w:rPr>
+            <w:instrText>l</w:instrText>
+          </w:r>
+          <w:r>
+            <w:rPr>
+              <w:rFonts w:cs="Times New Roman"/>
+              <w:szCs w:val="24"/>
+            </w:rPr>
+            <w:instrText xml:space="preserve"> 1032 </w:instrText>
+          </w:r>
+          <w:r>
+            <w:rPr>
+              <w:rFonts w:cs="Times New Roman"/>
+              <w:szCs w:val="24"/>
+            </w:rPr>
+            <w:fldChar w:fldCharType="separate"/>
+          </w:r>
+          <w:r>
+            <w:rPr>
+              <w:rFonts w:cs="Times New Roman"/>
+              <w:noProof/>
+              <w:szCs w:val="24"/>
+            </w:rPr>
+            <w:t>(</w:t>
+          </w:r>
+          <w:r>
+            <w:rPr>
+              <w:rFonts w:cs="Times New Roman"/>
+              <w:noProof/>
+              <w:szCs w:val="24"/>
+              <w:lang w:val="en-US"/>
+            </w:rPr>
+            <w:t>Zeses</w:t>
+          </w:r>
+          <w:r>
+            <w:rPr>
+              <w:rFonts w:cs="Times New Roman"/>
+              <w:noProof/>
+              <w:szCs w:val="24"/>
+            </w:rPr>
+            <w:t xml:space="preserve"> </w:t>
+          </w:r>
+          <w:r>
+            <w:rPr>
+              <w:rFonts w:cs="Times New Roman"/>
+              <w:noProof/>
+              <w:szCs w:val="24"/>
+              <w:lang w:val="en-US"/>
+            </w:rPr>
+            <w:t>Pitenis</w:t>
+          </w:r>
+          <w:r>
+            <w:rPr>
+              <w:rFonts w:cs="Times New Roman"/>
+              <w:noProof/>
+              <w:szCs w:val="24"/>
+            </w:rPr>
+            <w:t>, 2020)</w:t>
+          </w:r>
+          <w:r>
+            <w:rPr>
+              <w:rFonts w:cs="Times New Roman"/>
+              <w:szCs w:val="24"/>
+            </w:rPr>
+            <w:fldChar w:fldCharType="end"/>
+          </w:r>
+        </w:sdtContent>
+      </w:sdt>
+      <w:r>
+        <w:rPr>
+          <w:rFonts w:cs="Times New Roman"/>
+          <w:szCs w:val="24"/>
+        </w:rPr>
+        <w:t xml:space="preserve"> </w:t>
+      </w:r>
+      <w:r>
+        <w:rPr>
+          <w:rFonts w:cs="Times New Roman"/>
+          <w:szCs w:val="24"/>
+        </w:rPr>
+        <w:t>υπήρξε</w:t>
+      </w:r>
+      <w:r>
+        <w:rPr>
+          <w:rFonts w:cs="Times New Roman"/>
+          <w:szCs w:val="24"/>
+        </w:rPr>
+        <w:t xml:space="preserve"> </w:t>
+      </w:r>
+      <w:r>
+        <w:rPr>
+          <w:rFonts w:cs="Times New Roman"/>
+          <w:szCs w:val="24"/>
+        </w:rPr>
+        <w:t>ανάπτυξη</w:t>
+      </w:r>
+      <w:r>
+        <w:rPr>
+          <w:rFonts w:cs="Times New Roman"/>
+          <w:szCs w:val="24"/>
+        </w:rPr>
+        <w:t xml:space="preserve"> </w:t>
+      </w:r>
+      <w:r>
+        <w:rPr>
+          <w:rFonts w:cs="Times New Roman"/>
+          <w:szCs w:val="24"/>
+        </w:rPr>
+        <w:t>συγκεκριμένου</w:t>
+      </w:r>
+      <w:r>
+        <w:rPr>
+          <w:rFonts w:cs="Times New Roman"/>
+          <w:szCs w:val="24"/>
+        </w:rPr>
+        <w:t xml:space="preserve"> </w:t>
+      </w:r>
+      <w:r>
+        <w:rPr>
+          <w:rFonts w:cs="Times New Roman"/>
+          <w:szCs w:val="24"/>
+        </w:rPr>
+        <w:t>σετ</w:t>
+      </w:r>
+      <w:r>
+        <w:rPr>
+          <w:rFonts w:cs="Times New Roman"/>
+          <w:szCs w:val="24"/>
+        </w:rPr>
+        <w:t xml:space="preserve"> </w:t>
+      </w:r>
+      <w:r>
+        <w:rPr>
+          <w:rFonts w:cs="Times New Roman"/>
+          <w:szCs w:val="24"/>
+        </w:rPr>
+        <w:t>δεδομένων</w:t>
+      </w:r>
+      <w:r>
+        <w:rPr>
+          <w:rFonts w:cs="Times New Roman"/>
+          <w:szCs w:val="24"/>
+        </w:rPr>
+        <w:t xml:space="preserve"> </w:t>
+      </w:r>
+      <w:r>
+        <w:rPr>
+          <w:rFonts w:cs="Times New Roman"/>
+          <w:szCs w:val="24"/>
+        </w:rPr>
+        <w:t xml:space="preserve">για την ανίχνευση τοξικότητας στην Ελληνική γλώσσα με </w:t>
+      </w:r>
+      <w:r>
+        <w:rPr>
+          <w:rFonts w:cs="Times New Roman"/>
+          <w:szCs w:val="24"/>
+        </w:rPr>
+        <w:t>4779</w:t>
+      </w:r>
+      <w:r>
+        <w:rPr>
+          <w:rFonts w:cs="Times New Roman"/>
+          <w:szCs w:val="24"/>
+        </w:rPr>
+        <w:t xml:space="preserve"> ελληνικά </w:t>
+      </w:r>
+      <w:r>
+        <w:rPr>
+          <w:rFonts w:cs="Times New Roman"/>
+          <w:szCs w:val="24"/>
+          <w:lang w:val="en-US"/>
+        </w:rPr>
+        <w:t>tweets</w:t>
+      </w:r>
+      <w:r>
+        <w:rPr>
+          <w:rFonts w:cs="Times New Roman"/>
+          <w:szCs w:val="24"/>
+        </w:rPr>
+        <w:t xml:space="preserve"> </w:t>
+      </w:r>
+      <w:r>
+        <w:rPr>
+          <w:rFonts w:cs="Times New Roman"/>
+          <w:szCs w:val="24"/>
+        </w:rPr>
+        <w:t xml:space="preserve">τοξικά και μη </w:t>
+      </w:r>
+      <w:r>
+        <w:rPr>
+          <w:rFonts w:cs="Times New Roman"/>
+          <w:szCs w:val="24"/>
+        </w:rPr>
+        <w:t>(</w:t>
+      </w:r>
+      <w:r>
+        <w:rPr>
+          <w:rFonts w:cs="Times New Roman"/>
+          <w:szCs w:val="24"/>
+          <w:lang w:val="en-US"/>
+        </w:rPr>
+        <w:t>OGTD</w:t>
+      </w:r>
+      <w:r>
+        <w:rPr>
+          <w:rFonts w:cs="Times New Roman"/>
+          <w:szCs w:val="24"/>
+        </w:rPr>
+        <w:t>)</w:t>
+      </w:r>
+      <w:r>
+        <w:rPr>
+          <w:rFonts w:cs="Times New Roman"/>
+          <w:szCs w:val="24"/>
+        </w:rPr>
+        <w:t>.</w:t>
+      </w:r>
+      <w:r>
+        <w:rPr>
+          <w:rFonts w:cs="Times New Roman"/>
+          <w:szCs w:val="24"/>
+        </w:rPr>
+        <w:t xml:space="preserve"> Η</w:t>
+      </w:r>
+      <w:r>
+        <w:rPr>
+          <w:rFonts w:cs="Times New Roman"/>
+          <w:szCs w:val="24"/>
+        </w:rPr>
+        <w:t xml:space="preserve"> </w:t>
+      </w:r>
+      <w:r>
+        <w:rPr>
+          <w:rFonts w:cs="Times New Roman"/>
+          <w:szCs w:val="24"/>
+        </w:rPr>
+        <w:t>διπλωματική</w:t>
+      </w:r>
+      <w:r>
+        <w:rPr>
+          <w:rFonts w:cs="Times New Roman"/>
+          <w:szCs w:val="24"/>
+        </w:rPr>
+        <w:t xml:space="preserve"> </w:t>
+      </w:r>
+      <w:r>
+        <w:rPr>
+          <w:rFonts w:cs="Times New Roman"/>
+          <w:szCs w:val="24"/>
+          <w:lang w:val="en-US"/>
+        </w:rPr>
+        <w:t>Toxicity</w:t>
+      </w:r>
+      <w:r>
+        <w:rPr>
+          <w:rFonts w:cs="Times New Roman"/>
+          <w:szCs w:val="24"/>
+        </w:rPr>
+        <w:t xml:space="preserve"> </w:t>
+      </w:r>
+      <w:r>
+        <w:rPr>
+          <w:rFonts w:cs="Times New Roman"/>
+          <w:szCs w:val="24"/>
+          <w:lang w:val="en-US"/>
+        </w:rPr>
+        <w:t>Detection</w:t>
+      </w:r>
+      <w:r>
+        <w:rPr>
+          <w:rFonts w:cs="Times New Roman"/>
+          <w:szCs w:val="24"/>
+        </w:rPr>
+        <w:t xml:space="preserve"> </w:t>
+      </w:r>
+      <w:r>
+        <w:rPr>
+          <w:rFonts w:cs="Times New Roman"/>
+          <w:szCs w:val="24"/>
+          <w:lang w:val="en-US"/>
+        </w:rPr>
+        <w:t>on</w:t>
+      </w:r>
+      <w:r>
+        <w:rPr>
+          <w:rFonts w:cs="Times New Roman"/>
+          <w:szCs w:val="24"/>
+        </w:rPr>
+        <w:t xml:space="preserve"> </w:t>
+      </w:r>
+      <w:r>
+        <w:rPr>
+          <w:rFonts w:cs="Times New Roman"/>
+          <w:szCs w:val="24"/>
+          <w:lang w:val="en-US"/>
+        </w:rPr>
+        <w:t>Greek</w:t>
+      </w:r>
+      <w:r>
+        <w:rPr>
+          <w:rFonts w:cs="Times New Roman"/>
+          <w:szCs w:val="24"/>
+        </w:rPr>
+        <w:t xml:space="preserve"> </w:t>
+      </w:r>
+      <w:r>
+        <w:rPr>
+          <w:rFonts w:cs="Times New Roman"/>
+          <w:szCs w:val="24"/>
+          <w:lang w:val="en-US"/>
+        </w:rPr>
+        <w:t>Tweets</w:t>
+      </w:r>
+      <w:r>
+        <w:rPr>
+          <w:rFonts w:cs="Times New Roman"/>
+          <w:szCs w:val="24"/>
+        </w:rPr>
+        <w:t xml:space="preserve"> </w:t>
+      </w:r>
+      <w:sdt>
+        <w:sdtPr>
+          <w:rPr>
+            <w:rFonts w:cs="Times New Roman"/>
+            <w:szCs w:val="24"/>
+            <w:lang w:val="en-US"/>
+          </w:rPr>
+          <w:id w:val="-2033723089"/>
+          <w:citation/>
+        </w:sdtPr>
+        <w:sdtContent>
+          <w:r>
+            <w:rPr>
+              <w:rFonts w:cs="Times New Roman"/>
+              <w:szCs w:val="24"/>
+              <w:lang w:val="en-US"/>
+            </w:rPr>
+            <w:fldChar w:fldCharType="begin"/>
+          </w:r>
+          <w:r>
+            <w:rPr>
+              <w:rFonts w:cs="Times New Roman"/>
+              <w:szCs w:val="24"/>
+            </w:rPr>
+            <w:instrText xml:space="preserve"> </w:instrText>
+          </w:r>
+          <w:r>
+            <w:rPr>
+              <w:rFonts w:cs="Times New Roman"/>
+              <w:szCs w:val="24"/>
+              <w:lang w:val="en-US"/>
+            </w:rPr>
+            <w:instrText>CITATION</w:instrText>
+          </w:r>
+          <w:r>
+            <w:rPr>
+              <w:rFonts w:cs="Times New Roman"/>
+              <w:szCs w:val="24"/>
+            </w:rPr>
+            <w:instrText xml:space="preserve"> </w:instrText>
+          </w:r>
+          <w:r>
+            <w:rPr>
+              <w:rFonts w:cs="Times New Roman"/>
+              <w:szCs w:val="24"/>
+              <w:lang w:val="en-US"/>
+            </w:rPr>
+            <w:instrText>Ana</w:instrText>
+          </w:r>
+          <w:r>
+            <w:rPr>
+              <w:rFonts w:cs="Times New Roman"/>
+              <w:szCs w:val="24"/>
+            </w:rPr>
+            <w:instrText>21 \</w:instrText>
+          </w:r>
+          <w:r>
+            <w:rPr>
+              <w:rFonts w:cs="Times New Roman"/>
+              <w:szCs w:val="24"/>
+              <w:lang w:val="en-US"/>
+            </w:rPr>
+            <w:instrText>l</w:instrText>
+          </w:r>
+          <w:r>
+            <w:rPr>
+              <w:rFonts w:cs="Times New Roman"/>
+              <w:szCs w:val="24"/>
+            </w:rPr>
+            <w:instrText xml:space="preserve"> 1033 </w:instrText>
+          </w:r>
+          <w:r>
+            <w:rPr>
+              <w:rFonts w:cs="Times New Roman"/>
+              <w:szCs w:val="24"/>
+              <w:lang w:val="en-US"/>
+            </w:rPr>
+            <w:fldChar w:fldCharType="separate"/>
+          </w:r>
+          <w:r>
+            <w:rPr>
+              <w:rFonts w:cs="Times New Roman"/>
+              <w:noProof/>
+              <w:szCs w:val="24"/>
+            </w:rPr>
+            <w:t>(</w:t>
+          </w:r>
+          <w:r>
+            <w:rPr>
+              <w:rFonts w:cs="Times New Roman"/>
+              <w:noProof/>
+              <w:szCs w:val="24"/>
+              <w:lang w:val="en-US"/>
+            </w:rPr>
+            <w:t>Anagnostopoulos</w:t>
+          </w:r>
+          <w:r>
+            <w:rPr>
+              <w:rFonts w:cs="Times New Roman"/>
+              <w:noProof/>
+              <w:szCs w:val="24"/>
+            </w:rPr>
+            <w:t>, 2021)</w:t>
+          </w:r>
+          <w:r>
+            <w:rPr>
+              <w:rFonts w:cs="Times New Roman"/>
+              <w:szCs w:val="24"/>
+              <w:lang w:val="en-US"/>
+            </w:rPr>
+            <w:fldChar w:fldCharType="end"/>
+          </w:r>
+        </w:sdtContent>
+      </w:sdt>
+      <w:r>
+        <w:rPr>
+          <w:rFonts w:cs="Times New Roman"/>
+          <w:szCs w:val="24"/>
+        </w:rPr>
+        <w:t xml:space="preserve"> </w:t>
+      </w:r>
+      <w:r>
+        <w:rPr>
+          <w:rFonts w:cs="Times New Roman"/>
+          <w:szCs w:val="24"/>
+        </w:rPr>
+        <w:t>χρησιμοποίησε</w:t>
+      </w:r>
+      <w:r>
+        <w:rPr>
+          <w:rFonts w:cs="Times New Roman"/>
+          <w:szCs w:val="24"/>
+        </w:rPr>
+        <w:t xml:space="preserve"> </w:t>
+      </w:r>
+      <w:r>
+        <w:rPr>
+          <w:rFonts w:cs="Times New Roman"/>
+          <w:szCs w:val="24"/>
+        </w:rPr>
+        <w:t>το</w:t>
+      </w:r>
+      <w:r>
+        <w:rPr>
+          <w:rFonts w:cs="Times New Roman"/>
+          <w:szCs w:val="24"/>
+        </w:rPr>
+        <w:t xml:space="preserve"> </w:t>
+      </w:r>
+      <w:r>
+        <w:rPr>
+          <w:rFonts w:cs="Times New Roman"/>
+          <w:szCs w:val="24"/>
+          <w:lang w:val="en-US"/>
+        </w:rPr>
+        <w:t>OGTD</w:t>
+      </w:r>
+      <w:r>
+        <w:rPr>
+          <w:rFonts w:cs="Times New Roman"/>
+          <w:szCs w:val="24"/>
+        </w:rPr>
+        <w:t xml:space="preserve"> </w:t>
+      </w:r>
+      <w:r>
+        <w:rPr>
+          <w:rFonts w:cs="Times New Roman"/>
+          <w:szCs w:val="24"/>
+        </w:rPr>
+        <w:t>για</w:t>
+      </w:r>
+      <w:r>
+        <w:rPr>
+          <w:rFonts w:cs="Times New Roman"/>
+          <w:szCs w:val="24"/>
+        </w:rPr>
+        <w:t xml:space="preserve"> </w:t>
+      </w:r>
+      <w:r>
+        <w:rPr>
+          <w:rFonts w:cs="Times New Roman"/>
+          <w:szCs w:val="24"/>
+        </w:rPr>
+        <w:t>το</w:t>
+      </w:r>
+      <w:r>
+        <w:rPr>
+          <w:rFonts w:cs="Times New Roman"/>
+          <w:szCs w:val="24"/>
+        </w:rPr>
+        <w:t xml:space="preserve"> </w:t>
+      </w:r>
+      <w:r>
+        <w:rPr>
+          <w:rFonts w:cs="Times New Roman"/>
+          <w:szCs w:val="24"/>
+        </w:rPr>
+        <w:t xml:space="preserve">συγκεκριμένο έργο καθώς και το </w:t>
+      </w:r>
+      <w:r>
+        <w:rPr>
+          <w:rFonts w:cs="Times New Roman"/>
+          <w:szCs w:val="24"/>
+          <w:lang w:val="en-US"/>
+        </w:rPr>
+        <w:t>Palo</w:t>
+      </w:r>
+      <w:r>
+        <w:rPr>
+          <w:rFonts w:cs="Times New Roman"/>
+          <w:szCs w:val="24"/>
+        </w:rPr>
+        <w:t xml:space="preserve"> </w:t>
+      </w:r>
+      <w:r>
+        <w:rPr>
+          <w:rFonts w:cs="Times New Roman"/>
+          <w:szCs w:val="24"/>
+          <w:lang w:val="en-US"/>
+        </w:rPr>
+        <w:t>Toxicity</w:t>
+      </w:r>
+      <w:r>
+        <w:rPr>
+          <w:rFonts w:cs="Times New Roman"/>
+          <w:szCs w:val="24"/>
+        </w:rPr>
+        <w:t xml:space="preserve"> </w:t>
+      </w:r>
+      <w:r>
+        <w:rPr>
+          <w:rFonts w:cs="Times New Roman"/>
+          <w:szCs w:val="24"/>
+          <w:lang w:val="en-US"/>
+        </w:rPr>
+        <w:t>and</w:t>
+      </w:r>
+      <w:r>
+        <w:rPr>
+          <w:rFonts w:cs="Times New Roman"/>
+          <w:szCs w:val="24"/>
+        </w:rPr>
+        <w:t xml:space="preserve"> </w:t>
+      </w:r>
+      <w:r>
+        <w:rPr>
+          <w:rFonts w:cs="Times New Roman"/>
+          <w:szCs w:val="24"/>
+          <w:lang w:val="en-US"/>
+        </w:rPr>
+        <w:t>Sentiment</w:t>
+      </w:r>
+      <w:r>
+        <w:rPr>
+          <w:rFonts w:cs="Times New Roman"/>
+          <w:szCs w:val="24"/>
+        </w:rPr>
+        <w:t xml:space="preserve"> </w:t>
+      </w:r>
+      <w:r>
+        <w:rPr>
+          <w:rFonts w:cs="Times New Roman"/>
+          <w:szCs w:val="24"/>
+          <w:lang w:val="en-US"/>
+        </w:rPr>
+        <w:t>Dataset</w:t>
+      </w:r>
+      <w:r>
+        <w:rPr>
+          <w:rFonts w:cs="Times New Roman"/>
+          <w:szCs w:val="24"/>
+        </w:rPr>
+        <w:t xml:space="preserve"> (</w:t>
+      </w:r>
+      <w:r>
+        <w:rPr>
+          <w:rFonts w:cs="Times New Roman"/>
+          <w:szCs w:val="24"/>
+          <w:lang w:val="en-US"/>
+        </w:rPr>
+        <w:t>PTSD</w:t>
+      </w:r>
+      <w:r>
+        <w:rPr>
+          <w:rFonts w:cs="Times New Roman"/>
+          <w:szCs w:val="24"/>
+        </w:rPr>
+        <w:t>)</w:t>
+      </w:r>
+      <w:r>
+        <w:rPr>
+          <w:rFonts w:cs="Times New Roman"/>
+          <w:szCs w:val="24"/>
+        </w:rPr>
+        <w:t xml:space="preserve"> </w:t>
+      </w:r>
+      <w:r>
+        <w:rPr>
+          <w:rFonts w:cs="Times New Roman"/>
+          <w:szCs w:val="24"/>
+        </w:rPr>
+        <w:t xml:space="preserve">που του παρείχε η </w:t>
+      </w:r>
+      <w:proofErr w:type="spellStart"/>
+      <w:r>
+        <w:rPr>
+          <w:rFonts w:cs="Times New Roman"/>
+          <w:szCs w:val="24"/>
+          <w:lang w:val="en-US"/>
+        </w:rPr>
+        <w:t>PALOServices</w:t>
+      </w:r>
+      <w:proofErr w:type="spellEnd"/>
+      <w:r>
+        <w:rPr>
+          <w:rFonts w:cs="Times New Roman"/>
+          <w:szCs w:val="24"/>
+        </w:rPr>
+        <w:t xml:space="preserve">, το οποίο αποτελείται από 1452 και έχει πιο βαθιά κατηγοριοποίηση </w:t>
+      </w:r>
+      <w:r>
+        <w:rPr>
+          <w:rFonts w:cs="Times New Roman"/>
+          <w:szCs w:val="24"/>
+        </w:rPr>
+        <w:t xml:space="preserve">όπως </w:t>
+      </w:r>
+      <w:r>
+        <w:rPr>
+          <w:rFonts w:cs="Times New Roman"/>
+          <w:szCs w:val="24"/>
+          <w:lang w:val="en-US"/>
+        </w:rPr>
+        <w:t>toxicity</w:t>
+      </w:r>
+      <w:r>
+        <w:rPr>
+          <w:rFonts w:cs="Times New Roman"/>
+          <w:szCs w:val="24"/>
+        </w:rPr>
+        <w:t xml:space="preserve"> </w:t>
+      </w:r>
+      <w:r>
+        <w:rPr>
+          <w:rFonts w:cs="Times New Roman"/>
+          <w:szCs w:val="24"/>
+          <w:lang w:val="en-US"/>
+        </w:rPr>
+        <w:t>type</w:t>
+      </w:r>
+      <w:r>
+        <w:rPr>
+          <w:rFonts w:cs="Times New Roman"/>
+          <w:szCs w:val="24"/>
+        </w:rPr>
+        <w:t xml:space="preserve">, </w:t>
+      </w:r>
+      <w:r>
+        <w:rPr>
+          <w:rFonts w:cs="Times New Roman"/>
+          <w:szCs w:val="24"/>
+          <w:lang w:val="en-US"/>
+        </w:rPr>
+        <w:t>emotion</w:t>
+      </w:r>
+      <w:r>
+        <w:rPr>
+          <w:rFonts w:cs="Times New Roman"/>
+          <w:szCs w:val="24"/>
+        </w:rPr>
+        <w:t xml:space="preserve"> </w:t>
+      </w:r>
+      <w:r>
+        <w:rPr>
+          <w:rFonts w:cs="Times New Roman"/>
+          <w:szCs w:val="24"/>
+        </w:rPr>
+        <w:t xml:space="preserve">και </w:t>
+      </w:r>
+      <w:r>
+        <w:rPr>
+          <w:rFonts w:cs="Times New Roman"/>
+          <w:szCs w:val="24"/>
+          <w:lang w:val="en-US"/>
+        </w:rPr>
+        <w:t>sentiment</w:t>
+      </w:r>
+      <w:r>
+        <w:rPr>
+          <w:rFonts w:cs="Times New Roman"/>
+          <w:szCs w:val="24"/>
+        </w:rPr>
+        <w:t>.</w:t>
+      </w:r>
+      <w:r>
+        <w:rPr>
+          <w:rFonts w:cs="Times New Roman"/>
+          <w:szCs w:val="24"/>
+        </w:rPr>
+        <w:t xml:space="preserve"> Στο</w:t>
+      </w:r>
+      <w:r>
+        <w:rPr>
+          <w:rFonts w:cs="Times New Roman"/>
+          <w:szCs w:val="24"/>
+        </w:rPr>
+        <w:t xml:space="preserve"> </w:t>
+      </w:r>
+      <w:r>
+        <w:rPr>
+          <w:rFonts w:cs="Times New Roman"/>
+          <w:szCs w:val="24"/>
+          <w:lang w:val="en-US"/>
+        </w:rPr>
+        <w:t>Multimodal</w:t>
+      </w:r>
+      <w:r>
+        <w:rPr>
+          <w:rFonts w:cs="Times New Roman"/>
+          <w:szCs w:val="24"/>
+        </w:rPr>
+        <w:t xml:space="preserve"> </w:t>
+      </w:r>
+      <w:r>
+        <w:rPr>
+          <w:rFonts w:cs="Times New Roman"/>
+          <w:szCs w:val="24"/>
+          <w:lang w:val="en-US"/>
+        </w:rPr>
+        <w:t>Hate</w:t>
+      </w:r>
+      <w:r>
+        <w:rPr>
+          <w:rFonts w:cs="Times New Roman"/>
+          <w:szCs w:val="24"/>
+        </w:rPr>
+        <w:t xml:space="preserve"> </w:t>
+      </w:r>
+      <w:r>
+        <w:rPr>
+          <w:rFonts w:cs="Times New Roman"/>
+          <w:szCs w:val="24"/>
+          <w:lang w:val="en-US"/>
+        </w:rPr>
+        <w:t>Speech</w:t>
+      </w:r>
+      <w:r>
+        <w:rPr>
+          <w:rFonts w:cs="Times New Roman"/>
+          <w:szCs w:val="24"/>
+        </w:rPr>
+        <w:t xml:space="preserve"> </w:t>
+      </w:r>
+      <w:r>
+        <w:rPr>
+          <w:rFonts w:cs="Times New Roman"/>
+          <w:szCs w:val="24"/>
+          <w:lang w:val="en-US"/>
+        </w:rPr>
+        <w:t>Detection</w:t>
+      </w:r>
+      <w:r>
+        <w:rPr>
+          <w:rFonts w:cs="Times New Roman"/>
+          <w:szCs w:val="24"/>
+        </w:rPr>
+        <w:t xml:space="preserve"> </w:t>
+      </w:r>
+      <w:r>
+        <w:rPr>
+          <w:rFonts w:cs="Times New Roman"/>
+          <w:szCs w:val="24"/>
+          <w:lang w:val="en-US"/>
+        </w:rPr>
+        <w:t>in</w:t>
+      </w:r>
+      <w:r>
+        <w:rPr>
+          <w:rFonts w:cs="Times New Roman"/>
+          <w:szCs w:val="24"/>
+        </w:rPr>
+        <w:t xml:space="preserve"> </w:t>
+      </w:r>
+      <w:r>
+        <w:rPr>
+          <w:rFonts w:cs="Times New Roman"/>
+          <w:szCs w:val="24"/>
+          <w:lang w:val="en-US"/>
+        </w:rPr>
+        <w:t>Greek</w:t>
+      </w:r>
+      <w:r>
+        <w:rPr>
+          <w:rFonts w:cs="Times New Roman"/>
+          <w:szCs w:val="24"/>
+        </w:rPr>
+        <w:t xml:space="preserve"> </w:t>
+      </w:r>
+      <w:r>
+        <w:rPr>
+          <w:rFonts w:cs="Times New Roman"/>
+          <w:szCs w:val="24"/>
+          <w:lang w:val="en-US"/>
+        </w:rPr>
+        <w:t>Social</w:t>
+      </w:r>
+      <w:r>
+        <w:rPr>
+          <w:rFonts w:cs="Times New Roman"/>
+          <w:szCs w:val="24"/>
+        </w:rPr>
+        <w:t xml:space="preserve"> </w:t>
+      </w:r>
+      <w:r>
+        <w:rPr>
+          <w:rFonts w:cs="Times New Roman"/>
+          <w:szCs w:val="24"/>
+          <w:lang w:val="en-US"/>
+        </w:rPr>
+        <w:t>Media</w:t>
+      </w:r>
+      <w:r>
+        <w:rPr>
+          <w:rFonts w:cs="Times New Roman"/>
+          <w:szCs w:val="24"/>
+        </w:rPr>
+        <w:t xml:space="preserve"> </w:t>
+      </w:r>
+      <w:sdt>
+        <w:sdtPr>
+          <w:rPr>
+            <w:rFonts w:cs="Times New Roman"/>
+            <w:szCs w:val="24"/>
+            <w:lang w:val="en-US"/>
+          </w:rPr>
+          <w:id w:val="-1174335810"/>
+          <w:citation/>
+        </w:sdtPr>
+        <w:sdtContent>
+          <w:r>
+            <w:rPr>
+              <w:rFonts w:cs="Times New Roman"/>
+              <w:szCs w:val="24"/>
+              <w:lang w:val="en-US"/>
+            </w:rPr>
+            <w:fldChar w:fldCharType="begin"/>
+          </w:r>
+          <w:r>
+            <w:rPr>
+              <w:rFonts w:cs="Times New Roman"/>
+              <w:szCs w:val="24"/>
+            </w:rPr>
+            <w:instrText xml:space="preserve"> </w:instrText>
+          </w:r>
+          <w:r>
+            <w:rPr>
+              <w:rFonts w:cs="Times New Roman"/>
+              <w:szCs w:val="24"/>
+              <w:lang w:val="en-US"/>
+            </w:rPr>
+            <w:instrText>CITATION</w:instrText>
+          </w:r>
+          <w:r>
+            <w:rPr>
+              <w:rFonts w:cs="Times New Roman"/>
+              <w:szCs w:val="24"/>
+            </w:rPr>
+            <w:instrText xml:space="preserve"> </w:instrText>
+          </w:r>
+          <w:r>
+            <w:rPr>
+              <w:rFonts w:cs="Times New Roman"/>
+              <w:szCs w:val="24"/>
+              <w:lang w:val="en-US"/>
+            </w:rPr>
+            <w:instrText>Kon</w:instrText>
+          </w:r>
+          <w:r>
+            <w:rPr>
+              <w:rFonts w:cs="Times New Roman"/>
+              <w:szCs w:val="24"/>
+            </w:rPr>
+            <w:instrText>21 \</w:instrText>
+          </w:r>
+          <w:r>
+            <w:rPr>
+              <w:rFonts w:cs="Times New Roman"/>
+              <w:szCs w:val="24"/>
+              <w:lang w:val="en-US"/>
+            </w:rPr>
+            <w:instrText>l</w:instrText>
+          </w:r>
+          <w:r>
+            <w:rPr>
+              <w:rFonts w:cs="Times New Roman"/>
+              <w:szCs w:val="24"/>
+            </w:rPr>
+            <w:instrText xml:space="preserve"> 1033 </w:instrText>
+          </w:r>
+          <w:r>
+            <w:rPr>
+              <w:rFonts w:cs="Times New Roman"/>
+              <w:szCs w:val="24"/>
+              <w:lang w:val="en-US"/>
+            </w:rPr>
+            <w:fldChar w:fldCharType="separate"/>
+          </w:r>
+          <w:r>
+            <w:rPr>
+              <w:rFonts w:cs="Times New Roman"/>
+              <w:noProof/>
+              <w:szCs w:val="24"/>
+            </w:rPr>
+            <w:t>(</w:t>
+          </w:r>
+          <w:r>
+            <w:rPr>
+              <w:rFonts w:cs="Times New Roman"/>
+              <w:noProof/>
+              <w:szCs w:val="24"/>
+              <w:lang w:val="en-US"/>
+            </w:rPr>
+            <w:t>Konstantinos</w:t>
+          </w:r>
+          <w:r>
+            <w:rPr>
+              <w:rFonts w:cs="Times New Roman"/>
+              <w:noProof/>
+              <w:szCs w:val="24"/>
+            </w:rPr>
+            <w:t xml:space="preserve"> </w:t>
+          </w:r>
+          <w:r>
+            <w:rPr>
+              <w:rFonts w:cs="Times New Roman"/>
+              <w:noProof/>
+              <w:szCs w:val="24"/>
+              <w:lang w:val="en-US"/>
+            </w:rPr>
+            <w:t>Perifanos</w:t>
+          </w:r>
+          <w:r>
+            <w:rPr>
+              <w:rFonts w:cs="Times New Roman"/>
+              <w:noProof/>
+              <w:szCs w:val="24"/>
+            </w:rPr>
+            <w:t>, 2021)</w:t>
+          </w:r>
+          <w:r>
+            <w:rPr>
+              <w:rFonts w:cs="Times New Roman"/>
+              <w:szCs w:val="24"/>
+              <w:lang w:val="en-US"/>
+            </w:rPr>
+            <w:fldChar w:fldCharType="end"/>
+          </w:r>
+        </w:sdtContent>
+      </w:sdt>
+      <w:r>
+        <w:rPr>
+          <w:rFonts w:cs="Times New Roman"/>
+          <w:szCs w:val="24"/>
+        </w:rPr>
+        <w:t xml:space="preserve">, </w:t>
+      </w:r>
+      <w:r>
+        <w:rPr>
+          <w:rFonts w:cs="Times New Roman"/>
+          <w:szCs w:val="24"/>
+        </w:rPr>
+        <w:t>χρησιμοποιήθηκε</w:t>
+      </w:r>
+      <w:r>
+        <w:rPr>
+          <w:rFonts w:cs="Times New Roman"/>
+          <w:szCs w:val="24"/>
+        </w:rPr>
+        <w:t xml:space="preserve"> </w:t>
+      </w:r>
+      <w:r>
+        <w:rPr>
+          <w:rFonts w:cs="Times New Roman"/>
+          <w:szCs w:val="24"/>
+        </w:rPr>
+        <w:t>το</w:t>
+      </w:r>
+      <w:r>
+        <w:rPr>
+          <w:rFonts w:cs="Times New Roman"/>
+          <w:szCs w:val="24"/>
+        </w:rPr>
+        <w:t xml:space="preserve"> </w:t>
+      </w:r>
+      <w:r>
+        <w:rPr>
+          <w:rFonts w:cs="Times New Roman"/>
+          <w:szCs w:val="24"/>
+          <w:lang w:val="en-US"/>
+        </w:rPr>
+        <w:t>OGTD</w:t>
+      </w:r>
+      <w:r>
+        <w:rPr>
+          <w:rFonts w:cs="Times New Roman"/>
+          <w:szCs w:val="24"/>
+        </w:rPr>
+        <w:t xml:space="preserve"> </w:t>
+      </w:r>
+      <w:r>
+        <w:rPr>
+          <w:rFonts w:cs="Times New Roman"/>
+          <w:szCs w:val="24"/>
+        </w:rPr>
+        <w:t>μαζί</w:t>
+      </w:r>
+      <w:r>
+        <w:rPr>
+          <w:rFonts w:cs="Times New Roman"/>
+          <w:szCs w:val="24"/>
+        </w:rPr>
+        <w:t xml:space="preserve"> </w:t>
+      </w:r>
+      <w:r>
+        <w:rPr>
+          <w:rFonts w:cs="Times New Roman"/>
+          <w:szCs w:val="24"/>
+        </w:rPr>
+        <w:t>με</w:t>
+      </w:r>
+      <w:r>
+        <w:rPr>
+          <w:rFonts w:cs="Times New Roman"/>
+          <w:szCs w:val="24"/>
+        </w:rPr>
+        <w:t xml:space="preserve"> </w:t>
+      </w:r>
+      <w:r>
+        <w:rPr>
+          <w:rFonts w:cs="Times New Roman"/>
+          <w:szCs w:val="24"/>
+        </w:rPr>
+        <w:t>άλλα</w:t>
+      </w:r>
+      <w:r>
+        <w:rPr>
+          <w:rFonts w:cs="Times New Roman"/>
+          <w:szCs w:val="24"/>
+        </w:rPr>
+        <w:t xml:space="preserve"> </w:t>
+      </w:r>
+      <w:r>
+        <w:rPr>
+          <w:rFonts w:cs="Times New Roman"/>
+          <w:szCs w:val="24"/>
+        </w:rPr>
+        <w:t>δυο</w:t>
+      </w:r>
+      <w:r>
+        <w:rPr>
+          <w:rFonts w:cs="Times New Roman"/>
+          <w:szCs w:val="24"/>
+        </w:rPr>
+        <w:t xml:space="preserve"> </w:t>
+      </w:r>
+      <w:r>
+        <w:rPr>
+          <w:rFonts w:cs="Times New Roman"/>
+          <w:szCs w:val="24"/>
+        </w:rPr>
+        <w:t>δημοσίως</w:t>
+      </w:r>
+      <w:r>
+        <w:rPr>
+          <w:rFonts w:cs="Times New Roman"/>
+          <w:szCs w:val="24"/>
+        </w:rPr>
+        <w:t xml:space="preserve"> </w:t>
+      </w:r>
+      <w:r>
+        <w:rPr>
+          <w:rFonts w:cs="Times New Roman"/>
+          <w:szCs w:val="24"/>
+        </w:rPr>
+        <w:t xml:space="preserve">διαθέσιμα σετ δεδομένων αλλά επίσης αναπτύχθηκε </w:t>
+      </w:r>
+      <w:r>
+        <w:rPr>
+          <w:rFonts w:cs="Times New Roman"/>
+          <w:szCs w:val="24"/>
+        </w:rPr>
+        <w:t xml:space="preserve">ένα δικό τους σετ δεδομένων που αποτελείται από ~4000 </w:t>
+      </w:r>
+      <w:r>
+        <w:rPr>
+          <w:rFonts w:cs="Times New Roman"/>
+          <w:szCs w:val="24"/>
+          <w:lang w:val="en-US"/>
+        </w:rPr>
+        <w:t>tweets</w:t>
+      </w:r>
+      <w:r>
+        <w:rPr>
+          <w:rFonts w:cs="Times New Roman"/>
+          <w:szCs w:val="24"/>
+        </w:rPr>
+        <w:t>.</w:t>
+      </w:r>
+      <w:r>
+        <w:rPr>
+          <w:rFonts w:cs="Times New Roman"/>
+          <w:szCs w:val="24"/>
+        </w:rPr>
+        <w:t xml:space="preserve"> Στις τρείς αυτές έρευνες φαίνεται πως η πιο δημοφιλής τεχνολογία είναι τα </w:t>
+      </w:r>
+      <w:r>
+        <w:rPr>
+          <w:rFonts w:cs="Times New Roman"/>
+          <w:szCs w:val="24"/>
+          <w:lang w:val="en-US"/>
+        </w:rPr>
+        <w:t>deep</w:t>
+      </w:r>
+      <w:r>
+        <w:rPr>
+          <w:rFonts w:cs="Times New Roman"/>
+          <w:szCs w:val="24"/>
+        </w:rPr>
+        <w:t xml:space="preserve"> </w:t>
+      </w:r>
+      <w:r>
+        <w:rPr>
+          <w:rFonts w:cs="Times New Roman"/>
+          <w:szCs w:val="24"/>
+          <w:lang w:val="en-US"/>
+        </w:rPr>
+        <w:t>learning</w:t>
+      </w:r>
+      <w:r>
+        <w:rPr>
+          <w:rFonts w:cs="Times New Roman"/>
+          <w:szCs w:val="24"/>
+        </w:rPr>
+        <w:t xml:space="preserve"> </w:t>
+      </w:r>
+      <w:r>
+        <w:rPr>
+          <w:rFonts w:cs="Times New Roman"/>
+          <w:szCs w:val="24"/>
+          <w:lang w:val="en-US"/>
+        </w:rPr>
+        <w:t>models</w:t>
+      </w:r>
+      <w:r>
+        <w:rPr>
+          <w:rFonts w:cs="Times New Roman"/>
+          <w:szCs w:val="24"/>
+        </w:rPr>
+        <w:t xml:space="preserve">, </w:t>
+      </w:r>
+      <w:r>
+        <w:rPr>
+          <w:rFonts w:cs="Times New Roman"/>
+          <w:szCs w:val="24"/>
+        </w:rPr>
+        <w:t xml:space="preserve">με το </w:t>
+      </w:r>
+      <w:r>
+        <w:rPr>
+          <w:rFonts w:cs="Times New Roman"/>
+          <w:szCs w:val="24"/>
+          <w:lang w:val="en-US"/>
+        </w:rPr>
+        <w:t>Offensive</w:t>
+      </w:r>
+      <w:r>
+        <w:rPr>
+          <w:rFonts w:cs="Times New Roman"/>
+          <w:szCs w:val="24"/>
+        </w:rPr>
+        <w:t xml:space="preserve"> </w:t>
+      </w:r>
+      <w:r>
+        <w:rPr>
+          <w:rFonts w:cs="Times New Roman"/>
+          <w:szCs w:val="24"/>
+          <w:lang w:val="en-US"/>
+        </w:rPr>
+        <w:t>Language</w:t>
+      </w:r>
+      <w:r>
+        <w:rPr>
+          <w:rFonts w:cs="Times New Roman"/>
+          <w:szCs w:val="24"/>
+        </w:rPr>
+        <w:t xml:space="preserve"> </w:t>
+      </w:r>
+      <w:r>
+        <w:rPr>
+          <w:rFonts w:cs="Times New Roman"/>
+          <w:szCs w:val="24"/>
+          <w:lang w:val="en-US"/>
+        </w:rPr>
+        <w:t>Identification</w:t>
+      </w:r>
+      <w:r>
+        <w:rPr>
+          <w:rFonts w:cs="Times New Roman"/>
+          <w:szCs w:val="24"/>
+        </w:rPr>
+        <w:t xml:space="preserve"> </w:t>
+      </w:r>
+      <w:r>
+        <w:rPr>
+          <w:rFonts w:cs="Times New Roman"/>
+          <w:szCs w:val="24"/>
+          <w:lang w:val="en-US"/>
+        </w:rPr>
+        <w:t>in</w:t>
+      </w:r>
+      <w:r>
+        <w:rPr>
+          <w:rFonts w:cs="Times New Roman"/>
+          <w:szCs w:val="24"/>
+        </w:rPr>
+        <w:t xml:space="preserve"> </w:t>
+      </w:r>
+      <w:r>
+        <w:rPr>
+          <w:rFonts w:cs="Times New Roman"/>
+          <w:szCs w:val="24"/>
+          <w:lang w:val="en-US"/>
+        </w:rPr>
+        <w:t>Greek</w:t>
+      </w:r>
+      <w:r>
+        <w:rPr>
+          <w:rFonts w:cs="Times New Roman"/>
+          <w:szCs w:val="24"/>
+        </w:rPr>
+        <w:t xml:space="preserve"> </w:t>
+      </w:r>
+      <w:r>
+        <w:rPr>
+          <w:rFonts w:cs="Times New Roman"/>
+          <w:szCs w:val="24"/>
+        </w:rPr>
+        <w:t xml:space="preserve">να χρησιμοποιεί και παραδοσιακό </w:t>
+      </w:r>
+      <w:r>
+        <w:rPr>
+          <w:rFonts w:cs="Times New Roman"/>
+          <w:szCs w:val="24"/>
+          <w:lang w:val="en-US"/>
+        </w:rPr>
+        <w:t>machine</w:t>
+      </w:r>
+      <w:r>
+        <w:rPr>
+          <w:rFonts w:cs="Times New Roman"/>
+          <w:szCs w:val="24"/>
+        </w:rPr>
+        <w:t xml:space="preserve"> </w:t>
+      </w:r>
+      <w:r>
+        <w:rPr>
+          <w:rFonts w:cs="Times New Roman"/>
+          <w:szCs w:val="24"/>
+          <w:lang w:val="en-US"/>
+        </w:rPr>
+        <w:t>learning</w:t>
+      </w:r>
+      <w:r>
+        <w:rPr>
+          <w:rFonts w:cs="Times New Roman"/>
+          <w:szCs w:val="24"/>
+        </w:rPr>
+        <w:t xml:space="preserve"> </w:t>
+      </w:r>
+      <w:r>
+        <w:rPr>
+          <w:rFonts w:cs="Times New Roman"/>
+          <w:szCs w:val="24"/>
+        </w:rPr>
+        <w:t xml:space="preserve">ως </w:t>
+      </w:r>
+      <w:r>
+        <w:rPr>
+          <w:rFonts w:cs="Times New Roman"/>
+          <w:szCs w:val="24"/>
+        </w:rPr>
+        <w:t>“</w:t>
+      </w:r>
+      <w:r>
+        <w:rPr>
+          <w:rFonts w:cs="Times New Roman"/>
+          <w:szCs w:val="24"/>
+        </w:rPr>
+        <w:t>βασική</w:t>
+      </w:r>
+      <w:r>
+        <w:rPr>
+          <w:rFonts w:cs="Times New Roman"/>
+          <w:szCs w:val="24"/>
+        </w:rPr>
+        <w:t xml:space="preserve">” </w:t>
+      </w:r>
+      <w:r>
+        <w:rPr>
+          <w:rFonts w:cs="Times New Roman"/>
+          <w:szCs w:val="24"/>
+        </w:rPr>
+        <w:t>μέθοδο για σύγκριση.</w:t>
+      </w:r>
+    </w:p>
+    <w:p>
+      <w:pPr>
+        <w:pStyle w:val="a0"/>
+      </w:pPr>
+      <w:r>
+        <w:t xml:space="preserve">1.3 </w:t>
+      </w:r>
+      <w:r>
+        <w:t>Τεχνικές</w:t>
+      </w:r>
+      <w:r>
+        <w:t xml:space="preserve"> </w:t>
+      </w:r>
+      <w:r>
+        <w:t>και</w:t>
+      </w:r>
+      <w:r>
+        <w:t xml:space="preserve"> </w:t>
+      </w:r>
+      <w:r>
+        <w:t>μοντέλα</w:t>
+      </w:r>
+    </w:p>
+    <w:p>
+      <w:pPr>
+        <w:ind w:right="282"/>
+        <w:jc w:val="both"/>
+        <w:rPr>
+          <w:rFonts w:cs="Times New Roman"/>
+          <w:szCs w:val="24"/>
+        </w:rPr>
+      </w:pPr>
+      <w:r>
+        <w:rPr>
+          <w:rFonts w:cs="Times New Roman"/>
+          <w:szCs w:val="24"/>
+        </w:rPr>
+        <w:t>Για την αποφυγή έκθεσης σε βλαβερό περιεχόμενο έχουν υπάρξει πολλαπλές μέθοδοι με την χρήση μοντέρνων τεχνικών και τεχνολογιών.</w:t>
       </w:r>
       <w:r>
         <w:rPr>
@@ -5131,21 +6957,7 @@
           <w:rFonts w:cs="Times New Roman"/>
           <w:szCs w:val="24"/>
         </w:rPr>
-        <w:t>είναι εξαιρετικά δημοφιλή στο συγκεκριμένο</w:t>
-      </w:r>
-      <w:r>
-        <w:rPr>
-          <w:rFonts w:cs="Times New Roman"/>
-          <w:szCs w:val="24"/>
-        </w:rPr>
-        <w:t xml:space="preserve"> </w:t>
-      </w:r>
-      <w:r>
-        <w:rPr>
-          <w:rFonts w:cs="Times New Roman"/>
-          <w:szCs w:val="24"/>
-        </w:rPr>
-        <w:t>έργο. Για</w:t>
+        <w:t>είναι εξαιρετικά δημοφιλή. Για</w:t>
       </w:r>
       <w:r>
         <w:rPr>
@@ -5188,21 +7000,6 @@
           <w:szCs w:val="24"/>
           <w:lang w:val="en-US"/>
         </w:rPr>
-        <w:t>paper</w:t>
-      </w:r>
-      <w:r>
-        <w:rPr>
-          <w:rFonts w:cs="Times New Roman"/>
-          <w:szCs w:val="24"/>
-        </w:rPr>
-        <w:t xml:space="preserve"> «</w:t>
-      </w:r>
-      <w:r>
-        <w:rPr>
-          <w:rFonts w:cs="Times New Roman"/>
-          <w:szCs w:val="24"/>
-          <w:lang w:val="en-US"/>
-        </w:rPr>
         <w:t>Multimodal</w:t>
       </w:r>
       <w:r>
@@ -5315,7 +7112,7 @@
           <w:rFonts w:cs="Times New Roman"/>
           <w:szCs w:val="24"/>
         </w:rPr>
-        <w:t xml:space="preserve">» </w:t>
+        <w:t xml:space="preserve"> </w:t>
       </w:r>
       <w:sdt>
         <w:sdtPr>
@@ -5598,28 +7395,44 @@
           <w:rFonts w:cs="Times New Roman"/>
           <w:szCs w:val="24"/>
         </w:rPr>
-        <w:t xml:space="preserve"> LM</w:t>
-      </w:r>
-      <w:r>
-        <w:rPr>
-          <w:rFonts w:cs="Times New Roman"/>
-          <w:szCs w:val="24"/>
-        </w:rPr>
-        <w:t xml:space="preserve"> </w:t>
-      </w:r>
-      <w:r>
-        <w:rPr>
-          <w:rFonts w:cs="Times New Roman"/>
-          <w:szCs w:val="24"/>
-        </w:rPr>
-        <w:t xml:space="preserve">για την Ελληνική γλώσσα. </w:t>
-      </w:r>
-      <w:r>
-        <w:rPr>
-          <w:rFonts w:cs="Times New Roman"/>
-          <w:szCs w:val="24"/>
-        </w:rPr>
-        <w:t>Επίσης</w:t>
+        <w:t xml:space="preserve"> </w:t>
+      </w:r>
+      <w:r>
+        <w:rPr>
+          <w:rFonts w:cs="Times New Roman"/>
+          <w:szCs w:val="24"/>
+          <w:lang w:val="en-US"/>
+        </w:rPr>
+        <w:t>language</w:t>
+      </w:r>
+      <w:r>
+        <w:rPr>
+          <w:rFonts w:cs="Times New Roman"/>
+          <w:szCs w:val="24"/>
+        </w:rPr>
+        <w:t xml:space="preserve"> </w:t>
+      </w:r>
+      <w:r>
+        <w:rPr>
+          <w:rFonts w:cs="Times New Roman"/>
+          <w:szCs w:val="24"/>
+          <w:lang w:val="en-US"/>
+        </w:rPr>
+        <w:t>model</w:t>
+      </w:r>
+      <w:r>
+        <w:rPr>
+          <w:rFonts w:cs="Times New Roman"/>
+          <w:szCs w:val="24"/>
+        </w:rPr>
+        <w:t xml:space="preserve"> </w:t>
+      </w:r>
+      <w:r>
+        <w:rPr>
+          <w:rFonts w:cs="Times New Roman"/>
+          <w:szCs w:val="24"/>
+        </w:rPr>
+        <w:t>για την Ελληνική γλώσσα. Επίσης</w:t>
       </w:r>
       <w:r>
         <w:rPr>
@@ -5634,21 +7447,6 @@
           <w:szCs w:val="24"/>
         </w:rPr>
         <w:t>στο</w:t>
-      </w:r>
-      <w:r>
-        <w:rPr>
-          <w:rFonts w:cs="Times New Roman"/>
-          <w:szCs w:val="24"/>
-        </w:rPr>
-        <w:t xml:space="preserve"> </w:t>
-      </w:r>
-      <w:r>
-        <w:rPr>
-          <w:rFonts w:cs="Times New Roman"/>
-          <w:szCs w:val="24"/>
-          <w:lang w:val="en-US"/>
-        </w:rPr>
-        <w:t>paper</w:t>
       </w:r>
       <w:r>
         <w:rPr>
@@ -5932,21 +7730,14 @@
           <w:rFonts w:cs="Times New Roman"/>
           <w:szCs w:val="24"/>
         </w:rPr>
-        <w:tab/>
-      </w:r>
-      <w:r>
-        <w:rPr>
-          <w:rFonts w:cs="Times New Roman"/>
-          <w:szCs w:val="24"/>
-        </w:rPr>
-        <w:t xml:space="preserve">αλλά επίσης είδαμε και την χρήση ενός </w:t>
-      </w:r>
-      <w:r>
-        <w:rPr>
-          <w:rFonts w:cs="Times New Roman"/>
-          <w:szCs w:val="24"/>
-        </w:rPr>
-        <w:t xml:space="preserve">μοντέλου </w:t>
+        <w:t xml:space="preserve"> </w:t>
+      </w:r>
+      <w:r>
+        <w:rPr>
+          <w:rFonts w:cs="Times New Roman"/>
+          <w:szCs w:val="24"/>
+        </w:rPr>
+        <w:t xml:space="preserve">αλλά επίσης είδαμε και την χρήση ενός μοντέλου </w:t>
       </w:r>
       <w:r>
         <w:rPr>
@@ -6000,36 +7791,6 @@
           <w:rFonts w:cs="Times New Roman"/>
           <w:szCs w:val="24"/>
         </w:rPr>
-        <w:t xml:space="preserve"> </w:t>
-      </w:r>
-      <w:r>
-        <w:rPr>
-          <w:rFonts w:cs="Times New Roman"/>
-          <w:szCs w:val="24"/>
-          <w:lang w:val="en-US"/>
-        </w:rPr>
-        <w:t>word</w:t>
-      </w:r>
-      <w:r>
-        <w:rPr>
-          <w:rFonts w:cs="Times New Roman"/>
-          <w:szCs w:val="24"/>
-        </w:rPr>
-        <w:t xml:space="preserve"> </w:t>
-      </w:r>
-      <w:r>
-        <w:rPr>
-          <w:rFonts w:cs="Times New Roman"/>
-          <w:szCs w:val="24"/>
-          <w:lang w:val="en-US"/>
-        </w:rPr>
-        <w:t>vectors</w:t>
-      </w:r>
-      <w:r>
-        <w:rPr>
-          <w:rFonts w:cs="Times New Roman"/>
-          <w:szCs w:val="24"/>
-        </w:rPr>
         <w:t xml:space="preserve">. </w:t>
       </w:r>
       <w:r>
@@ -6067,6 +7828,95 @@
           <w:rFonts w:cs="Times New Roman"/>
           <w:szCs w:val="24"/>
         </w:rPr>
+        <w:t xml:space="preserve"> </w:t>
+      </w:r>
+      <w:r>
+        <w:rPr>
+          <w:rFonts w:cs="Times New Roman"/>
+          <w:szCs w:val="24"/>
+        </w:rPr>
+        <w:t>και είναι εξαιρετικά αποτελεσματικά στην εκπαίδευση πάνω σε πολύπλοκα έργα. Στο</w:t>
+      </w:r>
+      <w:r>
+        <w:rPr>
+          <w:rFonts w:cs="Times New Roman"/>
+          <w:szCs w:val="24"/>
+        </w:rPr>
+        <w:t xml:space="preserve"> </w:t>
+      </w:r>
+      <w:r>
+        <w:rPr>
+          <w:rFonts w:cs="Times New Roman"/>
+          <w:szCs w:val="24"/>
+          <w:lang w:val="en-US"/>
+        </w:rPr>
+        <w:t>Offensive</w:t>
+      </w:r>
+      <w:r>
+        <w:rPr>
+          <w:rFonts w:cs="Times New Roman"/>
+          <w:szCs w:val="24"/>
+        </w:rPr>
+        <w:t xml:space="preserve"> </w:t>
+      </w:r>
+      <w:r>
+        <w:rPr>
+          <w:rFonts w:cs="Times New Roman"/>
+          <w:szCs w:val="24"/>
+          <w:lang w:val="en-US"/>
+        </w:rPr>
+        <w:t>Language</w:t>
+      </w:r>
+      <w:r>
+        <w:rPr>
+          <w:rFonts w:cs="Times New Roman"/>
+          <w:szCs w:val="24"/>
+        </w:rPr>
+        <w:t xml:space="preserve"> </w:t>
+      </w:r>
+      <w:r>
+        <w:rPr>
+          <w:rFonts w:cs="Times New Roman"/>
+          <w:szCs w:val="24"/>
+          <w:lang w:val="en-US"/>
+        </w:rPr>
+        <w:t>Identification</w:t>
+      </w:r>
+      <w:r>
+        <w:rPr>
+          <w:rFonts w:cs="Times New Roman"/>
+          <w:szCs w:val="24"/>
+        </w:rPr>
+        <w:t xml:space="preserve"> </w:t>
+      </w:r>
+      <w:r>
+        <w:rPr>
+          <w:rFonts w:cs="Times New Roman"/>
+          <w:szCs w:val="24"/>
+          <w:lang w:val="en-US"/>
+        </w:rPr>
+        <w:t>in</w:t>
+      </w:r>
+      <w:r>
+        <w:rPr>
+          <w:rFonts w:cs="Times New Roman"/>
+          <w:szCs w:val="24"/>
+        </w:rPr>
+        <w:t xml:space="preserve"> </w:t>
+      </w:r>
+      <w:r>
+        <w:rPr>
+          <w:rFonts w:cs="Times New Roman"/>
+          <w:szCs w:val="24"/>
+          <w:lang w:val="en-US"/>
+        </w:rPr>
+        <w:t>Greek</w:t>
+      </w:r>
+      <w:r>
+        <w:rPr>
+          <w:rFonts w:cs="Times New Roman"/>
+          <w:szCs w:val="24"/>
+        </w:rPr>
         <w:t xml:space="preserve">, </w:t>
       </w:r>
       <w:r>
@@ -6074,92 +7924,210 @@
           <w:rFonts w:cs="Times New Roman"/>
           <w:szCs w:val="24"/>
         </w:rPr>
-        <w:t>κάτι που χρησιμοποιήσαμε και εμείς στα δικά μας πειράματα.</w:t>
-      </w:r>
-    </w:p>
-    <w:p>
-      <w:pPr>
-        <w:pStyle w:val="Heading2"/>
-        <w:numPr>
-          <w:ilvl w:val="0"/>
-          <w:numId w:val="0"/>
-        </w:numPr>
-        <w:ind w:left="576" w:right="282" w:hanging="576"/>
-        <w:jc w:val="both"/>
-        <w:rPr>
-          <w:rFonts w:ascii="Times New Roman" w:hAnsi="Times New Roman" w:cs="Times New Roman"/>
-          <w:color w:val="auto"/>
-          <w:sz w:val="28"/>
-          <w:szCs w:val="28"/>
-        </w:rPr>
-      </w:pPr>
-      <w:bookmarkStart w:id="12" w:name="_Toc476744050"/>
-      <w:r>
-        <w:rPr>
-          <w:rFonts w:ascii="Times New Roman" w:hAnsi="Times New Roman" w:cs="Times New Roman"/>
-          <w:color w:val="auto"/>
-          <w:sz w:val="28"/>
-          <w:szCs w:val="28"/>
-        </w:rPr>
-        <w:t>1.</w:t>
-      </w:r>
-      <w:r>
-        <w:rPr>
-          <w:rFonts w:ascii="Times New Roman" w:hAnsi="Times New Roman" w:cs="Times New Roman"/>
-          <w:color w:val="auto"/>
-          <w:sz w:val="28"/>
-          <w:szCs w:val="28"/>
-        </w:rPr>
-        <w:t>2</w:t>
-      </w:r>
-      <w:r>
-        <w:rPr>
-          <w:rFonts w:ascii="Times New Roman" w:hAnsi="Times New Roman" w:cs="Times New Roman"/>
-          <w:color w:val="auto"/>
-          <w:sz w:val="28"/>
-          <w:szCs w:val="28"/>
-        </w:rPr>
-        <w:t xml:space="preserve"> [</w:t>
-      </w:r>
-      <w:r>
-        <w:rPr>
-          <w:rFonts w:ascii="Times New Roman" w:hAnsi="Times New Roman" w:cs="Times New Roman"/>
-          <w:color w:val="auto"/>
-          <w:sz w:val="28"/>
-          <w:szCs w:val="28"/>
-        </w:rPr>
-        <w:t>Τίτλος</w:t>
-      </w:r>
-      <w:r>
-        <w:rPr>
-          <w:rFonts w:ascii="Times New Roman" w:hAnsi="Times New Roman" w:cs="Times New Roman"/>
-          <w:color w:val="auto"/>
-          <w:sz w:val="28"/>
-          <w:szCs w:val="28"/>
-        </w:rPr>
-        <w:t xml:space="preserve"> </w:t>
-      </w:r>
-      <w:proofErr w:type="spellStart"/>
-      <w:r>
-        <w:rPr>
-          <w:rFonts w:ascii="Times New Roman" w:hAnsi="Times New Roman" w:cs="Times New Roman"/>
-          <w:color w:val="auto"/>
-          <w:sz w:val="28"/>
-          <w:szCs w:val="28"/>
-        </w:rPr>
-        <w:t>υποκεφαλαίου</w:t>
-      </w:r>
-      <w:proofErr w:type="spellEnd"/>
-      <w:r>
-        <w:rPr>
-          <w:rFonts w:ascii="Times New Roman" w:hAnsi="Times New Roman" w:cs="Times New Roman"/>
-          <w:color w:val="auto"/>
-          <w:sz w:val="28"/>
-          <w:szCs w:val="28"/>
-        </w:rPr>
-        <w:t>]</w:t>
-      </w:r>
-      <w:bookmarkEnd w:id="12"/>
+        <w:t>ως</w:t>
+      </w:r>
+      <w:r>
+        <w:rPr>
+          <w:rFonts w:cs="Times New Roman"/>
+          <w:szCs w:val="24"/>
+        </w:rPr>
+        <w:t xml:space="preserve"> </w:t>
+      </w:r>
+      <w:r>
+        <w:rPr>
+          <w:rFonts w:cs="Times New Roman"/>
+          <w:szCs w:val="24"/>
+        </w:rPr>
+        <w:t>μέτρο</w:t>
+      </w:r>
+      <w:r>
+        <w:rPr>
+          <w:rFonts w:cs="Times New Roman"/>
+          <w:szCs w:val="24"/>
+        </w:rPr>
+        <w:t xml:space="preserve"> </w:t>
+      </w:r>
+      <w:r>
+        <w:rPr>
+          <w:rFonts w:cs="Times New Roman"/>
+          <w:szCs w:val="24"/>
+        </w:rPr>
+        <w:t>σύγκρισης</w:t>
+      </w:r>
+      <w:r>
+        <w:rPr>
+          <w:rFonts w:cs="Times New Roman"/>
+          <w:szCs w:val="24"/>
+        </w:rPr>
+        <w:t xml:space="preserve">, </w:t>
+      </w:r>
+      <w:r>
+        <w:rPr>
+          <w:rFonts w:cs="Times New Roman"/>
+          <w:szCs w:val="24"/>
+        </w:rPr>
+        <w:t>χρησιμοποιήθηκε</w:t>
+      </w:r>
+      <w:r>
+        <w:rPr>
+          <w:rFonts w:cs="Times New Roman"/>
+          <w:szCs w:val="24"/>
+        </w:rPr>
+        <w:t xml:space="preserve"> </w:t>
+      </w:r>
+      <w:r>
+        <w:rPr>
+          <w:rFonts w:cs="Times New Roman"/>
+          <w:szCs w:val="24"/>
+          <w:lang w:val="en-US"/>
+        </w:rPr>
+        <w:t>TF</w:t>
+      </w:r>
+      <w:r>
+        <w:rPr>
+          <w:rFonts w:cs="Times New Roman"/>
+          <w:szCs w:val="24"/>
+        </w:rPr>
+        <w:t>-</w:t>
+      </w:r>
+      <w:r>
+        <w:rPr>
+          <w:rFonts w:cs="Times New Roman"/>
+          <w:szCs w:val="24"/>
+          <w:lang w:val="en-US"/>
+        </w:rPr>
+        <w:t>IDF</w:t>
+      </w:r>
+      <w:r>
+        <w:rPr>
+          <w:rFonts w:cs="Times New Roman"/>
+          <w:szCs w:val="24"/>
+        </w:rPr>
+        <w:t xml:space="preserve"> </w:t>
+      </w:r>
+      <w:r>
+        <w:rPr>
+          <w:rFonts w:cs="Times New Roman"/>
+          <w:szCs w:val="24"/>
+        </w:rPr>
+        <w:t>και</w:t>
+      </w:r>
+      <w:r>
+        <w:rPr>
+          <w:rFonts w:cs="Times New Roman"/>
+          <w:szCs w:val="24"/>
+        </w:rPr>
+        <w:t xml:space="preserve"> </w:t>
+      </w:r>
+      <w:r>
+        <w:rPr>
+          <w:rFonts w:cs="Times New Roman"/>
+          <w:szCs w:val="24"/>
+          <w:lang w:val="en-US"/>
+        </w:rPr>
+        <w:t>logistic</w:t>
+      </w:r>
+      <w:r>
+        <w:rPr>
+          <w:rFonts w:cs="Times New Roman"/>
+          <w:szCs w:val="24"/>
+        </w:rPr>
+        <w:t xml:space="preserve"> </w:t>
+      </w:r>
+      <w:r>
+        <w:rPr>
+          <w:rFonts w:cs="Times New Roman"/>
+          <w:szCs w:val="24"/>
+          <w:lang w:val="en-US"/>
+        </w:rPr>
+        <w:t>regression</w:t>
+      </w:r>
+      <w:r>
+        <w:rPr>
+          <w:rFonts w:cs="Times New Roman"/>
+          <w:szCs w:val="24"/>
+        </w:rPr>
+        <w:t xml:space="preserve"> </w:t>
+      </w:r>
+      <w:r>
+        <w:rPr>
+          <w:rFonts w:cs="Times New Roman"/>
+          <w:szCs w:val="24"/>
+        </w:rPr>
+        <w:t>που</w:t>
+      </w:r>
+      <w:r>
+        <w:rPr>
+          <w:rFonts w:cs="Times New Roman"/>
+          <w:szCs w:val="24"/>
+        </w:rPr>
+        <w:t xml:space="preserve"> </w:t>
+      </w:r>
+      <w:r>
+        <w:rPr>
+          <w:rFonts w:cs="Times New Roman"/>
+          <w:szCs w:val="24"/>
+        </w:rPr>
+        <w:t>θεωρείται</w:t>
+      </w:r>
+      <w:r>
+        <w:rPr>
+          <w:rFonts w:cs="Times New Roman"/>
+          <w:szCs w:val="24"/>
+        </w:rPr>
+        <w:t xml:space="preserve"> </w:t>
+      </w:r>
+      <w:r>
+        <w:rPr>
+          <w:rFonts w:cs="Times New Roman"/>
+          <w:szCs w:val="24"/>
+        </w:rPr>
+        <w:t>κοινή πρακτική στον χώρο. Άρα μπορούμε να δούμε πως</w:t>
+      </w:r>
+      <w:r>
+        <w:rPr>
+          <w:rFonts w:cs="Times New Roman"/>
+          <w:szCs w:val="24"/>
+        </w:rPr>
+        <w:t xml:space="preserve">, αν και υπάρχει μια μικρή χρήση κλασσικής μηχανικής μάθησης, τα μοντέλα </w:t>
+      </w:r>
+      <w:r>
+        <w:rPr>
+          <w:rFonts w:cs="Times New Roman"/>
+          <w:szCs w:val="24"/>
+          <w:lang w:val="en-US"/>
+        </w:rPr>
+        <w:t>deep</w:t>
+      </w:r>
+      <w:r>
+        <w:rPr>
+          <w:rFonts w:cs="Times New Roman"/>
+          <w:szCs w:val="24"/>
+        </w:rPr>
+        <w:t xml:space="preserve"> </w:t>
+      </w:r>
+      <w:r>
+        <w:rPr>
+          <w:rFonts w:cs="Times New Roman"/>
+          <w:szCs w:val="24"/>
+          <w:lang w:val="en-US"/>
+        </w:rPr>
+        <w:t>learning</w:t>
+      </w:r>
+      <w:r>
+        <w:rPr>
+          <w:rFonts w:cs="Times New Roman"/>
+          <w:szCs w:val="24"/>
+        </w:rPr>
+        <w:t xml:space="preserve"> </w:t>
+      </w:r>
+      <w:r>
+        <w:rPr>
+          <w:rFonts w:cs="Times New Roman"/>
+          <w:szCs w:val="24"/>
+        </w:rPr>
+        <w:t>επικρατούν στον χώρο.</w:t>
+      </w:r>
     </w:p>
     <w:p>
       <w:pPr>
@@ -6170,37 +8138,296 @@
           <w:szCs w:val="24"/>
         </w:rPr>
       </w:pPr>
-    </w:p>
-    <w:p>
-      <w:pPr>
-        <w:jc w:val="both"/>
-        <w:rPr>
-          <w:rFonts w:cs="Times New Roman"/>
-          <w:szCs w:val="24"/>
-        </w:rPr>
-      </w:pPr>
-      <w:r>
-        <w:rPr>
-          <w:rFonts w:cs="Times New Roman"/>
-          <w:szCs w:val="24"/>
-        </w:rPr>
-        <w:t xml:space="preserve">Κυρίως κείμενο της εργασίας. Κυρίως κείμενο της εργασίας. Κυρίως κείμενο της εργασίας. Κυρίως κείμενο της εργασίας. Κυρίως κείμενο της εργασίας. Κυρίως κείμενο της εργασίας. Κυρίως κείμενο της εργασίας. </w:t>
-      </w:r>
-    </w:p>
-    <w:p>
-      <w:pPr>
-        <w:jc w:val="both"/>
-        <w:rPr>
-          <w:rFonts w:cs="Times New Roman"/>
-          <w:szCs w:val="24"/>
-        </w:rPr>
-      </w:pPr>
-      <w:r>
-        <w:rPr>
-          <w:rFonts w:cs="Times New Roman"/>
-          <w:szCs w:val="24"/>
-        </w:rPr>
-        <w:t>Κυρίως κείμενο της εργασίας. Κυρίως κείμενο της εργασίας. Κυρίως κείμενο της εργασίας. Κυρίως κείμενο της εργασίας.</w:t>
+      <w:r>
+        <w:rPr>
+          <w:rFonts w:cs="Times New Roman"/>
+          <w:szCs w:val="24"/>
+        </w:rPr>
+        <w:t>Τα</w:t>
+      </w:r>
+      <w:r>
+        <w:rPr>
+          <w:rFonts w:cs="Times New Roman"/>
+          <w:szCs w:val="24"/>
+        </w:rPr>
+        <w:t xml:space="preserve"> </w:t>
+      </w:r>
+      <w:r>
+        <w:rPr>
+          <w:rFonts w:cs="Times New Roman"/>
+          <w:szCs w:val="24"/>
+        </w:rPr>
+        <w:t>μοντέλα</w:t>
+      </w:r>
+      <w:r>
+        <w:rPr>
+          <w:rFonts w:cs="Times New Roman"/>
+          <w:szCs w:val="24"/>
+        </w:rPr>
+        <w:t xml:space="preserve"> </w:t>
+      </w:r>
+      <w:r>
+        <w:rPr>
+          <w:rFonts w:cs="Times New Roman"/>
+          <w:szCs w:val="24"/>
+        </w:rPr>
+        <w:t>όπως</w:t>
+      </w:r>
+      <w:r>
+        <w:rPr>
+          <w:rFonts w:cs="Times New Roman"/>
+          <w:szCs w:val="24"/>
+        </w:rPr>
+        <w:t xml:space="preserve"> </w:t>
+      </w:r>
+      <w:r>
+        <w:rPr>
+          <w:rFonts w:cs="Times New Roman"/>
+          <w:szCs w:val="24"/>
+          <w:lang w:val="en-US"/>
+        </w:rPr>
+        <w:t>BERT</w:t>
+      </w:r>
+      <w:r>
+        <w:rPr>
+          <w:rFonts w:cs="Times New Roman"/>
+          <w:szCs w:val="24"/>
+        </w:rPr>
+        <w:t xml:space="preserve"> </w:t>
+      </w:r>
+      <w:r>
+        <w:rPr>
+          <w:rFonts w:cs="Times New Roman"/>
+          <w:szCs w:val="24"/>
+        </w:rPr>
+        <w:t>και</w:t>
+      </w:r>
+      <w:r>
+        <w:rPr>
+          <w:rFonts w:cs="Times New Roman"/>
+          <w:szCs w:val="24"/>
+        </w:rPr>
+        <w:t xml:space="preserve"> </w:t>
+      </w:r>
+      <w:proofErr w:type="spellStart"/>
+      <w:r>
+        <w:rPr>
+          <w:rFonts w:cs="Times New Roman"/>
+          <w:szCs w:val="24"/>
+          <w:lang w:val="en-US"/>
+        </w:rPr>
+        <w:t>RoBERTa</w:t>
+      </w:r>
+      <w:proofErr w:type="spellEnd"/>
+      <w:r>
+        <w:rPr>
+          <w:rFonts w:cs="Times New Roman"/>
+          <w:szCs w:val="24"/>
+        </w:rPr>
+        <w:t xml:space="preserve"> </w:t>
+      </w:r>
+      <w:r>
+        <w:rPr>
+          <w:rFonts w:cs="Times New Roman"/>
+          <w:szCs w:val="24"/>
+        </w:rPr>
+        <w:t>είναι</w:t>
+      </w:r>
+      <w:r>
+        <w:rPr>
+          <w:rFonts w:cs="Times New Roman"/>
+          <w:szCs w:val="24"/>
+        </w:rPr>
+        <w:t xml:space="preserve"> </w:t>
+      </w:r>
+      <w:r>
+        <w:rPr>
+          <w:rFonts w:cs="Times New Roman"/>
+          <w:szCs w:val="24"/>
+          <w:lang w:val="en-US"/>
+        </w:rPr>
+        <w:t>transformer</w:t>
+      </w:r>
+      <w:r>
+        <w:rPr>
+          <w:rFonts w:cs="Times New Roman"/>
+          <w:szCs w:val="24"/>
+        </w:rPr>
+        <w:t>-</w:t>
+      </w:r>
+      <w:r>
+        <w:rPr>
+          <w:rFonts w:cs="Times New Roman"/>
+          <w:szCs w:val="24"/>
+          <w:lang w:val="en-US"/>
+        </w:rPr>
+        <w:t>based</w:t>
+      </w:r>
+      <w:r>
+        <w:rPr>
+          <w:rFonts w:cs="Times New Roman"/>
+          <w:szCs w:val="24"/>
+        </w:rPr>
+        <w:t xml:space="preserve"> </w:t>
+      </w:r>
+      <w:r>
+        <w:rPr>
+          <w:rFonts w:cs="Times New Roman"/>
+          <w:szCs w:val="24"/>
+        </w:rPr>
+        <w:t>δηλαδή χρησιμοποιούν μετασχηματιστές</w:t>
+      </w:r>
+      <w:r>
+        <w:rPr>
+          <w:rFonts w:cs="Times New Roman"/>
+          <w:szCs w:val="24"/>
+        </w:rPr>
+        <w:t xml:space="preserve">. </w:t>
+      </w:r>
+      <w:r>
+        <w:rPr>
+          <w:rFonts w:cs="Times New Roman"/>
+          <w:szCs w:val="24"/>
+        </w:rPr>
+        <w:t xml:space="preserve">Οι μετασχηματιστές είναι ένας τύπος αρχιτεκτονικής </w:t>
+      </w:r>
+      <w:proofErr w:type="spellStart"/>
+      <w:r>
+        <w:rPr>
+          <w:rFonts w:cs="Times New Roman"/>
+          <w:szCs w:val="24"/>
+        </w:rPr>
+        <w:t>νευρωνικού</w:t>
+      </w:r>
+      <w:proofErr w:type="spellEnd"/>
+      <w:r>
+        <w:rPr>
+          <w:rFonts w:cs="Times New Roman"/>
+          <w:szCs w:val="24"/>
+        </w:rPr>
+        <w:t xml:space="preserve"> δικτύου που μετασχηματίζει ή αλλάζει μια ακολουθία εισόδου σε μια ακολουθία εξόδου. </w:t>
+      </w:r>
+      <w:r>
+        <w:rPr>
+          <w:rFonts w:cs="Times New Roman"/>
+          <w:szCs w:val="24"/>
+        </w:rPr>
+        <w:lastRenderedPageBreak/>
+        <w:t>Το επιτυγχάνουν αυτό μαθαίνοντας το περιβάλλον και παρακολουθώντας τις σχέσεις μεταξύ των στοιχείων της ακολουθίας.</w:t>
+      </w:r>
+    </w:p>
+    <w:p>
+      <w:pPr>
+        <w:pStyle w:val="a0"/>
+      </w:pPr>
+      <w:r>
+        <w:t xml:space="preserve">1.4 </w:t>
+      </w:r>
+      <w:r>
+        <w:t>Προκλήσεις</w:t>
+      </w:r>
+      <w:r>
+        <w:t xml:space="preserve"> </w:t>
+      </w:r>
+      <w:r>
+        <w:t>και</w:t>
+      </w:r>
+      <w:r>
+        <w:t xml:space="preserve"> </w:t>
+      </w:r>
+      <w:r>
+        <w:t>περιορισμοί</w:t>
+      </w:r>
+    </w:p>
+    <w:p>
+      <w:r>
+        <w:t xml:space="preserve">Η Ελληνική γλώσσα </w:t>
+      </w:r>
+      <w:r>
+        <w:t>έχει πολλές ιδιαιτερότητες που μπορούν πιθανώς να προκαλέσουν εμπόδιο για το έργο μας. Ο τονισμός είναι κάτι που λίγες γλώσσες εκφράζουν γραπτώς και τα ελληνικά είναι μια από αυτές</w:t>
+      </w:r>
+      <w:r>
+        <w:t>. Ό</w:t>
+      </w:r>
+      <w:r>
+        <w:t xml:space="preserve">ταν μιλάμε στο διαδίκτυο </w:t>
+      </w:r>
+      <w:r>
+        <w:t xml:space="preserve">και ειδικά στα </w:t>
+      </w:r>
+      <w:r>
+        <w:rPr>
+          <w:lang w:val="en-US"/>
+        </w:rPr>
+        <w:t>social</w:t>
+      </w:r>
+      <w:r>
+        <w:t xml:space="preserve"> </w:t>
+      </w:r>
+      <w:r>
+        <w:rPr>
+          <w:lang w:val="en-US"/>
+        </w:rPr>
+        <w:t>media</w:t>
+      </w:r>
+      <w:r>
+        <w:t xml:space="preserve"> </w:t>
+      </w:r>
+      <w:r>
+        <w:t xml:space="preserve">επικρατεί ένα </w:t>
+      </w:r>
+      <w:r>
+        <w:rPr>
+          <w:lang w:val="en-US"/>
+        </w:rPr>
+        <w:t>casual</w:t>
+      </w:r>
+      <w:r>
+        <w:t xml:space="preserve"> </w:t>
+      </w:r>
+      <w:r>
+        <w:t>ύφος</w:t>
+      </w:r>
+      <w:r>
+        <w:t xml:space="preserve"> </w:t>
+      </w:r>
+      <w:r>
+        <w:t>οπότε είναι εύκολο να παραλείψουμε τον τόνο στο κείμενο, αυτό όμως μπορεί να προκαλέσει ανακρίβεια στην μηχανική μάθηση διότι ένα γράμμα με τόνο και το ίδιο γράμμα χωρίς τόνο θεωρούνται διαφορετικοί χαρακτήρες. Εκτός από αυτό, οι Έλληνες έχουν μια μεγάλη ποικιλία βρισιών και προσβολών οι οποίες μπορούν να βασίζονται στην περιοχή καταγωγής τους εντός της Ελλάδας, κάτι που τις καθιστά σπάνιες στην χρήση τους πόσο μάλλον στον γραπτό λόγο.</w:t>
+      </w:r>
+    </w:p>
+    <w:p>
+      <w:r>
+        <w:t xml:space="preserve">Το πρόβλημα της έλλειψης δεδομένων υπάρχει για πολλές γλώσσες τις οποίες ο πληθυσμός που τις μιλάει είναι σχετικά μικρός. Τα Ελληνικά θεωρούνται </w:t>
+      </w:r>
+      <w:r>
+        <w:rPr>
+          <w:lang w:val="en-US"/>
+        </w:rPr>
+        <w:t>low</w:t>
+      </w:r>
+      <w:r>
+        <w:t>-</w:t>
+      </w:r>
+      <w:r>
+        <w:rPr>
+          <w:lang w:val="en-US"/>
+        </w:rPr>
+        <w:t>resource</w:t>
+      </w:r>
+      <w:r>
+        <w:t xml:space="preserve"> </w:t>
+      </w:r>
+      <w:r>
+        <w:t xml:space="preserve">στον χώρο του </w:t>
+      </w:r>
+      <w:r>
+        <w:rPr>
+          <w:lang w:val="en-US"/>
+        </w:rPr>
+        <w:t>NLP</w:t>
+      </w:r>
+      <w:r>
+        <w:t xml:space="preserve"> και έτσι η εύρεση δεδομένων είναι ήδη δύσκολη, όμως οι ιδιαιτερότητες και η ποικιλία της δεν βοηθάνε στην επίτευξη του έργου μας. Οι Ελληνικές βρισιές είναι πολλές και δεν είναι εύκολο να τις καταγράψεις με τυπικό τρόπο, άρα μαζί με την προσθήκη ή την απουσία τόνων και την ορθογραφία καθιστά της επεξεργασία των Ελληνικών εξαιρετικά δύσκολη.</w:t>
       </w:r>
     </w:p>
     <w:p>
@@ -7306,8 +9533,9 @@
         </w:numPr>
         <w:ind w:left="432" w:right="282" w:hanging="432"/>
         <w:rPr>
-          <w:rFonts w:ascii="Times New Roman" w:hAnsi="Times New Roman" w:cs="Times New Roman"/>
-          <w:color w:val="auto"/>
+          <w:rFonts w:cs="Times New Roman"/>
+          <w:iCs/>
+          <w:lang w:val="en-US"/>
         </w:rPr>
       </w:pPr>
       <w:r>
@@ -7317,145 +9545,274 @@
         </w:rPr>
         <w:br w:type="page"/>
       </w:r>
-      <w:bookmarkStart w:id="20" w:name="_Toc476744058"/>
-      <w:r>
-        <w:rPr>
-          <w:rFonts w:ascii="Times New Roman" w:hAnsi="Times New Roman" w:cs="Times New Roman"/>
-          <w:color w:val="auto"/>
-        </w:rPr>
-        <w:lastRenderedPageBreak/>
-        <w:t>ΒΙΒΛΙΟΓΡΑΦΙΑ</w:t>
-      </w:r>
-      <w:bookmarkEnd w:id="20"/>
-    </w:p>
-    <w:p>
-      <w:pPr>
-        <w:rPr>
-          <w:rFonts w:cs="Times New Roman"/>
-        </w:rPr>
-      </w:pPr>
-    </w:p>
-    <w:p>
-      <w:pPr>
+    </w:p>
+    <w:sdt>
+      <w:sdtPr>
+        <w:id w:val="-380639557"/>
+        <w:docPartObj>
+          <w:docPartGallery w:val="Bibliographies"/>
+          <w:docPartUnique/>
+        </w:docPartObj>
+      </w:sdtPr>
+      <w:sdtEndPr>
+        <w:rPr>
+          <w:rFonts w:ascii="Times New Roman" w:eastAsiaTheme="minorHAnsi" w:hAnsi="Times New Roman" w:cstheme="minorBidi"/>
+          <w:b w:val="0"/>
+          <w:bCs w:val="0"/>
+          <w:color w:val="auto"/>
+          <w:sz w:val="24"/>
+          <w:szCs w:val="22"/>
+        </w:rPr>
+      </w:sdtEndPr>
+      <w:sdtContent>
+        <w:p>
+          <w:pPr>
+            <w:pStyle w:val="Heading1"/>
+            <w:numPr>
+              <w:ilvl w:val="0"/>
+              <w:numId w:val="0"/>
+            </w:numPr>
+            <w:ind w:left="432" w:hanging="432"/>
+            <w:rPr>
+              <w:rStyle w:val="Char"/>
+              <w:color w:val="000000" w:themeColor="text1"/>
+            </w:rPr>
+          </w:pPr>
+          <w:r>
+            <w:rPr>
+              <w:rStyle w:val="Char"/>
+              <w:color w:val="000000" w:themeColor="text1"/>
+            </w:rPr>
+            <w:t>Bibliography</w:t>
+          </w:r>
+        </w:p>
+        <w:sdt>
+          <w:sdtPr>
+            <w:id w:val="111145805"/>
+            <w:bibliography/>
+          </w:sdtPr>
+          <w:sdtContent>
+            <w:p>
+              <w:pPr>
+                <w:pStyle w:val="Bibliography"/>
+                <w:ind w:left="720" w:hanging="720"/>
+                <w:rPr>
+                  <w:noProof/>
+                  <w:szCs w:val="24"/>
+                  <w:lang w:val="en-US"/>
+                </w:rPr>
+              </w:pPr>
+              <w:r>
+                <w:fldChar w:fldCharType="begin"/>
+              </w:r>
+              <w:r>
+                <w:rPr>
+                  <w:lang w:val="en-US"/>
+                </w:rPr>
+                <w:instrText xml:space="preserve"> BIBLIOGRAPHY </w:instrText>
+              </w:r>
+              <w:r>
+                <w:fldChar w:fldCharType="separate"/>
+              </w:r>
+              <w:r>
+                <w:rPr>
+                  <w:noProof/>
+                  <w:lang w:val="en-US"/>
+                </w:rPr>
+                <w:t xml:space="preserve">Anagnostopoulos, T. (2021). </w:t>
+              </w:r>
+              <w:r>
+                <w:rPr>
+                  <w:i/>
+                  <w:iCs/>
+                  <w:noProof/>
+                  <w:lang w:val="en-US"/>
+                </w:rPr>
+                <w:t>Toxicity Detection on Greek Tweets.</w:t>
+              </w:r>
+              <w:r>
+                <w:rPr>
+                  <w:noProof/>
+                  <w:lang w:val="en-US"/>
+                </w:rPr>
+                <w:t xml:space="preserve"> Athens.</w:t>
+              </w:r>
+            </w:p>
+            <w:p>
+              <w:pPr>
+                <w:pStyle w:val="Bibliography"/>
+                <w:ind w:left="720" w:hanging="720"/>
+                <w:rPr>
+                  <w:noProof/>
+                  <w:lang w:val="en-US"/>
+                </w:rPr>
+              </w:pPr>
+              <w:r>
+                <w:rPr>
+                  <w:noProof/>
+                  <w:lang w:val="en-US"/>
+                </w:rPr>
+                <w:t xml:space="preserve">ELSTAT. (2023). </w:t>
+              </w:r>
+              <w:r>
+                <w:rPr>
+                  <w:i/>
+                  <w:iCs/>
+                  <w:noProof/>
+                  <w:lang w:val="en-US"/>
+                </w:rPr>
+                <w:t>SURVEY ON THE USE OF INFORMATION AND COMMUNICATION TECHNOLOGIES.</w:t>
+              </w:r>
+              <w:r>
+                <w:rPr>
+                  <w:noProof/>
+                  <w:lang w:val="en-US"/>
+                </w:rPr>
+                <w:t xml:space="preserve"> </w:t>
+              </w:r>
+            </w:p>
+            <w:p>
+              <w:pPr>
+                <w:pStyle w:val="Bibliography"/>
+                <w:ind w:left="720" w:hanging="720"/>
+                <w:rPr>
+                  <w:noProof/>
+                  <w:lang w:val="en-US"/>
+                </w:rPr>
+              </w:pPr>
+              <w:r>
+                <w:rPr>
+                  <w:noProof/>
+                  <w:lang w:val="en-US"/>
+                </w:rPr>
+                <w:t>Konstantinos Perifanos, D. G. (2021). Multimodal Hate Speech Detection in Greek Social Media .</w:t>
+              </w:r>
+            </w:p>
+            <w:p>
+              <w:pPr>
+                <w:pStyle w:val="Bibliography"/>
+                <w:ind w:left="720" w:hanging="720"/>
+                <w:rPr>
+                  <w:noProof/>
+                  <w:lang w:val="en-US"/>
+                </w:rPr>
+              </w:pPr>
+              <w:r>
+                <w:rPr>
+                  <w:noProof/>
+                  <w:lang w:val="en-US"/>
+                </w:rPr>
+                <w:t>Madriaza, P. (2025). Exposure to hate in online and traditional media: A systematic review and meta‐analysis of the impact of this exposure on individuals and communities.</w:t>
+              </w:r>
+            </w:p>
+            <w:p>
+              <w:pPr>
+                <w:pStyle w:val="Bibliography"/>
+                <w:ind w:left="720" w:hanging="720"/>
+                <w:rPr>
+                  <w:noProof/>
+                  <w:lang w:val="en-US"/>
+                </w:rPr>
+              </w:pPr>
+              <w:r>
+                <w:rPr>
+                  <w:noProof/>
+                  <w:lang w:val="en-US"/>
+                </w:rPr>
+                <w:t>Reviews, C. S. (2025, January). Exposure to hate in online and traditional media: A systematic review and meta‐analysis of the impact of this exposure on individuals and communities.</w:t>
+              </w:r>
+            </w:p>
+            <w:p>
+              <w:pPr>
+                <w:pStyle w:val="Bibliography"/>
+                <w:ind w:left="720" w:hanging="720"/>
+                <w:rPr>
+                  <w:noProof/>
+                  <w:lang w:val="en-US"/>
+                </w:rPr>
+              </w:pPr>
+              <w:r>
+                <w:rPr>
+                  <w:noProof/>
+                  <w:lang w:val="en-US"/>
+                </w:rPr>
+                <w:t xml:space="preserve">Shmulewitz, D. (2025). </w:t>
+              </w:r>
+              <w:r>
+                <w:rPr>
+                  <w:i/>
+                  <w:iCs/>
+                  <w:noProof/>
+                  <w:lang w:val="en-US"/>
+                </w:rPr>
+                <w:t>Exposure to online hate speech is positively associated with post-traumatic stress disorder symptom severity.</w:t>
+              </w:r>
+              <w:r>
+                <w:rPr>
+                  <w:noProof/>
+                  <w:lang w:val="en-US"/>
+                </w:rPr>
+                <w:t xml:space="preserve"> Jerusalem.</w:t>
+              </w:r>
+            </w:p>
+            <w:p>
+              <w:pPr>
+                <w:pStyle w:val="Bibliography"/>
+                <w:ind w:left="720" w:hanging="720"/>
+                <w:rPr>
+                  <w:noProof/>
+                  <w:lang w:val="en-US"/>
+                </w:rPr>
+              </w:pPr>
+              <w:r>
+                <w:rPr>
+                  <w:noProof/>
+                  <w:lang w:val="en-US"/>
+                </w:rPr>
+                <w:t xml:space="preserve">Zeses Pitenis, M. Z. (2020). </w:t>
+              </w:r>
+              <w:r>
+                <w:rPr>
+                  <w:i/>
+                  <w:iCs/>
+                  <w:noProof/>
+                  <w:lang w:val="en-US"/>
+                </w:rPr>
+                <w:t>Offensive Language Identification in Greek.</w:t>
+              </w:r>
+              <w:r>
+                <w:rPr>
+                  <w:noProof/>
+                  <w:lang w:val="en-US"/>
+                </w:rPr>
+                <w:t xml:space="preserve"> </w:t>
+              </w:r>
+            </w:p>
+            <w:p>
+              <w:r>
+                <w:rPr>
+                  <w:b/>
+                  <w:bCs/>
+                  <w:noProof/>
+                </w:rPr>
+                <w:fldChar w:fldCharType="end"/>
+              </w:r>
+            </w:p>
+          </w:sdtContent>
+        </w:sdt>
+      </w:sdtContent>
+    </w:sdt>
+    <w:p>
+      <w:pPr>
+        <w:pStyle w:val="Heading1"/>
         <w:numPr>
           <w:ilvl w:val="0"/>
-          <w:numId w:val="4"/>
+          <w:numId w:val="0"/>
         </w:numPr>
-        <w:ind w:right="282"/>
-        <w:rPr>
-          <w:rFonts w:cs="Times New Roman"/>
-          <w:b/>
-          <w:bCs/>
+        <w:ind w:left="432" w:right="282" w:hanging="432"/>
+        <w:rPr>
+          <w:rFonts w:cs="Times New Roman"/>
           <w:iCs/>
-          <w:lang w:val="en-US"/>
-        </w:rPr>
-      </w:pPr>
-      <w:r>
-        <w:rPr>
-          <w:rFonts w:cs="Times New Roman"/>
-          <w:iCs/>
-          <w:sz w:val="28"/>
-          <w:szCs w:val="28"/>
-          <w:lang w:val="en-US"/>
-        </w:rPr>
-        <w:t xml:space="preserve">Dvora Shmulewitz, Maor Daniel Levitin, Vera Skvirsky, Merav Vider, Shaul Lev-Ran, Mario </w:t>
-      </w:r>
-      <w:r>
-        <w:rPr>
-          <w:rFonts w:cs="Times New Roman"/>
-          <w:iCs/>
-          <w:sz w:val="28"/>
-          <w:szCs w:val="28"/>
-          <w:lang w:val="en-US"/>
-        </w:rPr>
-        <w:t xml:space="preserve">Mikulincer, </w:t>
-      </w:r>
-      <w:r>
-        <w:rPr>
-          <w:rFonts w:cs="Times New Roman"/>
-          <w:iCs/>
-          <w:sz w:val="28"/>
-          <w:szCs w:val="28"/>
-          <w:lang w:val="en-US"/>
-        </w:rPr>
-        <w:t>Exposure to online hate speech is positively associated with post-traumatic stress disorder symptom severity»</w:t>
-      </w:r>
-      <w:r>
-        <w:rPr>
-          <w:rFonts w:cs="Times New Roman"/>
-          <w:b/>
-          <w:bCs/>
-          <w:iCs/>
-          <w:lang w:val="en-US"/>
-        </w:rPr>
-        <w:t xml:space="preserve">. </w:t>
-      </w:r>
-      <w:proofErr w:type="spellStart"/>
-      <w:r>
-        <w:rPr>
-          <w:rFonts w:cs="Times New Roman"/>
-          <w:iCs/>
-          <w:sz w:val="28"/>
-          <w:szCs w:val="28"/>
-          <w:lang w:val="en-US"/>
-        </w:rPr>
-        <w:t>doi</w:t>
-      </w:r>
-      <w:proofErr w:type="spellEnd"/>
-      <w:r>
-        <w:rPr>
-          <w:rFonts w:cs="Times New Roman"/>
-          <w:iCs/>
-          <w:sz w:val="28"/>
-          <w:szCs w:val="28"/>
-          <w:lang w:val="en-US"/>
-        </w:rPr>
-        <w:t xml:space="preserve">: </w:t>
-      </w:r>
-      <w:hyperlink r:id="rId9" w:tgtFrame="_blank" w:history="1">
-        <w:r>
-          <w:rPr>
-            <w:rStyle w:val="Hyperlink"/>
-            <w:rFonts w:cs="Times New Roman"/>
-            <w:iCs/>
-            <w:sz w:val="28"/>
-            <w:szCs w:val="28"/>
-            <w:lang w:val="en-US"/>
-          </w:rPr>
-          <w:t>10.1038/s41598-025-16168-1</w:t>
-        </w:r>
-      </w:hyperlink>
-      <w:r>
-        <w:rPr>
-          <w:rFonts w:cs="Times New Roman"/>
-          <w:iCs/>
-          <w:sz w:val="28"/>
-          <w:szCs w:val="28"/>
-          <w:lang w:val="en-US"/>
-        </w:rPr>
-        <w:t>.</w:t>
-      </w:r>
-    </w:p>
-    <w:p>
-      <w:pPr>
-        <w:ind w:right="282"/>
-        <w:rPr>
-          <w:rFonts w:cs="Times New Roman"/>
-          <w:iCs/>
-          <w:sz w:val="28"/>
-          <w:szCs w:val="28"/>
-          <w:lang w:val="en-US"/>
-        </w:rPr>
-      </w:pPr>
-    </w:p>
-    <w:p>
-      <w:pPr>
-        <w:ind w:right="282"/>
-        <w:rPr>
-          <w:rFonts w:cs="Times New Roman"/>
-          <w:iCs/>
-          <w:sz w:val="28"/>
-          <w:szCs w:val="28"/>
           <w:lang w:val="en-US"/>
         </w:rPr>
         <w:sectPr>
@@ -7475,63 +9832,10 @@
         <w:rPr>
           <w:rFonts w:cs="Times New Roman"/>
           <w:iCs/>
-          <w:sz w:val="28"/>
-          <w:szCs w:val="28"/>
-          <w:lang w:val="en-US"/>
-        </w:rPr>
-        <w:t xml:space="preserve">2   Pablo Madriaza, Ghayda Hassan, Sébastien Brouillette-Alarie, </w:t>
-      </w:r>
-      <w:r>
-        <w:rPr>
-          <w:rFonts w:cs="Times New Roman"/>
-          <w:iCs/>
-          <w:sz w:val="28"/>
-          <w:szCs w:val="28"/>
-          <w:lang w:val="en-US"/>
-        </w:rPr>
-        <w:t xml:space="preserve">Aoudou Njingouo Mounchingam. «Exposure to hate in online and traditional media: A systematic review and meta‐analysis of the impact of this exposure on individuals and communities. </w:t>
-      </w:r>
-      <w:proofErr w:type="spellStart"/>
-      <w:r>
-        <w:rPr>
-          <w:rFonts w:cs="Times New Roman"/>
-          <w:iCs/>
-          <w:sz w:val="28"/>
-          <w:szCs w:val="28"/>
-          <w:lang w:val="en-US"/>
-        </w:rPr>
-        <w:t>doi</w:t>
-      </w:r>
-      <w:proofErr w:type="spellEnd"/>
-      <w:r>
-        <w:rPr>
-          <w:rFonts w:cs="Times New Roman"/>
-          <w:iCs/>
-          <w:sz w:val="28"/>
-          <w:szCs w:val="28"/>
-          <w:lang w:val="en-US"/>
-        </w:rPr>
-        <w:t>:</w:t>
-      </w:r>
-      <w:r>
-        <w:rPr>
-          <w:lang w:val="en-US"/>
-        </w:rPr>
-        <w:t xml:space="preserve"> </w:t>
-      </w:r>
-      <w:hyperlink r:id="rId14" w:tgtFrame="_blank" w:history="1">
-        <w:r>
-          <w:rPr>
-            <w:rStyle w:val="Hyperlink"/>
-            <w:rFonts w:cs="Times New Roman"/>
-            <w:iCs/>
-            <w:sz w:val="28"/>
-            <w:szCs w:val="28"/>
-            <w:lang w:val="en-US"/>
-          </w:rPr>
-          <w:t>10.1002/cl2.70018</w:t>
-        </w:r>
-      </w:hyperlink>
+          <w:lang w:val="en-US"/>
+        </w:rPr>
+        <w:t xml:space="preserve"> </w:t>
+      </w:r>
     </w:p>
     <w:p>
       <w:pPr>
@@ -7624,8 +9928,8 @@
       </w:pPr>
     </w:p>
     <w:sectPr>
-      <w:headerReference w:type="first" r:id="rId15"/>
-      <w:footerReference w:type="first" r:id="rId16"/>
+      <w:headerReference w:type="first" r:id="rId14"/>
+      <w:footerReference w:type="first" r:id="rId15"/>
       <w:pgSz w:w="11906" w:h="16838"/>
       <w:pgMar w:top="1418" w:right="1134" w:bottom="1418" w:left="1701" w:header="709" w:footer="709" w:gutter="0"/>
       <w:pgNumType w:fmt="lowerRoman" w:start="4"/>
@@ -8843,6 +11147,7 @@
   <w:style w:type="character" w:default="1" w:styleId="DefaultParagraphFont">
     <w:name w:val="Default Paragraph Font"/>
     <w:uiPriority w:val="1"/>
+    <w:semiHidden/>
     <w:unhideWhenUsed/>
   </w:style>
   <w:style w:type="table" w:default="1" w:styleId="TableNormal">
@@ -9663,7 +11968,7 @@
       </b:Author>
     </b:Author>
     <b:Month>January</b:Month>
-    <b:RefOrder>5</b:RefOrder>
+    <b:RefOrder>7</b:RefOrder>
   </b:Source>
   <b:Source>
     <b:Tag>Dep25</b:Tag>
@@ -9719,7 +12024,7 @@
     </b:Author>
     <b:Title>Multimodal Hate Speech Detection in Greek Social Media </b:Title>
     <b:Year>2021</b:Year>
-    <b:RefOrder>3</b:RefOrder>
+    <b:RefOrder>6</b:RefOrder>
   </b:Source>
   <b:Source>
     <b:Tag>Ana21</b:Tag>
@@ -9738,13 +12043,45 @@
     <b:Title>Toxicity Detection on Greek Tweets</b:Title>
     <b:Year>2021</b:Year>
     <b:City>Athens</b:City>
+    <b:RefOrder>5</b:RefOrder>
+  </b:Source>
+  <b:Source>
+    <b:Tag>ELS23</b:Tag>
+    <b:SourceType>Report</b:SourceType>
+    <b:Guid>{B6159325-7782-4BE1-969B-451BF1C04FA4}</b:Guid>
+    <b:Title>SURVEY ON THE USE OF INFORMATION AND COMMUNICATION TECHNOLOGIES</b:Title>
+    <b:Year>2023</b:Year>
+    <b:Author>
+      <b:Author>
+        <b:Corporate>ELSTAT</b:Corporate>
+      </b:Author>
+    </b:Author>
+    <b:RefOrder>3</b:RefOrder>
+  </b:Source>
+  <b:Source>
+    <b:Tag>Zes20</b:Tag>
+    <b:SourceType>Report</b:SourceType>
+    <b:Guid>{0DD93A36-FEE4-4ED3-ADA2-48A6E3A5AE65}</b:Guid>
+    <b:Author>
+      <b:Author>
+        <b:NameList>
+          <b:Person>
+            <b:Last>Zeses Pitenis</b:Last>
+            <b:First>Marcos</b:First>
+            <b:Middle>Zampieri, Tharindu Ranasinghe</b:Middle>
+          </b:Person>
+        </b:NameList>
+      </b:Author>
+    </b:Author>
+    <b:Title>Offensive Language Identification in Greek</b:Title>
+    <b:Year>2020</b:Year>
     <b:RefOrder>4</b:RefOrder>
   </b:Source>
 </b:Sources>
 </file>
 
 <file path=customXml/itemProps1.xml><?xml version="1.0" encoding="utf-8"?>
-<ds:datastoreItem xmlns:ds="http://schemas.openxmlformats.org/officeDocument/2006/customXml" ds:itemID="{83CC9259-9F22-4A56-91EE-59CE9BC7D6AF}">
+<ds:datastoreItem xmlns:ds="http://schemas.openxmlformats.org/officeDocument/2006/customXml" ds:itemID="{EBC425D4-E8C4-4BF1-A784-1630B9F24BBC}">
   <ds:schemaRefs>
     <ds:schemaRef ds:uri="http://schemas.openxmlformats.org/officeDocument/2006/bibliography"/>
   </ds:schemaRefs>

</xml_diff>

<commit_message>
add powerpoint first draft
</commit_message>
<xml_diff>
--- a/Toxicity analysis in Greek text.docx
+++ b/Toxicity analysis in Greek text.docx
@@ -20,125 +20,8 @@
           <w:szCs w:val="28"/>
           <w:lang w:eastAsia="el-GR"/>
         </w:rPr>
-        <mc:AlternateContent>
-          <mc:Choice Requires="wps">
-            <w:drawing>
-              <wp:anchor distT="0" distB="0" distL="114300" distR="114300" simplePos="0" relativeHeight="251661312" behindDoc="0" locked="0" layoutInCell="1" allowOverlap="1" wp14:anchorId="0582FA29" wp14:editId="0CC3B444">
-                <wp:simplePos x="0" y="0"/>
-                <wp:positionH relativeFrom="column">
-                  <wp:posOffset>-315861</wp:posOffset>
-                </wp:positionH>
-                <wp:positionV relativeFrom="paragraph">
-                  <wp:posOffset>-218042</wp:posOffset>
-                </wp:positionV>
-                <wp:extent cx="1269241" cy="249382"/>
-                <wp:effectExtent l="0" t="0" r="26670" b="17780"/>
-                <wp:wrapNone/>
-                <wp:docPr id="3" name="Πλαίσιο κειμένου 2"/>
-                <wp:cNvGraphicFramePr>
-                  <a:graphicFrameLocks xmlns:a="http://schemas.openxmlformats.org/drawingml/2006/main"/>
-                </wp:cNvGraphicFramePr>
-                <a:graphic xmlns:a="http://schemas.openxmlformats.org/drawingml/2006/main">
-                  <a:graphicData uri="http://schemas.microsoft.com/office/word/2010/wordprocessingShape">
-                    <wps:wsp>
-                      <wps:cNvSpPr txBox="1">
-                        <a:spLocks noChangeArrowheads="1"/>
-                      </wps:cNvSpPr>
-                      <wps:spPr bwMode="auto">
-                        <a:xfrm>
-                          <a:off x="0" y="0"/>
-                          <a:ext cx="1269241" cy="249382"/>
-                        </a:xfrm>
-                        <a:prstGeom prst="rect">
-                          <a:avLst/>
-                        </a:prstGeom>
-                        <a:solidFill>
-                          <a:srgbClr val="FFFFFF"/>
-                        </a:solidFill>
-                        <a:ln w="9525">
-                          <a:solidFill>
-                            <a:srgbClr val="000000"/>
-                          </a:solidFill>
-                          <a:miter lim="800000"/>
-                          <a:headEnd/>
-                          <a:tailEnd/>
-                        </a:ln>
-                      </wps:spPr>
-                      <wps:txbx>
-                        <w:txbxContent>
-                          <w:p>
-                            <w:pPr>
-                              <w:rPr>
-                                <w:b/>
-                                <w:color w:val="7F7F7F" w:themeColor="text1" w:themeTint="80"/>
-                              </w:rPr>
-                            </w:pPr>
-                            <w:r>
-                              <w:rPr>
-                                <w:b/>
-                                <w:color w:val="7F7F7F" w:themeColor="text1" w:themeTint="80"/>
-                              </w:rPr>
-                              <w:t>Σελίδα τίτλου</w:t>
-                            </w:r>
-                          </w:p>
-                        </w:txbxContent>
-                      </wps:txbx>
-                      <wps:bodyPr rot="0" vert="horz" wrap="square" lIns="91440" tIns="45720" rIns="91440" bIns="45720" anchor="t" anchorCtr="0">
-                        <a:noAutofit/>
-                      </wps:bodyPr>
-                    </wps:wsp>
-                  </a:graphicData>
-                </a:graphic>
-                <wp14:sizeRelH relativeFrom="margin">
-                  <wp14:pctWidth>0</wp14:pctWidth>
-                </wp14:sizeRelH>
-                <wp14:sizeRelV relativeFrom="margin">
-                  <wp14:pctHeight>0</wp14:pctHeight>
-                </wp14:sizeRelV>
-              </wp:anchor>
-            </w:drawing>
-          </mc:Choice>
-          <mc:Fallback>
-            <w:pict>
-              <v:shapetype w14:anchorId="0582FA29" id="_x0000_t202" coordsize="21600,21600" o:spt="202" path="m,l,21600r21600,l21600,xe">
-                <v:stroke joinstyle="miter"/>
-                <v:path gradientshapeok="t" o:connecttype="rect"/>
-              </v:shapetype>
-              <v:shape id="Πλαίσιο κειμένου 2" o:spid="_x0000_s1026" type="#_x0000_t202" style="position:absolute;left:0;text-align:left;margin-left:-24.85pt;margin-top:-17.15pt;width:99.95pt;height:19.65pt;z-index:251661312;visibility:visible;mso-wrap-style:square;mso-width-percent:0;mso-height-percent:0;mso-wrap-distance-left:9pt;mso-wrap-distance-top:0;mso-wrap-distance-right:9pt;mso-wrap-distance-bottom:0;mso-position-horizontal:absolute;mso-position-horizontal-relative:text;mso-position-vertical:absolute;mso-position-vertical-relative:text;mso-width-percent:0;mso-height-percent:0;mso-width-relative:margin;mso-height-relative:margin;v-text-anchor:top" o:gfxdata="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">
-                <v:textbox>
-                  <w:txbxContent>
-                    <w:p>
-                      <w:pPr>
-                        <w:rPr>
-                          <w:b/>
-                          <w:color w:val="7F7F7F" w:themeColor="text1" w:themeTint="80"/>
-                        </w:rPr>
-                      </w:pPr>
-                      <w:r>
-                        <w:rPr>
-                          <w:b/>
-                          <w:color w:val="7F7F7F" w:themeColor="text1" w:themeTint="80"/>
-                        </w:rPr>
-                        <w:t>Σελίδα τίτλου</w:t>
-                      </w:r>
-                    </w:p>
-                  </w:txbxContent>
-                </v:textbox>
-              </v:shape>
-            </w:pict>
-          </mc:Fallback>
-        </mc:AlternateContent>
-      </w:r>
-      <w:r>
-        <w:rPr>
-          <w:rFonts w:cs="Times New Roman"/>
-          <w:noProof/>
-          <w:sz w:val="28"/>
-          <w:szCs w:val="28"/>
-          <w:lang w:eastAsia="el-GR"/>
-        </w:rPr>
         <w:drawing>
-          <wp:inline distT="0" distB="0" distL="0" distR="0" wp14:anchorId="4AE73F1D" wp14:editId="246D0E09">
+          <wp:inline distT="0" distB="0" distL="0" distR="0" wp14:anchorId="4AE73F1D" wp14:editId="6B3E18AC">
             <wp:extent cx="986400" cy="1490400"/>
             <wp:effectExtent l="0" t="0" r="4445" b="0"/>
             <wp:docPr id="2" name="Εικόνα 2"/>
@@ -1278,7 +1161,7 @@
         <w:contextualSpacing/>
         <w:rPr>
           <w:color w:val="auto"/>
-          <w:lang w:val="el-GR"/>
+          <w:lang w:val="en-US"/>
         </w:rPr>
       </w:pPr>
     </w:p>
@@ -1421,7 +1304,7 @@
           <w:lang w:val="en-US"/>
         </w:rPr>
       </w:pPr>
-      <w:bookmarkStart w:id="1" w:name="_Toc218709463"/>
+      <w:bookmarkStart w:id="1" w:name="_Toc220599722"/>
       <w:r>
         <w:rPr>
           <w:rFonts w:cs="Times New Roman"/>
@@ -1508,7 +1391,7 @@
           <w:lang w:val="en-US"/>
         </w:rPr>
       </w:pPr>
-      <w:bookmarkStart w:id="2" w:name="_Toc218709464"/>
+      <w:bookmarkStart w:id="2" w:name="_Toc220599723"/>
       <w:r>
         <w:rPr>
           <w:rFonts w:cs="Times New Roman"/>
@@ -1594,7 +1477,23 @@
           <w:szCs w:val="24"/>
           <w:lang w:val="en-US"/>
         </w:rPr>
-        <w:t xml:space="preserve">learning provides us with effective tools for detecting and preventing online toxicity with the use </w:t>
+        <w:t>learning</w:t>
+      </w:r>
+      <w:r>
+        <w:rPr>
+          <w:rFonts w:cs="Times New Roman"/>
+          <w:szCs w:val="24"/>
+          <w:lang w:val="en-US"/>
+        </w:rPr>
+        <w:t xml:space="preserve"> (ML)</w:t>
+      </w:r>
+      <w:r>
+        <w:rPr>
+          <w:rFonts w:cs="Times New Roman"/>
+          <w:szCs w:val="24"/>
+          <w:lang w:val="en-US"/>
+        </w:rPr>
+        <w:t xml:space="preserve"> provides us with effective tools for detecting and preventing online toxicity with the use </w:t>
       </w:r>
       <w:r>
         <w:rPr>
@@ -1912,7 +1811,7 @@
           <w:lang w:val="en-US"/>
         </w:rPr>
       </w:pPr>
-      <w:bookmarkStart w:id="3" w:name="_Toc218709465"/>
+      <w:bookmarkStart w:id="3" w:name="_Toc220599724"/>
       <w:r>
         <w:rPr>
           <w:rFonts w:cs="Times New Roman"/>
@@ -1990,12 +1889,13 @@
             </w:rPr>
             <w:fldChar w:fldCharType="separate"/>
           </w:r>
-          <w:hyperlink w:anchor="_Toc218709463" w:history="1">
+          <w:hyperlink w:anchor="_Toc220599722" w:history="1">
             <w:r>
               <w:rPr>
                 <w:rStyle w:val="Hyperlink"/>
                 <w:rFonts w:cs="Times New Roman"/>
                 <w:noProof/>
+                <w:lang w:val="en-US"/>
               </w:rPr>
               <w:t>ACKNOWLEDGMENTS</w:t>
             </w:r>
@@ -2018,7 +1918,7 @@
                 <w:noProof/>
                 <w:webHidden/>
               </w:rPr>
-              <w:instrText xml:space="preserve"> PAGEREF _Toc218709463 \h </w:instrText>
+              <w:instrText xml:space="preserve"> PAGEREF _Toc220599722 \h </w:instrText>
             </w:r>
             <w:r>
               <w:rPr>
@@ -2064,7 +1964,7 @@
               <w14:ligatures w14:val="standardContextual"/>
             </w:rPr>
           </w:pPr>
-          <w:hyperlink w:anchor="_Toc218709464" w:history="1">
+          <w:hyperlink w:anchor="_Toc220599723" w:history="1">
             <w:r>
               <w:rPr>
                 <w:rStyle w:val="Hyperlink"/>
@@ -2093,7 +1993,7 @@
                 <w:noProof/>
                 <w:webHidden/>
               </w:rPr>
-              <w:instrText xml:space="preserve"> PAGEREF _Toc218709464 \h </w:instrText>
+              <w:instrText xml:space="preserve"> PAGEREF _Toc220599723 \h </w:instrText>
             </w:r>
             <w:r>
               <w:rPr>
@@ -2139,7 +2039,7 @@
               <w14:ligatures w14:val="standardContextual"/>
             </w:rPr>
           </w:pPr>
-          <w:hyperlink w:anchor="_Toc218709465" w:history="1">
+          <w:hyperlink w:anchor="_Toc220599724" w:history="1">
             <w:r>
               <w:rPr>
                 <w:rStyle w:val="Hyperlink"/>
@@ -2168,7 +2068,7 @@
                 <w:noProof/>
                 <w:webHidden/>
               </w:rPr>
-              <w:instrText xml:space="preserve"> PAGEREF _Toc218709465 \h </w:instrText>
+              <w:instrText xml:space="preserve"> PAGEREF _Toc220599724 \h </w:instrText>
             </w:r>
             <w:r>
               <w:rPr>
@@ -2214,7 +2114,7 @@
               <w14:ligatures w14:val="standardContextual"/>
             </w:rPr>
           </w:pPr>
-          <w:hyperlink w:anchor="_Toc218709466" w:history="1">
+          <w:hyperlink w:anchor="_Toc220599725" w:history="1">
             <w:r>
               <w:rPr>
                 <w:rStyle w:val="Hyperlink"/>
@@ -2243,7 +2143,7 @@
                 <w:noProof/>
                 <w:webHidden/>
               </w:rPr>
-              <w:instrText xml:space="preserve"> PAGEREF _Toc218709466 \h </w:instrText>
+              <w:instrText xml:space="preserve"> PAGEREF _Toc220599725 \h </w:instrText>
             </w:r>
             <w:r>
               <w:rPr>
@@ -2289,7 +2189,7 @@
               <w14:ligatures w14:val="standardContextual"/>
             </w:rPr>
           </w:pPr>
-          <w:hyperlink w:anchor="_Toc218709467" w:history="1">
+          <w:hyperlink w:anchor="_Toc220599726" w:history="1">
             <w:r>
               <w:rPr>
                 <w:rStyle w:val="Hyperlink"/>
@@ -2318,7 +2218,7 @@
                 <w:noProof/>
                 <w:webHidden/>
               </w:rPr>
-              <w:instrText xml:space="preserve"> PAGEREF _Toc218709467 \h </w:instrText>
+              <w:instrText xml:space="preserve"> PAGEREF _Toc220599726 \h </w:instrText>
             </w:r>
             <w:r>
               <w:rPr>
@@ -2364,7 +2264,7 @@
               <w14:ligatures w14:val="standardContextual"/>
             </w:rPr>
           </w:pPr>
-          <w:hyperlink w:anchor="_Toc218709468" w:history="1">
+          <w:hyperlink w:anchor="_Toc220599727" w:history="1">
             <w:r>
               <w:rPr>
                 <w:rStyle w:val="Hyperlink"/>
@@ -2392,7 +2292,7 @@
                 <w:noProof/>
                 <w:webHidden/>
               </w:rPr>
-              <w:instrText xml:space="preserve"> PAGEREF _Toc218709468 \h </w:instrText>
+              <w:instrText xml:space="preserve"> PAGEREF _Toc220599727 \h </w:instrText>
             </w:r>
             <w:r>
               <w:rPr>
@@ -2438,7 +2338,7 @@
               <w14:ligatures w14:val="standardContextual"/>
             </w:rPr>
           </w:pPr>
-          <w:hyperlink w:anchor="_Toc218709469" w:history="1">
+          <w:hyperlink w:anchor="_Toc220599728" w:history="1">
             <w:r>
               <w:rPr>
                 <w:rStyle w:val="Hyperlink"/>
@@ -2467,7 +2367,7 @@
                 <w:noProof/>
                 <w:webHidden/>
               </w:rPr>
-              <w:instrText xml:space="preserve"> PAGEREF _Toc218709469 \h </w:instrText>
+              <w:instrText xml:space="preserve"> PAGEREF _Toc220599728 \h </w:instrText>
             </w:r>
             <w:r>
               <w:rPr>
@@ -2513,7 +2413,7 @@
               <w14:ligatures w14:val="standardContextual"/>
             </w:rPr>
           </w:pPr>
-          <w:hyperlink w:anchor="_Toc218709470" w:history="1">
+          <w:hyperlink w:anchor="_Toc220599729" w:history="1">
             <w:r>
               <w:rPr>
                 <w:rStyle w:val="Hyperlink"/>
@@ -2542,7 +2442,7 @@
                 <w:noProof/>
                 <w:webHidden/>
               </w:rPr>
-              <w:instrText xml:space="preserve"> PAGEREF _Toc218709470 \h </w:instrText>
+              <w:instrText xml:space="preserve"> PAGEREF _Toc220599729 \h </w:instrText>
             </w:r>
             <w:r>
               <w:rPr>
@@ -2588,7 +2488,7 @@
               <w14:ligatures w14:val="standardContextual"/>
             </w:rPr>
           </w:pPr>
-          <w:hyperlink w:anchor="_Toc218709471" w:history="1">
+          <w:hyperlink w:anchor="_Toc220599730" w:history="1">
             <w:r>
               <w:rPr>
                 <w:rStyle w:val="Hyperlink"/>
@@ -2616,7 +2516,7 @@
                 <w:noProof/>
                 <w:webHidden/>
               </w:rPr>
-              <w:instrText xml:space="preserve"> PAGEREF _Toc218709471 \h </w:instrText>
+              <w:instrText xml:space="preserve"> PAGEREF _Toc220599730 \h </w:instrText>
             </w:r>
             <w:r>
               <w:rPr>
@@ -2662,7 +2562,7 @@
               <w14:ligatures w14:val="standardContextual"/>
             </w:rPr>
           </w:pPr>
-          <w:hyperlink w:anchor="_Toc218709472" w:history="1">
+          <w:hyperlink w:anchor="_Toc220599731" w:history="1">
             <w:r>
               <w:rPr>
                 <w:rStyle w:val="Hyperlink"/>
@@ -2690,7 +2590,7 @@
                 <w:noProof/>
                 <w:webHidden/>
               </w:rPr>
-              <w:instrText xml:space="preserve"> PAGEREF _Toc218709472 \h </w:instrText>
+              <w:instrText xml:space="preserve"> PAGEREF _Toc220599731 \h </w:instrText>
             </w:r>
             <w:r>
               <w:rPr>
@@ -2736,7 +2636,7 @@
               <w14:ligatures w14:val="standardContextual"/>
             </w:rPr>
           </w:pPr>
-          <w:hyperlink w:anchor="_Toc218709473" w:history="1">
+          <w:hyperlink w:anchor="_Toc220599732" w:history="1">
             <w:r>
               <w:rPr>
                 <w:rStyle w:val="Hyperlink"/>
@@ -2765,7 +2665,7 @@
                 <w:noProof/>
                 <w:webHidden/>
               </w:rPr>
-              <w:instrText xml:space="preserve"> PAGEREF _Toc218709473 \h </w:instrText>
+              <w:instrText xml:space="preserve"> PAGEREF _Toc220599732 \h </w:instrText>
             </w:r>
             <w:r>
               <w:rPr>
@@ -2811,7 +2711,7 @@
               <w14:ligatures w14:val="standardContextual"/>
             </w:rPr>
           </w:pPr>
-          <w:hyperlink w:anchor="_Toc218709474" w:history="1">
+          <w:hyperlink w:anchor="_Toc220599733" w:history="1">
             <w:r>
               <w:rPr>
                 <w:rStyle w:val="Hyperlink"/>
@@ -2840,7 +2740,7 @@
                 <w:noProof/>
                 <w:webHidden/>
               </w:rPr>
-              <w:instrText xml:space="preserve"> PAGEREF _Toc218709474 \h </w:instrText>
+              <w:instrText xml:space="preserve"> PAGEREF _Toc220599733 \h </w:instrText>
             </w:r>
             <w:r>
               <w:rPr>
@@ -2886,7 +2786,7 @@
               <w14:ligatures w14:val="standardContextual"/>
             </w:rPr>
           </w:pPr>
-          <w:hyperlink w:anchor="_Toc218709475" w:history="1">
+          <w:hyperlink w:anchor="_Toc220599734" w:history="1">
             <w:r>
               <w:rPr>
                 <w:rStyle w:val="Hyperlink"/>
@@ -2915,7 +2815,7 @@
                 <w:noProof/>
                 <w:webHidden/>
               </w:rPr>
-              <w:instrText xml:space="preserve"> PAGEREF _Toc218709475 \h </w:instrText>
+              <w:instrText xml:space="preserve"> PAGEREF _Toc220599734 \h </w:instrText>
             </w:r>
             <w:r>
               <w:rPr>
@@ -2961,7 +2861,7 @@
               <w14:ligatures w14:val="standardContextual"/>
             </w:rPr>
           </w:pPr>
-          <w:hyperlink w:anchor="_Toc218709476" w:history="1">
+          <w:hyperlink w:anchor="_Toc220599735" w:history="1">
             <w:r>
               <w:rPr>
                 <w:rStyle w:val="Hyperlink"/>
@@ -2990,7 +2890,7 @@
                 <w:noProof/>
                 <w:webHidden/>
               </w:rPr>
-              <w:instrText xml:space="preserve"> PAGEREF _Toc218709476 \h </w:instrText>
+              <w:instrText xml:space="preserve"> PAGEREF _Toc220599735 \h </w:instrText>
             </w:r>
             <w:r>
               <w:rPr>
@@ -3036,7 +2936,7 @@
               <w14:ligatures w14:val="standardContextual"/>
             </w:rPr>
           </w:pPr>
-          <w:hyperlink w:anchor="_Toc218709477" w:history="1">
+          <w:hyperlink w:anchor="_Toc220599736" w:history="1">
             <w:r>
               <w:rPr>
                 <w:rStyle w:val="Hyperlink"/>
@@ -3065,7 +2965,7 @@
                 <w:noProof/>
                 <w:webHidden/>
               </w:rPr>
-              <w:instrText xml:space="preserve"> PAGEREF _Toc218709477 \h </w:instrText>
+              <w:instrText xml:space="preserve"> PAGEREF _Toc220599736 \h </w:instrText>
             </w:r>
             <w:r>
               <w:rPr>
@@ -3111,7 +3011,7 @@
               <w14:ligatures w14:val="standardContextual"/>
             </w:rPr>
           </w:pPr>
-          <w:hyperlink w:anchor="_Toc218709478" w:history="1">
+          <w:hyperlink w:anchor="_Toc220599737" w:history="1">
             <w:r>
               <w:rPr>
                 <w:rStyle w:val="Hyperlink"/>
@@ -3139,7 +3039,7 @@
                 <w:noProof/>
                 <w:webHidden/>
               </w:rPr>
-              <w:instrText xml:space="preserve"> PAGEREF _Toc218709478 \h </w:instrText>
+              <w:instrText xml:space="preserve"> PAGEREF _Toc220599737 \h </w:instrText>
             </w:r>
             <w:r>
               <w:rPr>
@@ -3185,7 +3085,7 @@
               <w14:ligatures w14:val="standardContextual"/>
             </w:rPr>
           </w:pPr>
-          <w:hyperlink w:anchor="_Toc218709479" w:history="1">
+          <w:hyperlink w:anchor="_Toc220599738" w:history="1">
             <w:r>
               <w:rPr>
                 <w:rStyle w:val="Hyperlink"/>
@@ -3213,7 +3113,7 @@
                 <w:noProof/>
                 <w:webHidden/>
               </w:rPr>
-              <w:instrText xml:space="preserve"> PAGEREF _Toc218709479 \h </w:instrText>
+              <w:instrText xml:space="preserve"> PAGEREF _Toc220599738 \h </w:instrText>
             </w:r>
             <w:r>
               <w:rPr>
@@ -3259,7 +3159,7 @@
               <w14:ligatures w14:val="standardContextual"/>
             </w:rPr>
           </w:pPr>
-          <w:hyperlink w:anchor="_Toc218709480" w:history="1">
+          <w:hyperlink w:anchor="_Toc220599739" w:history="1">
             <w:r>
               <w:rPr>
                 <w:rStyle w:val="Hyperlink"/>
@@ -3287,7 +3187,7 @@
                 <w:noProof/>
                 <w:webHidden/>
               </w:rPr>
-              <w:instrText xml:space="preserve"> PAGEREF _Toc218709480 \h </w:instrText>
+              <w:instrText xml:space="preserve"> PAGEREF _Toc220599739 \h </w:instrText>
             </w:r>
             <w:r>
               <w:rPr>
@@ -3333,7 +3233,7 @@
               <w14:ligatures w14:val="standardContextual"/>
             </w:rPr>
           </w:pPr>
-          <w:hyperlink w:anchor="_Toc218709481" w:history="1">
+          <w:hyperlink w:anchor="_Toc220599740" w:history="1">
             <w:r>
               <w:rPr>
                 <w:rStyle w:val="Hyperlink"/>
@@ -3361,7 +3261,7 @@
                 <w:noProof/>
                 <w:webHidden/>
               </w:rPr>
-              <w:instrText xml:space="preserve"> PAGEREF _Toc218709481 \h </w:instrText>
+              <w:instrText xml:space="preserve"> PAGEREF _Toc220599740 \h </w:instrText>
             </w:r>
             <w:r>
               <w:rPr>
@@ -3381,7 +3281,7 @@
                 <w:noProof/>
                 <w:webHidden/>
               </w:rPr>
-              <w:t>21</w:t>
+              <w:t>22</w:t>
             </w:r>
             <w:r>
               <w:rPr>
@@ -3407,7 +3307,7 @@
               <w14:ligatures w14:val="standardContextual"/>
             </w:rPr>
           </w:pPr>
-          <w:hyperlink w:anchor="_Toc218709482" w:history="1">
+          <w:hyperlink w:anchor="_Toc220599741" w:history="1">
             <w:r>
               <w:rPr>
                 <w:rStyle w:val="Hyperlink"/>
@@ -3435,7 +3335,7 @@
                 <w:noProof/>
                 <w:webHidden/>
               </w:rPr>
-              <w:instrText xml:space="preserve"> PAGEREF _Toc218709482 \h </w:instrText>
+              <w:instrText xml:space="preserve"> PAGEREF _Toc220599741 \h </w:instrText>
             </w:r>
             <w:r>
               <w:rPr>
@@ -3455,7 +3355,7 @@
                 <w:noProof/>
                 <w:webHidden/>
               </w:rPr>
-              <w:t>21</w:t>
+              <w:t>22</w:t>
             </w:r>
             <w:r>
               <w:rPr>
@@ -3481,7 +3381,7 @@
               <w14:ligatures w14:val="standardContextual"/>
             </w:rPr>
           </w:pPr>
-          <w:hyperlink w:anchor="_Toc218709483" w:history="1">
+          <w:hyperlink w:anchor="_Toc220599742" w:history="1">
             <w:r>
               <w:rPr>
                 <w:rStyle w:val="Hyperlink"/>
@@ -3509,7 +3409,7 @@
                 <w:noProof/>
                 <w:webHidden/>
               </w:rPr>
-              <w:instrText xml:space="preserve"> PAGEREF _Toc218709483 \h </w:instrText>
+              <w:instrText xml:space="preserve"> PAGEREF _Toc220599742 \h </w:instrText>
             </w:r>
             <w:r>
               <w:rPr>
@@ -3529,7 +3429,7 @@
                 <w:noProof/>
                 <w:webHidden/>
               </w:rPr>
-              <w:t>22</w:t>
+              <w:t>23</w:t>
             </w:r>
             <w:r>
               <w:rPr>
@@ -3555,7 +3455,7 @@
               <w14:ligatures w14:val="standardContextual"/>
             </w:rPr>
           </w:pPr>
-          <w:hyperlink w:anchor="_Toc218709484" w:history="1">
+          <w:hyperlink w:anchor="_Toc220599743" w:history="1">
             <w:r>
               <w:rPr>
                 <w:rStyle w:val="Hyperlink"/>
@@ -3583,7 +3483,7 @@
                 <w:noProof/>
                 <w:webHidden/>
               </w:rPr>
-              <w:instrText xml:space="preserve"> PAGEREF _Toc218709484 \h </w:instrText>
+              <w:instrText xml:space="preserve"> PAGEREF _Toc220599743 \h </w:instrText>
             </w:r>
             <w:r>
               <w:rPr>
@@ -3629,7 +3529,7 @@
               <w14:ligatures w14:val="standardContextual"/>
             </w:rPr>
           </w:pPr>
-          <w:hyperlink w:anchor="_Toc218709485" w:history="1">
+          <w:hyperlink w:anchor="_Toc220599744" w:history="1">
             <w:r>
               <w:rPr>
                 <w:rStyle w:val="Hyperlink"/>
@@ -3657,7 +3557,7 @@
                 <w:noProof/>
                 <w:webHidden/>
               </w:rPr>
-              <w:instrText xml:space="preserve"> PAGEREF _Toc218709485 \h </w:instrText>
+              <w:instrText xml:space="preserve"> PAGEREF _Toc220599744 \h </w:instrText>
             </w:r>
             <w:r>
               <w:rPr>
@@ -3677,7 +3577,7 @@
                 <w:noProof/>
                 <w:webHidden/>
               </w:rPr>
-              <w:t>23</w:t>
+              <w:t>24</w:t>
             </w:r>
             <w:r>
               <w:rPr>
@@ -3703,7 +3603,7 @@
               <w14:ligatures w14:val="standardContextual"/>
             </w:rPr>
           </w:pPr>
-          <w:hyperlink w:anchor="_Toc218709486" w:history="1">
+          <w:hyperlink w:anchor="_Toc220599745" w:history="1">
             <w:r>
               <w:rPr>
                 <w:rStyle w:val="Hyperlink"/>
@@ -3731,7 +3631,7 @@
                 <w:noProof/>
                 <w:webHidden/>
               </w:rPr>
-              <w:instrText xml:space="preserve"> PAGEREF _Toc218709486 \h </w:instrText>
+              <w:instrText xml:space="preserve"> PAGEREF _Toc220599745 \h </w:instrText>
             </w:r>
             <w:r>
               <w:rPr>
@@ -3777,7 +3677,7 @@
               <w14:ligatures w14:val="standardContextual"/>
             </w:rPr>
           </w:pPr>
-          <w:hyperlink w:anchor="_Toc218709487" w:history="1">
+          <w:hyperlink w:anchor="_Toc220599746" w:history="1">
             <w:r>
               <w:rPr>
                 <w:rStyle w:val="Hyperlink"/>
@@ -3805,7 +3705,7 @@
                 <w:noProof/>
                 <w:webHidden/>
               </w:rPr>
-              <w:instrText xml:space="preserve"> PAGEREF _Toc218709487 \h </w:instrText>
+              <w:instrText xml:space="preserve"> PAGEREF _Toc220599746 \h </w:instrText>
             </w:r>
             <w:r>
               <w:rPr>
@@ -3851,7 +3751,7 @@
               <w14:ligatures w14:val="standardContextual"/>
             </w:rPr>
           </w:pPr>
-          <w:hyperlink w:anchor="_Toc218709488" w:history="1">
+          <w:hyperlink w:anchor="_Toc220599747" w:history="1">
             <w:r>
               <w:rPr>
                 <w:rStyle w:val="Hyperlink"/>
@@ -3879,7 +3779,7 @@
                 <w:noProof/>
                 <w:webHidden/>
               </w:rPr>
-              <w:instrText xml:space="preserve"> PAGEREF _Toc218709488 \h </w:instrText>
+              <w:instrText xml:space="preserve"> PAGEREF _Toc220599747 \h </w:instrText>
             </w:r>
             <w:r>
               <w:rPr>
@@ -3925,7 +3825,7 @@
               <w14:ligatures w14:val="standardContextual"/>
             </w:rPr>
           </w:pPr>
-          <w:hyperlink w:anchor="_Toc218709489" w:history="1">
+          <w:hyperlink w:anchor="_Toc220599748" w:history="1">
             <w:r>
               <w:rPr>
                 <w:rStyle w:val="Hyperlink"/>
@@ -3953,7 +3853,7 @@
                 <w:noProof/>
                 <w:webHidden/>
               </w:rPr>
-              <w:instrText xml:space="preserve"> PAGEREF _Toc218709489 \h </w:instrText>
+              <w:instrText xml:space="preserve"> PAGEREF _Toc220599748 \h </w:instrText>
             </w:r>
             <w:r>
               <w:rPr>
@@ -3999,7 +3899,7 @@
               <w14:ligatures w14:val="standardContextual"/>
             </w:rPr>
           </w:pPr>
-          <w:hyperlink w:anchor="_Toc218709490" w:history="1">
+          <w:hyperlink w:anchor="_Toc220599749" w:history="1">
             <w:r>
               <w:rPr>
                 <w:rStyle w:val="Hyperlink"/>
@@ -4027,7 +3927,7 @@
                 <w:noProof/>
                 <w:webHidden/>
               </w:rPr>
-              <w:instrText xml:space="preserve"> PAGEREF _Toc218709490 \h </w:instrText>
+              <w:instrText xml:space="preserve"> PAGEREF _Toc220599749 \h </w:instrText>
             </w:r>
             <w:r>
               <w:rPr>
@@ -4073,7 +3973,7 @@
               <w14:ligatures w14:val="standardContextual"/>
             </w:rPr>
           </w:pPr>
-          <w:hyperlink w:anchor="_Toc218709491" w:history="1">
+          <w:hyperlink w:anchor="_Toc220599750" w:history="1">
             <w:r>
               <w:rPr>
                 <w:rStyle w:val="Hyperlink"/>
@@ -4101,7 +4001,7 @@
                 <w:noProof/>
                 <w:webHidden/>
               </w:rPr>
-              <w:instrText xml:space="preserve"> PAGEREF _Toc218709491 \h </w:instrText>
+              <w:instrText xml:space="preserve"> PAGEREF _Toc220599750 \h </w:instrText>
             </w:r>
             <w:r>
               <w:rPr>
@@ -4147,7 +4047,7 @@
               <w14:ligatures w14:val="standardContextual"/>
             </w:rPr>
           </w:pPr>
-          <w:hyperlink w:anchor="_Toc218709492" w:history="1">
+          <w:hyperlink w:anchor="_Toc220599751" w:history="1">
             <w:r>
               <w:rPr>
                 <w:rStyle w:val="Hyperlink"/>
@@ -4175,7 +4075,7 @@
                 <w:noProof/>
                 <w:webHidden/>
               </w:rPr>
-              <w:instrText xml:space="preserve"> PAGEREF _Toc218709492 \h </w:instrText>
+              <w:instrText xml:space="preserve"> PAGEREF _Toc220599751 \h </w:instrText>
             </w:r>
             <w:r>
               <w:rPr>
@@ -4221,7 +4121,7 @@
               <w14:ligatures w14:val="standardContextual"/>
             </w:rPr>
           </w:pPr>
-          <w:hyperlink w:anchor="_Toc218709493" w:history="1">
+          <w:hyperlink w:anchor="_Toc220599752" w:history="1">
             <w:r>
               <w:rPr>
                 <w:rStyle w:val="Hyperlink"/>
@@ -4249,7 +4149,7 @@
                 <w:noProof/>
                 <w:webHidden/>
               </w:rPr>
-              <w:instrText xml:space="preserve"> PAGEREF _Toc218709493 \h </w:instrText>
+              <w:instrText xml:space="preserve"> PAGEREF _Toc220599752 \h </w:instrText>
             </w:r>
             <w:r>
               <w:rPr>
@@ -4295,7 +4195,7 @@
               <w14:ligatures w14:val="standardContextual"/>
             </w:rPr>
           </w:pPr>
-          <w:hyperlink w:anchor="_Toc218709494" w:history="1">
+          <w:hyperlink w:anchor="_Toc220599753" w:history="1">
             <w:r>
               <w:rPr>
                 <w:rStyle w:val="Hyperlink"/>
@@ -4323,7 +4223,7 @@
                 <w:noProof/>
                 <w:webHidden/>
               </w:rPr>
-              <w:instrText xml:space="preserve"> PAGEREF _Toc218709494 \h </w:instrText>
+              <w:instrText xml:space="preserve"> PAGEREF _Toc220599753 \h </w:instrText>
             </w:r>
             <w:r>
               <w:rPr>
@@ -4369,7 +4269,7 @@
               <w14:ligatures w14:val="standardContextual"/>
             </w:rPr>
           </w:pPr>
-          <w:hyperlink w:anchor="_Toc218709495" w:history="1">
+          <w:hyperlink w:anchor="_Toc220599754" w:history="1">
             <w:r>
               <w:rPr>
                 <w:rStyle w:val="Hyperlink"/>
@@ -4397,7 +4297,7 @@
                 <w:noProof/>
                 <w:webHidden/>
               </w:rPr>
-              <w:instrText xml:space="preserve"> PAGEREF _Toc218709495 \h </w:instrText>
+              <w:instrText xml:space="preserve"> PAGEREF _Toc220599754 \h </w:instrText>
             </w:r>
             <w:r>
               <w:rPr>
@@ -4417,7 +4317,7 @@
                 <w:noProof/>
                 <w:webHidden/>
               </w:rPr>
-              <w:t>31</w:t>
+              <w:t>30</w:t>
             </w:r>
             <w:r>
               <w:rPr>
@@ -4443,7 +4343,7 @@
               <w14:ligatures w14:val="standardContextual"/>
             </w:rPr>
           </w:pPr>
-          <w:hyperlink w:anchor="_Toc218709496" w:history="1">
+          <w:hyperlink w:anchor="_Toc220599755" w:history="1">
             <w:r>
               <w:rPr>
                 <w:rStyle w:val="Hyperlink"/>
@@ -4471,7 +4371,7 @@
                 <w:noProof/>
                 <w:webHidden/>
               </w:rPr>
-              <w:instrText xml:space="preserve"> PAGEREF _Toc218709496 \h </w:instrText>
+              <w:instrText xml:space="preserve"> PAGEREF _Toc220599755 \h </w:instrText>
             </w:r>
             <w:r>
               <w:rPr>
@@ -4517,7 +4417,7 @@
               <w14:ligatures w14:val="standardContextual"/>
             </w:rPr>
           </w:pPr>
-          <w:hyperlink w:anchor="_Toc218709497" w:history="1">
+          <w:hyperlink w:anchor="_Toc220599756" w:history="1">
             <w:r>
               <w:rPr>
                 <w:rStyle w:val="Hyperlink"/>
@@ -4545,7 +4445,7 @@
                 <w:noProof/>
                 <w:webHidden/>
               </w:rPr>
-              <w:instrText xml:space="preserve"> PAGEREF _Toc218709497 \h </w:instrText>
+              <w:instrText xml:space="preserve"> PAGEREF _Toc220599756 \h </w:instrText>
             </w:r>
             <w:r>
               <w:rPr>
@@ -4591,7 +4491,7 @@
               <w14:ligatures w14:val="standardContextual"/>
             </w:rPr>
           </w:pPr>
-          <w:hyperlink w:anchor="_Toc218709498" w:history="1">
+          <w:hyperlink w:anchor="_Toc220599757" w:history="1">
             <w:r>
               <w:rPr>
                 <w:rStyle w:val="Hyperlink"/>
@@ -4619,7 +4519,7 @@
                 <w:noProof/>
                 <w:webHidden/>
               </w:rPr>
-              <w:instrText xml:space="preserve"> PAGEREF _Toc218709498 \h </w:instrText>
+              <w:instrText xml:space="preserve"> PAGEREF _Toc220599757 \h </w:instrText>
             </w:r>
             <w:r>
               <w:rPr>
@@ -4639,7 +4539,7 @@
                 <w:noProof/>
                 <w:webHidden/>
               </w:rPr>
-              <w:t>32</w:t>
+              <w:t>31</w:t>
             </w:r>
             <w:r>
               <w:rPr>
@@ -4665,7 +4565,7 @@
               <w14:ligatures w14:val="standardContextual"/>
             </w:rPr>
           </w:pPr>
-          <w:hyperlink w:anchor="_Toc218709499" w:history="1">
+          <w:hyperlink w:anchor="_Toc220599758" w:history="1">
             <w:r>
               <w:rPr>
                 <w:rStyle w:val="Hyperlink"/>
@@ -4694,7 +4594,7 @@
                 <w:noProof/>
                 <w:webHidden/>
               </w:rPr>
-              <w:instrText xml:space="preserve"> PAGEREF _Toc218709499 \h </w:instrText>
+              <w:instrText xml:space="preserve"> PAGEREF _Toc220599758 \h </w:instrText>
             </w:r>
             <w:r>
               <w:rPr>
@@ -4714,7 +4614,7 @@
                 <w:noProof/>
                 <w:webHidden/>
               </w:rPr>
-              <w:t>33</w:t>
+              <w:t>32</w:t>
             </w:r>
             <w:r>
               <w:rPr>
@@ -4777,7 +4677,7 @@
           <w:lang w:val="en-US"/>
         </w:rPr>
       </w:pPr>
-      <w:bookmarkStart w:id="4" w:name="_Toc218709466"/>
+      <w:bookmarkStart w:id="4" w:name="_Toc220599725"/>
       <w:r>
         <w:rPr>
           <w:rFonts w:cs="Times New Roman"/>
@@ -4799,6 +4699,24 @@
           <w:lang w:val="en-US"/>
         </w:rPr>
       </w:pPr>
+    </w:p>
+    <w:p>
+      <w:pPr>
+        <w:ind w:right="282"/>
+        <w:rPr>
+          <w:rFonts w:cs="Times New Roman"/>
+          <w:szCs w:val="24"/>
+          <w:lang w:val="en-US"/>
+        </w:rPr>
+      </w:pPr>
+      <w:r>
+        <w:rPr>
+          <w:rFonts w:cs="Times New Roman"/>
+          <w:szCs w:val="24"/>
+          <w:lang w:val="en-US"/>
+        </w:rPr>
+        <w:t>ML………………………………………………………………………..Machine Learning</w:t>
+      </w:r>
     </w:p>
     <w:p>
       <w:pPr>
@@ -5085,7 +5003,7 @@
           <w:lang w:val="en-US"/>
         </w:rPr>
       </w:pPr>
-      <w:bookmarkStart w:id="5" w:name="_Toc218709467"/>
+      <w:bookmarkStart w:id="5" w:name="_Toc220599726"/>
       <w:r>
         <w:rPr>
           <w:rFonts w:cs="Times New Roman"/>
@@ -5691,7 +5609,7 @@
           <w:lang w:val="en-US"/>
         </w:rPr>
       </w:pPr>
-      <w:bookmarkStart w:id="6" w:name="_Toc218709468"/>
+      <w:bookmarkStart w:id="6" w:name="_Toc220599727"/>
       <w:r>
         <w:rPr>
           <w:lang w:val="en-US"/>
@@ -5728,7 +5646,7 @@
           <w:lang w:val="en-US"/>
         </w:rPr>
       </w:pPr>
-      <w:bookmarkStart w:id="7" w:name="_Toc218709469"/>
+      <w:bookmarkStart w:id="7" w:name="_Toc220599728"/>
       <w:r>
         <w:rPr>
           <w:rFonts w:cs="Times New Roman"/>
@@ -5814,7 +5732,7 @@
         <w:rPr>
           <w:lang w:val="en-US"/>
         </w:rPr>
-        <w:t xml:space="preserve"> may experience a decrease in their psychological health according to research by </w:t>
+        <w:t xml:space="preserve"> may experience a decrease in their psychological health </w:t>
       </w:r>
       <w:sdt>
         <w:sdtPr>
@@ -5878,7 +5796,7 @@
           <w:lang w:val="en-US"/>
         </w:rPr>
       </w:pPr>
-      <w:bookmarkStart w:id="8" w:name="_Toc218709470"/>
+      <w:bookmarkStart w:id="8" w:name="_Toc220599729"/>
       <w:r>
         <w:rPr>
           <w:rFonts w:cs="Times New Roman"/>
@@ -6216,23 +6134,7 @@
           <w:szCs w:val="24"/>
           <w:lang w:val="en"/>
         </w:rPr>
-        <w:t>, a special dataset was developed for detecting toxicity in the Greek language with 4,779 Greek toxic and non-toxic tweets (OGTD).</w:t>
-      </w:r>
-      <w:r>
-        <w:rPr>
-          <w:rFonts w:cs="Times New Roman"/>
-          <w:szCs w:val="24"/>
-          <w:lang w:val="en-US"/>
-        </w:rPr>
-        <w:t xml:space="preserve"> </w:t>
-      </w:r>
-      <w:r>
-        <w:rPr>
-          <w:rFonts w:cs="Times New Roman"/>
-          <w:szCs w:val="24"/>
-          <w:lang w:val="en"/>
-        </w:rPr>
-        <w:t xml:space="preserve">The thesis “Toxicity Detection on Greek Tweets” </w:t>
+        <w:t>, a special dataset was developed for detecting toxicity in the Greek language with 4,779 Greek toxic and non-toxic tweets (OGTD)</w:t>
       </w:r>
       <w:sdt>
         <w:sdtPr>
@@ -6241,7 +6143,7 @@
             <w:szCs w:val="24"/>
             <w:lang w:val="en"/>
           </w:rPr>
-          <w:id w:val="358554153"/>
+          <w:id w:val="-1188360160"/>
           <w:citation/>
         </w:sdtPr>
         <w:sdtContent>
@@ -6259,7 +6161,7 @@
               <w:szCs w:val="24"/>
               <w:lang w:val="en-US"/>
             </w:rPr>
-            <w:instrText xml:space="preserve">CITATION Ana21 \l 1033 </w:instrText>
+            <w:instrText xml:space="preserve"> CITATION Zes20 \l 1033 </w:instrText>
           </w:r>
           <w:r>
             <w:rPr>
@@ -6276,7 +6178,16 @@
               <w:szCs w:val="24"/>
               <w:lang w:val="en-US"/>
             </w:rPr>
-            <w:t>(Anagnostopoulos, 2021)</w:t>
+            <w:t xml:space="preserve"> </w:t>
+          </w:r>
+          <w:r>
+            <w:rPr>
+              <w:rFonts w:cs="Times New Roman"/>
+              <w:noProof/>
+              <w:szCs w:val="24"/>
+              <w:lang w:val="en-US"/>
+            </w:rPr>
+            <w:t>(Pitenis, Zampieri, &amp; Ranasinghe, 2020)</w:t>
           </w:r>
           <w:r>
             <w:rPr>
@@ -6294,6 +6205,14 @@
           <w:szCs w:val="24"/>
           <w:lang w:val="en"/>
         </w:rPr>
+        <w:t>.</w:t>
+      </w:r>
+      <w:r>
+        <w:rPr>
+          <w:rFonts w:cs="Times New Roman"/>
+          <w:szCs w:val="24"/>
+          <w:lang w:val="en-US"/>
+        </w:rPr>
         <w:t xml:space="preserve"> </w:t>
       </w:r>
       <w:r>
@@ -6302,7 +6221,7 @@
           <w:szCs w:val="24"/>
           <w:lang w:val="en"/>
         </w:rPr>
-        <w:t>used OGTD for this specific project as well as the Palo Toxicity and Sentiment Dataset (PTSD) provided by PALOServices, which consists of 1,452 samples and includes deeper categorization such as toxicity type, sentiment, and assessment.</w:t>
+        <w:t>The thesis “Toxicity Detection on Greek Tweets” used OGTD for this specific project as well as the Palo Toxicity and Sentiment Dataset (PTSD) provided by PALOServices, which consists of 1,452 samples and includes deeper categorization such as toxicity type, sentiment, and assessment.</w:t>
       </w:r>
       <w:r>
         <w:rPr>
@@ -6406,7 +6325,78 @@
           <w:szCs w:val="24"/>
           <w:lang w:val="en"/>
         </w:rPr>
-        <w:t>In these three studies, it is observed that the most popular technology is deep learning models, with the work “Offensive Language Identification in Greek” also using traditional machine learning as a basic method for comparison.</w:t>
+        <w:t>In these three studies, it is observed that the most popular technology is deep learning models, with the work “Offensive Language Identification in Greek”</w:t>
+      </w:r>
+      <w:sdt>
+        <w:sdtPr>
+          <w:rPr>
+            <w:rFonts w:cs="Times New Roman"/>
+            <w:szCs w:val="24"/>
+            <w:lang w:val="en"/>
+          </w:rPr>
+          <w:id w:val="-1872691459"/>
+          <w:citation/>
+        </w:sdtPr>
+        <w:sdtContent>
+          <w:r>
+            <w:rPr>
+              <w:rFonts w:cs="Times New Roman"/>
+              <w:szCs w:val="24"/>
+              <w:lang w:val="en"/>
+            </w:rPr>
+            <w:fldChar w:fldCharType="begin"/>
+          </w:r>
+          <w:r>
+            <w:rPr>
+              <w:rFonts w:cs="Times New Roman"/>
+              <w:szCs w:val="24"/>
+              <w:lang w:val="en-US"/>
+            </w:rPr>
+            <w:instrText xml:space="preserve"> CITATION Zes20 \l 1033 </w:instrText>
+          </w:r>
+          <w:r>
+            <w:rPr>
+              <w:rFonts w:cs="Times New Roman"/>
+              <w:szCs w:val="24"/>
+              <w:lang w:val="en"/>
+            </w:rPr>
+            <w:fldChar w:fldCharType="separate"/>
+          </w:r>
+          <w:r>
+            <w:rPr>
+              <w:rFonts w:cs="Times New Roman"/>
+              <w:noProof/>
+              <w:szCs w:val="24"/>
+              <w:lang w:val="en-US"/>
+            </w:rPr>
+            <w:t xml:space="preserve"> </w:t>
+          </w:r>
+          <w:r>
+            <w:rPr>
+              <w:rFonts w:cs="Times New Roman"/>
+              <w:noProof/>
+              <w:szCs w:val="24"/>
+              <w:lang w:val="en-US"/>
+            </w:rPr>
+            <w:t>(Pitenis, Zampieri, &amp; Ranasinghe, 2020)</w:t>
+          </w:r>
+          <w:r>
+            <w:rPr>
+              <w:rFonts w:cs="Times New Roman"/>
+              <w:szCs w:val="24"/>
+              <w:lang w:val="en"/>
+            </w:rPr>
+            <w:fldChar w:fldCharType="end"/>
+          </w:r>
+        </w:sdtContent>
+      </w:sdt>
+      <w:r>
+        <w:rPr>
+          <w:rFonts w:cs="Times New Roman"/>
+          <w:szCs w:val="24"/>
+          <w:lang w:val="en"/>
+        </w:rPr>
+        <w:t xml:space="preserve"> also using traditional machine learning as a basic method for comparison.</w:t>
       </w:r>
     </w:p>
     <w:p>
@@ -6421,7 +6411,7 @@
           <w:lang w:val="en-US"/>
         </w:rPr>
       </w:pPr>
-      <w:bookmarkStart w:id="9" w:name="_Toc218709471"/>
+      <w:bookmarkStart w:id="9" w:name="_Toc220599730"/>
       <w:r>
         <w:rPr>
           <w:lang w:val="en-US"/>
@@ -6451,23 +6441,7 @@
           <w:szCs w:val="24"/>
           <w:lang w:val="en-US"/>
         </w:rPr>
-        <w:t>To avoid exposure to harmful content, multiple methods have been developed using modern techniques and technologies. BERT models are extremely popular in this field.</w:t>
-      </w:r>
-      <w:r>
-        <w:rPr>
-          <w:rFonts w:cs="Times New Roman"/>
-          <w:szCs w:val="24"/>
-          <w:lang w:val="en-US"/>
-        </w:rPr>
-        <w:t xml:space="preserve"> </w:t>
-      </w:r>
-      <w:r>
-        <w:rPr>
-          <w:rFonts w:cs="Times New Roman"/>
-          <w:szCs w:val="24"/>
-          <w:lang w:val="en-US"/>
-        </w:rPr>
-        <w:t xml:space="preserve">For example, the study “Multimodal Hate Speech Detection in Greek Social Media” </w:t>
+        <w:t>To avoid exposure to harmful content, multiple methods have been developed using modern techniques and technologies. BERT</w:t>
       </w:r>
       <w:sdt>
         <w:sdtPr>
@@ -6476,7 +6450,7 @@
             <w:szCs w:val="24"/>
             <w:lang w:val="en-US"/>
           </w:rPr>
-          <w:id w:val="-859902565"/>
+          <w:id w:val="2147161624"/>
           <w:citation/>
         </w:sdtPr>
         <w:sdtContent>
@@ -6494,7 +6468,7 @@
               <w:szCs w:val="24"/>
               <w:lang w:val="en-US"/>
             </w:rPr>
-            <w:instrText xml:space="preserve">CITATION Kon21 \l 1033 </w:instrText>
+            <w:instrText xml:space="preserve"> CITATION Dev18 \l 1033 </w:instrText>
           </w:r>
           <w:r>
             <w:rPr>
@@ -6511,7 +6485,16 @@
               <w:szCs w:val="24"/>
               <w:lang w:val="en-US"/>
             </w:rPr>
-            <w:t>(Perifanos &amp; Goutsos, 2021)</w:t>
+            <w:t xml:space="preserve"> </w:t>
+          </w:r>
+          <w:r>
+            <w:rPr>
+              <w:rFonts w:cs="Times New Roman"/>
+              <w:noProof/>
+              <w:szCs w:val="24"/>
+              <w:lang w:val="en-US"/>
+            </w:rPr>
+            <w:t>(Devlin, Chang, Lee, &amp; Toutanova, 2018)</w:t>
           </w:r>
           <w:r>
             <w:rPr>
@@ -6529,7 +6512,165 @@
           <w:szCs w:val="24"/>
           <w:lang w:val="en-US"/>
         </w:rPr>
-        <w:t xml:space="preserve"> used publicly available models such as the Greek BERT model as well as a modification of a RoBERTa language model for the Greek language. Furthermore, the work “Toxicity Detection on Greek Tweets” </w:t>
+        <w:t xml:space="preserve"> models are extremely popular in this field.</w:t>
+      </w:r>
+      <w:r>
+        <w:rPr>
+          <w:rFonts w:cs="Times New Roman"/>
+          <w:szCs w:val="24"/>
+          <w:lang w:val="en-US"/>
+        </w:rPr>
+        <w:t xml:space="preserve"> </w:t>
+      </w:r>
+      <w:r>
+        <w:rPr>
+          <w:rFonts w:cs="Times New Roman"/>
+          <w:szCs w:val="24"/>
+          <w:lang w:val="en-US"/>
+        </w:rPr>
+        <w:t>For example, the study “Multimodal Hate Speech Detection in Greek Social Media” used publicly available models such as the Greek BERT</w:t>
+      </w:r>
+      <w:sdt>
+        <w:sdtPr>
+          <w:rPr>
+            <w:rFonts w:cs="Times New Roman"/>
+            <w:szCs w:val="24"/>
+            <w:lang w:val="en-US"/>
+          </w:rPr>
+          <w:id w:val="1482504140"/>
+          <w:citation/>
+        </w:sdtPr>
+        <w:sdtContent>
+          <w:r>
+            <w:rPr>
+              <w:rFonts w:cs="Times New Roman"/>
+              <w:szCs w:val="24"/>
+              <w:lang w:val="en-US"/>
+            </w:rPr>
+            <w:fldChar w:fldCharType="begin"/>
+          </w:r>
+          <w:r>
+            <w:rPr>
+              <w:rFonts w:cs="Times New Roman"/>
+              <w:szCs w:val="24"/>
+              <w:lang w:val="en-US"/>
+            </w:rPr>
+            <w:instrText xml:space="preserve"> CITATION Joh20 \l 1033 </w:instrText>
+          </w:r>
+          <w:r>
+            <w:rPr>
+              <w:rFonts w:cs="Times New Roman"/>
+              <w:szCs w:val="24"/>
+              <w:lang w:val="en-US"/>
+            </w:rPr>
+            <w:fldChar w:fldCharType="separate"/>
+          </w:r>
+          <w:r>
+            <w:rPr>
+              <w:rFonts w:cs="Times New Roman"/>
+              <w:noProof/>
+              <w:szCs w:val="24"/>
+              <w:lang w:val="en-US"/>
+            </w:rPr>
+            <w:t xml:space="preserve"> </w:t>
+          </w:r>
+          <w:r>
+            <w:rPr>
+              <w:rFonts w:cs="Times New Roman"/>
+              <w:noProof/>
+              <w:szCs w:val="24"/>
+              <w:lang w:val="en-US"/>
+            </w:rPr>
+            <w:t>(Koutsikakis, Chalkidis, Malakasiotis, &amp; Androutsopoulos, 2020)</w:t>
+          </w:r>
+          <w:r>
+            <w:rPr>
+              <w:rFonts w:cs="Times New Roman"/>
+              <w:szCs w:val="24"/>
+              <w:lang w:val="en-US"/>
+            </w:rPr>
+            <w:fldChar w:fldCharType="end"/>
+          </w:r>
+        </w:sdtContent>
+      </w:sdt>
+      <w:r>
+        <w:rPr>
+          <w:rFonts w:cs="Times New Roman"/>
+          <w:szCs w:val="24"/>
+          <w:lang w:val="en-US"/>
+        </w:rPr>
+        <w:t xml:space="preserve"> model as well as a modification of a RoBERTa</w:t>
+      </w:r>
+      <w:sdt>
+        <w:sdtPr>
+          <w:rPr>
+            <w:rFonts w:cs="Times New Roman"/>
+            <w:szCs w:val="24"/>
+            <w:lang w:val="en-US"/>
+          </w:rPr>
+          <w:id w:val="1692109915"/>
+          <w:citation/>
+        </w:sdtPr>
+        <w:sdtContent>
+          <w:r>
+            <w:rPr>
+              <w:rFonts w:cs="Times New Roman"/>
+              <w:szCs w:val="24"/>
+              <w:lang w:val="en-US"/>
+            </w:rPr>
+            <w:fldChar w:fldCharType="begin"/>
+          </w:r>
+          <w:r>
+            <w:rPr>
+              <w:rFonts w:cs="Times New Roman"/>
+              <w:szCs w:val="24"/>
+              <w:lang w:val="en-US"/>
+            </w:rPr>
+            <w:instrText xml:space="preserve"> CITATION Yin19 \l 1033 </w:instrText>
+          </w:r>
+          <w:r>
+            <w:rPr>
+              <w:rFonts w:cs="Times New Roman"/>
+              <w:szCs w:val="24"/>
+              <w:lang w:val="en-US"/>
+            </w:rPr>
+            <w:fldChar w:fldCharType="separate"/>
+          </w:r>
+          <w:r>
+            <w:rPr>
+              <w:rFonts w:cs="Times New Roman"/>
+              <w:noProof/>
+              <w:szCs w:val="24"/>
+              <w:lang w:val="en-US"/>
+            </w:rPr>
+            <w:t xml:space="preserve"> </w:t>
+          </w:r>
+          <w:r>
+            <w:rPr>
+              <w:rFonts w:cs="Times New Roman"/>
+              <w:noProof/>
+              <w:szCs w:val="24"/>
+              <w:lang w:val="en-US"/>
+            </w:rPr>
+            <w:t>(Liu, et al., 2019)</w:t>
+          </w:r>
+          <w:r>
+            <w:rPr>
+              <w:rFonts w:cs="Times New Roman"/>
+              <w:szCs w:val="24"/>
+              <w:lang w:val="en-US"/>
+            </w:rPr>
+            <w:fldChar w:fldCharType="end"/>
+          </w:r>
+        </w:sdtContent>
+      </w:sdt>
+      <w:r>
+        <w:rPr>
+          <w:rFonts w:cs="Times New Roman"/>
+          <w:szCs w:val="24"/>
+          <w:lang w:val="en-US"/>
+        </w:rPr>
+        <w:t xml:space="preserve"> language model for the Greek language. Furthermore, the work “Toxicity Detection on Greek Tweets” </w:t>
       </w:r>
       <w:sdt>
         <w:sdtPr>
@@ -6591,14 +6732,85 @@
           <w:szCs w:val="24"/>
           <w:lang w:val="en-US"/>
         </w:rPr>
-        <w:t xml:space="preserve"> presented the use of three BERT models and a GRU model with Greek FastText embeddings</w:t>
-      </w:r>
+        <w:t xml:space="preserve"> presented the use of three BERT models and a GRU</w:t>
+      </w:r>
+      <w:sdt>
+        <w:sdtPr>
+          <w:rPr>
+            <w:rFonts w:cs="Times New Roman"/>
+            <w:szCs w:val="24"/>
+            <w:lang w:val="en-US"/>
+          </w:rPr>
+          <w:id w:val="-200784740"/>
+          <w:citation/>
+        </w:sdtPr>
+        <w:sdtContent>
+          <w:r>
+            <w:rPr>
+              <w:rFonts w:cs="Times New Roman"/>
+              <w:szCs w:val="24"/>
+              <w:lang w:val="en-US"/>
+            </w:rPr>
+            <w:fldChar w:fldCharType="begin"/>
+          </w:r>
+          <w:r>
+            <w:rPr>
+              <w:rFonts w:cs="Times New Roman"/>
+              <w:szCs w:val="24"/>
+              <w:lang w:val="en-US"/>
+            </w:rPr>
+            <w:instrText xml:space="preserve"> CITATION Kyu14 \l 1033 </w:instrText>
+          </w:r>
+          <w:r>
+            <w:rPr>
+              <w:rFonts w:cs="Times New Roman"/>
+              <w:szCs w:val="24"/>
+              <w:lang w:val="en-US"/>
+            </w:rPr>
+            <w:fldChar w:fldCharType="separate"/>
+          </w:r>
+          <w:r>
+            <w:rPr>
+              <w:rFonts w:cs="Times New Roman"/>
+              <w:noProof/>
+              <w:szCs w:val="24"/>
+              <w:lang w:val="en-US"/>
+            </w:rPr>
+            <w:t xml:space="preserve"> </w:t>
+          </w:r>
+          <w:r>
+            <w:rPr>
+              <w:rFonts w:cs="Times New Roman"/>
+              <w:noProof/>
+              <w:szCs w:val="24"/>
+              <w:lang w:val="en-US"/>
+            </w:rPr>
+            <w:t>(Cho, et al., 2014)</w:t>
+          </w:r>
+          <w:r>
+            <w:rPr>
+              <w:rFonts w:cs="Times New Roman"/>
+              <w:szCs w:val="24"/>
+              <w:lang w:val="en-US"/>
+            </w:rPr>
+            <w:fldChar w:fldCharType="end"/>
+          </w:r>
+        </w:sdtContent>
+      </w:sdt>
       <w:r>
         <w:rPr>
           <w:rFonts w:cs="Times New Roman"/>
           <w:szCs w:val="24"/>
           <w:lang w:val="en-US"/>
         </w:rPr>
+        <w:t xml:space="preserve"> model with Greek FastText embeddings</w:t>
+      </w:r>
+      <w:r>
+        <w:rPr>
+          <w:rFonts w:cs="Times New Roman"/>
+          <w:szCs w:val="24"/>
+          <w:lang w:val="en-US"/>
+        </w:rPr>
         <w:t xml:space="preserve">. </w:t>
       </w:r>
       <w:r>
@@ -6641,7 +6853,78 @@
           <w:szCs w:val="24"/>
           <w:lang w:val="en-US"/>
         </w:rPr>
-        <w:t>Models like BERT and RoBERTa are based on a transformer architecture, meaning they use transformers. Transformers are a type of neural network architecture that transforms or modifies an input sequence into an output sequence.</w:t>
+        <w:t>Models like BERT and RoBERTa are based on a transformer architecture, meaning they use transformers</w:t>
+      </w:r>
+      <w:sdt>
+        <w:sdtPr>
+          <w:rPr>
+            <w:rFonts w:cs="Times New Roman"/>
+            <w:szCs w:val="24"/>
+            <w:lang w:val="en-US"/>
+          </w:rPr>
+          <w:id w:val="1153647548"/>
+          <w:citation/>
+        </w:sdtPr>
+        <w:sdtContent>
+          <w:r>
+            <w:rPr>
+              <w:rFonts w:cs="Times New Roman"/>
+              <w:szCs w:val="24"/>
+              <w:lang w:val="en-US"/>
+            </w:rPr>
+            <w:fldChar w:fldCharType="begin"/>
+          </w:r>
+          <w:r>
+            <w:rPr>
+              <w:rFonts w:cs="Times New Roman"/>
+              <w:szCs w:val="24"/>
+              <w:lang w:val="en-US"/>
+            </w:rPr>
+            <w:instrText xml:space="preserve"> CITATION Vas \l 1033 </w:instrText>
+          </w:r>
+          <w:r>
+            <w:rPr>
+              <w:rFonts w:cs="Times New Roman"/>
+              <w:szCs w:val="24"/>
+              <w:lang w:val="en-US"/>
+            </w:rPr>
+            <w:fldChar w:fldCharType="separate"/>
+          </w:r>
+          <w:r>
+            <w:rPr>
+              <w:rFonts w:cs="Times New Roman"/>
+              <w:noProof/>
+              <w:szCs w:val="24"/>
+              <w:lang w:val="en-US"/>
+            </w:rPr>
+            <w:t xml:space="preserve"> </w:t>
+          </w:r>
+          <w:r>
+            <w:rPr>
+              <w:rFonts w:cs="Times New Roman"/>
+              <w:noProof/>
+              <w:szCs w:val="24"/>
+              <w:lang w:val="en-US"/>
+            </w:rPr>
+            <w:t>(Vaswani, et al., 2017)</w:t>
+          </w:r>
+          <w:r>
+            <w:rPr>
+              <w:rFonts w:cs="Times New Roman"/>
+              <w:szCs w:val="24"/>
+              <w:lang w:val="en-US"/>
+            </w:rPr>
+            <w:fldChar w:fldCharType="end"/>
+          </w:r>
+        </w:sdtContent>
+      </w:sdt>
+      <w:r>
+        <w:rPr>
+          <w:rFonts w:cs="Times New Roman"/>
+          <w:szCs w:val="24"/>
+          <w:lang w:val="en-US"/>
+        </w:rPr>
+        <w:t>. Transformers are a type of neural network architecture that transforms or modifies an input sequence into an output sequence.</w:t>
       </w:r>
       <w:r>
         <w:rPr>
@@ -6655,7 +6938,16 @@
           <w:szCs w:val="24"/>
           <w:lang w:val="en-US"/>
         </w:rPr>
-        <w:t>This is achieved through learning the environment and monitoring the relationships between the elements of the sequence.</w:t>
+        <w:t xml:space="preserve">This is </w:t>
+      </w:r>
+      <w:r>
+        <w:rPr>
+          <w:rFonts w:cs="Times New Roman"/>
+          <w:szCs w:val="24"/>
+          <w:lang w:val="en-US"/>
+        </w:rPr>
+        <w:lastRenderedPageBreak/>
+        <w:t>achieved through learning the environment and monitoring the relationships between the elements of the sequence.</w:t>
       </w:r>
     </w:p>
     <w:p>
@@ -6670,12 +6962,11 @@
           <w:lang w:val="en-US"/>
         </w:rPr>
       </w:pPr>
-      <w:bookmarkStart w:id="10" w:name="_Toc218709472"/>
-      <w:r>
-        <w:rPr>
-          <w:lang w:val="en-US"/>
-        </w:rPr>
-        <w:lastRenderedPageBreak/>
+      <w:bookmarkStart w:id="10" w:name="_Toc220599731"/>
+      <w:r>
+        <w:rPr>
+          <w:lang w:val="en-US"/>
+        </w:rPr>
         <w:t xml:space="preserve">1.4 </w:t>
       </w:r>
       <w:r>
@@ -6709,7 +7000,43 @@
         <w:rPr>
           <w:lang w:val="en-US"/>
         </w:rPr>
-        <w:t>The problem of lack of data occurs for many languages ​​whose speaker population is relatively small. Greek is considered a low-resource language in the field of Natural Language Processing (NLP) and thus finding data is already difficult.</w:t>
+        <w:t xml:space="preserve">The problem of lack of data occurs for many languages ​​whose speaker population is relatively small. Greek is considered a low-resource language in the field of </w:t>
+      </w:r>
+      <w:r>
+        <w:rPr>
+          <w:lang w:val="en-US"/>
+        </w:rPr>
+        <w:t>n</w:t>
+      </w:r>
+      <w:r>
+        <w:rPr>
+          <w:lang w:val="en-US"/>
+        </w:rPr>
+        <w:t>atural</w:t>
+      </w:r>
+      <w:r>
+        <w:rPr>
+          <w:lang w:val="en-US"/>
+        </w:rPr>
+        <w:t xml:space="preserve"> l</w:t>
+      </w:r>
+      <w:r>
+        <w:rPr>
+          <w:lang w:val="en-US"/>
+        </w:rPr>
+        <w:t xml:space="preserve">anguage </w:t>
+      </w:r>
+      <w:r>
+        <w:rPr>
+          <w:lang w:val="en-US"/>
+        </w:rPr>
+        <w:t>p</w:t>
+      </w:r>
+      <w:r>
+        <w:rPr>
+          <w:lang w:val="en-US"/>
+        </w:rPr>
+        <w:t>rocessing and thus finding data is already difficult.</w:t>
       </w:r>
       <w:r>
         <w:rPr>
@@ -6751,7 +7078,7 @@
           <w:lang w:val="en-US"/>
         </w:rPr>
       </w:pPr>
-      <w:bookmarkStart w:id="11" w:name="_Toc218709473"/>
+      <w:bookmarkStart w:id="11" w:name="_Toc220599732"/>
       <w:r>
         <w:rPr>
           <w:rFonts w:cs="Times New Roman"/>
@@ -6797,7 +7124,7 @@
         </w:rPr>
       </w:pPr>
       <w:bookmarkStart w:id="12" w:name="_2.1_Offensive_Greek"/>
-      <w:bookmarkStart w:id="13" w:name="_Toc218709474"/>
+      <w:bookmarkStart w:id="13" w:name="_Toc220599733"/>
       <w:bookmarkEnd w:id="12"/>
       <w:r>
         <w:rPr>
@@ -6888,7 +7215,7 @@
           <w:szCs w:val="24"/>
           <w:lang w:val="en-US"/>
         </w:rPr>
-        <w:t>OGTD v1.0 was created between May and June 2019. The Twitter API was used to collect tweets. Tweets containing popular hashtags from Greek television programs were collected through the Twitter API.</w:t>
+        <w:t>OGTD v1.0 was created between May and June 2019</w:t>
       </w:r>
       <w:r>
         <w:rPr>
@@ -6896,6 +7223,38 @@
           <w:szCs w:val="24"/>
           <w:lang w:val="en-US"/>
         </w:rPr>
+        <w:t xml:space="preserve"> for the paper “</w:t>
+      </w:r>
+      <w:r>
+        <w:rPr>
+          <w:rFonts w:cs="Times New Roman"/>
+          <w:szCs w:val="24"/>
+          <w:lang w:val="en-US"/>
+        </w:rPr>
+        <w:t>Offensive Language Identification in Greek</w:t>
+      </w:r>
+      <w:r>
+        <w:rPr>
+          <w:rFonts w:cs="Times New Roman"/>
+          <w:szCs w:val="24"/>
+          <w:lang w:val="en-US"/>
+        </w:rPr>
+        <w:t>”</w:t>
+      </w:r>
+      <w:r>
+        <w:rPr>
+          <w:rFonts w:cs="Times New Roman"/>
+          <w:szCs w:val="24"/>
+          <w:lang w:val="en-US"/>
+        </w:rPr>
+        <w:t>. The Twitter API was used to collect tweets. Tweets containing popular hashtags from Greek television programs were collected through the Twitter API.</w:t>
+      </w:r>
+      <w:r>
+        <w:rPr>
+          <w:rFonts w:cs="Times New Roman"/>
+          <w:szCs w:val="24"/>
+          <w:lang w:val="en-US"/>
+        </w:rPr>
         <w:t xml:space="preserve"> </w:t>
       </w:r>
       <w:r>
@@ -6986,7 +7345,16 @@
           <w:szCs w:val="24"/>
           <w:lang w:val="en-US"/>
         </w:rPr>
-        <w:t>The use of double punctuation such as question marks and exclamation marks was also normalized. After preprocessing and deleting duplicate tweets, the number was reduced to 46,218 from which 5,000 were randomly selected for annotation.</w:t>
+        <w:t xml:space="preserve">The use of double punctuation such as question marks and exclamation marks </w:t>
+      </w:r>
+      <w:r>
+        <w:rPr>
+          <w:rFonts w:cs="Times New Roman"/>
+          <w:szCs w:val="24"/>
+          <w:lang w:val="en-US"/>
+        </w:rPr>
+        <w:lastRenderedPageBreak/>
+        <w:t>was also normalized. After preprocessing and deleting duplicate tweets, the number was reduced to 46,218 from which 5,000 were randomly selected for annotation.</w:t>
       </w:r>
     </w:p>
     <w:p>
@@ -7004,7 +7372,6 @@
           <w:szCs w:val="24"/>
           <w:lang w:val="en-US"/>
         </w:rPr>
-        <w:lastRenderedPageBreak/>
         <w:t>Light-Tag</w:t>
       </w:r>
       <w:r>
@@ -7465,7 +7832,7 @@
         </w:rPr>
       </w:pPr>
       <w:bookmarkStart w:id="14" w:name="_2.2_Greek_FastText"/>
-      <w:bookmarkStart w:id="15" w:name="_Toc218709475"/>
+      <w:bookmarkStart w:id="15" w:name="_Toc220599734"/>
       <w:bookmarkEnd w:id="14"/>
       <w:r>
         <w:rPr>
@@ -7652,7 +8019,149 @@
           <w:szCs w:val="24"/>
           <w:lang w:val="en-US"/>
         </w:rPr>
-        <w:t>FastText extends the Skip-gram and CBOW models by representing words as units of n-grams of characters instead of individual units. This fundamental shift allows the model to create embeddings for previously unseen words and capture morphological relationships between related terms.</w:t>
+        <w:t>FastText extends the Skip-gram</w:t>
+      </w:r>
+      <w:sdt>
+        <w:sdtPr>
+          <w:rPr>
+            <w:rFonts w:cs="Times New Roman"/>
+            <w:szCs w:val="24"/>
+            <w:lang w:val="en-US"/>
+          </w:rPr>
+          <w:id w:val="-1376695385"/>
+          <w:citation/>
+        </w:sdtPr>
+        <w:sdtContent>
+          <w:r>
+            <w:rPr>
+              <w:rFonts w:cs="Times New Roman"/>
+              <w:szCs w:val="24"/>
+              <w:lang w:val="en-US"/>
+            </w:rPr>
+            <w:fldChar w:fldCharType="begin"/>
+          </w:r>
+          <w:r>
+            <w:rPr>
+              <w:rFonts w:cs="Times New Roman"/>
+              <w:szCs w:val="24"/>
+              <w:lang w:val="en-US"/>
+            </w:rPr>
+            <w:instrText xml:space="preserve"> CITATION Tom13 \l 1033 </w:instrText>
+          </w:r>
+          <w:r>
+            <w:rPr>
+              <w:rFonts w:cs="Times New Roman"/>
+              <w:szCs w:val="24"/>
+              <w:lang w:val="en-US"/>
+            </w:rPr>
+            <w:fldChar w:fldCharType="separate"/>
+          </w:r>
+          <w:r>
+            <w:rPr>
+              <w:rFonts w:cs="Times New Roman"/>
+              <w:noProof/>
+              <w:szCs w:val="24"/>
+              <w:lang w:val="en-US"/>
+            </w:rPr>
+            <w:t xml:space="preserve"> </w:t>
+          </w:r>
+          <w:r>
+            <w:rPr>
+              <w:rFonts w:cs="Times New Roman"/>
+              <w:noProof/>
+              <w:szCs w:val="24"/>
+              <w:lang w:val="en-US"/>
+            </w:rPr>
+            <w:t>(Mikolov, Chen, Corrado, &amp; Dean, 2013)</w:t>
+          </w:r>
+          <w:r>
+            <w:rPr>
+              <w:rFonts w:cs="Times New Roman"/>
+              <w:szCs w:val="24"/>
+              <w:lang w:val="en-US"/>
+            </w:rPr>
+            <w:fldChar w:fldCharType="end"/>
+          </w:r>
+        </w:sdtContent>
+      </w:sdt>
+      <w:r>
+        <w:rPr>
+          <w:rFonts w:cs="Times New Roman"/>
+          <w:szCs w:val="24"/>
+          <w:lang w:val="en-US"/>
+        </w:rPr>
+        <w:t xml:space="preserve"> and CBOW</w:t>
+      </w:r>
+      <w:sdt>
+        <w:sdtPr>
+          <w:rPr>
+            <w:rFonts w:cs="Times New Roman"/>
+            <w:szCs w:val="24"/>
+            <w:lang w:val="en-US"/>
+          </w:rPr>
+          <w:id w:val="1474403909"/>
+          <w:citation/>
+        </w:sdtPr>
+        <w:sdtContent>
+          <w:r>
+            <w:rPr>
+              <w:rFonts w:cs="Times New Roman"/>
+              <w:szCs w:val="24"/>
+              <w:lang w:val="en-US"/>
+            </w:rPr>
+            <w:fldChar w:fldCharType="begin"/>
+          </w:r>
+          <w:r>
+            <w:rPr>
+              <w:rFonts w:cs="Times New Roman"/>
+              <w:szCs w:val="24"/>
+              <w:lang w:val="en-US"/>
+            </w:rPr>
+            <w:instrText xml:space="preserve"> CITATION Tom13 \l 1033 </w:instrText>
+          </w:r>
+          <w:r>
+            <w:rPr>
+              <w:rFonts w:cs="Times New Roman"/>
+              <w:szCs w:val="24"/>
+              <w:lang w:val="en-US"/>
+            </w:rPr>
+            <w:fldChar w:fldCharType="separate"/>
+          </w:r>
+          <w:r>
+            <w:rPr>
+              <w:rFonts w:cs="Times New Roman"/>
+              <w:noProof/>
+              <w:szCs w:val="24"/>
+              <w:lang w:val="en-US"/>
+            </w:rPr>
+            <w:t xml:space="preserve"> </w:t>
+          </w:r>
+          <w:r>
+            <w:rPr>
+              <w:rFonts w:cs="Times New Roman"/>
+              <w:noProof/>
+              <w:szCs w:val="24"/>
+              <w:lang w:val="en-US"/>
+            </w:rPr>
+            <w:t>(Mikolov, Chen, Corrado, &amp; Dean, 2013)</w:t>
+          </w:r>
+          <w:r>
+            <w:rPr>
+              <w:rFonts w:cs="Times New Roman"/>
+              <w:szCs w:val="24"/>
+              <w:lang w:val="en-US"/>
+            </w:rPr>
+            <w:fldChar w:fldCharType="end"/>
+          </w:r>
+        </w:sdtContent>
+      </w:sdt>
+      <w:r>
+        <w:rPr>
+          <w:rFonts w:cs="Times New Roman"/>
+          <w:szCs w:val="24"/>
+          <w:lang w:val="en-US"/>
+        </w:rPr>
+        <w:t xml:space="preserve"> models by representing words as units of n-grams of characters instead of individual units. This fundamental shift allows the model to create embeddings for previously unseen words and capture morphological relationships between related terms.</w:t>
       </w:r>
     </w:p>
     <w:p>
@@ -7696,7 +8205,87 @@
           <w:szCs w:val="24"/>
           <w:lang w:val="en-US"/>
         </w:rPr>
-        <w:t>free, open repository of web crawl data and Wikipedia. Even though it’s not explicitly mentioned in their documentation, we can safely assume that they used the Greek parts of both data sets. For their training procedure, Facebook used the Europarl tokenization which in turn used data from the European parliament</w:t>
+        <w:t xml:space="preserve">free, open repository of web crawl data and Wikipedia. Even though it’s not explicitly mentioned in their documentation, we can safely assume that they used the Greek parts of both data sets. For </w:t>
+      </w:r>
+      <w:r>
+        <w:rPr>
+          <w:rFonts w:cs="Times New Roman"/>
+          <w:szCs w:val="24"/>
+          <w:lang w:val="en-US"/>
+        </w:rPr>
+        <w:lastRenderedPageBreak/>
+        <w:t>their training procedure, Facebook used the Europarl</w:t>
+      </w:r>
+      <w:sdt>
+        <w:sdtPr>
+          <w:rPr>
+            <w:rFonts w:cs="Times New Roman"/>
+            <w:szCs w:val="24"/>
+            <w:lang w:val="en-US"/>
+          </w:rPr>
+          <w:id w:val="-1980767454"/>
+          <w:citation/>
+        </w:sdtPr>
+        <w:sdtContent>
+          <w:r>
+            <w:rPr>
+              <w:rFonts w:cs="Times New Roman"/>
+              <w:szCs w:val="24"/>
+              <w:lang w:val="en-US"/>
+            </w:rPr>
+            <w:fldChar w:fldCharType="begin"/>
+          </w:r>
+          <w:r>
+            <w:rPr>
+              <w:rFonts w:cs="Times New Roman"/>
+              <w:szCs w:val="24"/>
+              <w:lang w:val="en-US"/>
+            </w:rPr>
+            <w:instrText xml:space="preserve"> CITATION Phi05 \l 1033 </w:instrText>
+          </w:r>
+          <w:r>
+            <w:rPr>
+              <w:rFonts w:cs="Times New Roman"/>
+              <w:szCs w:val="24"/>
+              <w:lang w:val="en-US"/>
+            </w:rPr>
+            <w:fldChar w:fldCharType="separate"/>
+          </w:r>
+          <w:r>
+            <w:rPr>
+              <w:rFonts w:cs="Times New Roman"/>
+              <w:noProof/>
+              <w:szCs w:val="24"/>
+              <w:lang w:val="en-US"/>
+            </w:rPr>
+            <w:t xml:space="preserve"> </w:t>
+          </w:r>
+          <w:r>
+            <w:rPr>
+              <w:rFonts w:cs="Times New Roman"/>
+              <w:noProof/>
+              <w:szCs w:val="24"/>
+              <w:lang w:val="en-US"/>
+            </w:rPr>
+            <w:t>(Koehn, 2005)</w:t>
+          </w:r>
+          <w:r>
+            <w:rPr>
+              <w:rFonts w:cs="Times New Roman"/>
+              <w:szCs w:val="24"/>
+              <w:lang w:val="en-US"/>
+            </w:rPr>
+            <w:fldChar w:fldCharType="end"/>
+          </w:r>
+        </w:sdtContent>
+      </w:sdt>
+      <w:r>
+        <w:rPr>
+          <w:rFonts w:cs="Times New Roman"/>
+          <w:szCs w:val="24"/>
+          <w:lang w:val="en-US"/>
+        </w:rPr>
+        <w:t xml:space="preserve"> tokenization which in turn used data from the European parliament</w:t>
       </w:r>
       <w:r>
         <w:rPr>
@@ -7722,7 +8311,7 @@
           <w:lang w:val="en-US"/>
         </w:rPr>
       </w:pPr>
-      <w:bookmarkStart w:id="16" w:name="_Toc218709476"/>
+      <w:bookmarkStart w:id="16" w:name="_Toc220599735"/>
       <w:r>
         <w:rPr>
           <w:rFonts w:cs="Times New Roman"/>
@@ -7730,7 +8319,6 @@
           <w:szCs w:val="32"/>
           <w:lang w:val="en-US"/>
         </w:rPr>
-        <w:lastRenderedPageBreak/>
         <w:t>3.</w:t>
       </w:r>
       <w:r>
@@ -7786,7 +8374,7 @@
           <w:lang w:val="en-US"/>
         </w:rPr>
       </w:pPr>
-      <w:bookmarkStart w:id="17" w:name="_Toc218709477"/>
+      <w:bookmarkStart w:id="17" w:name="_Toc220599736"/>
       <w:r>
         <w:rPr>
           <w:rFonts w:cs="Times New Roman"/>
@@ -7916,6 +8504,36 @@
         </w:rPr>
         <w:t>To achieve higher accuracy while avoiding confusion, it was decided to process the dataset by first removing accents from all words that contained accents.</w:t>
       </w:r>
+      <w:r>
+        <w:rPr>
+          <w:lang w:val="en-US"/>
+        </w:rPr>
+        <w:t xml:space="preserve"> </w:t>
+      </w:r>
+      <w:r>
+        <w:rPr>
+          <w:lang w:val="en-US"/>
+        </w:rPr>
+        <w:t>For example, “</w:t>
+      </w:r>
+      <w:r>
+        <w:t>Είμαι</w:t>
+      </w:r>
+      <w:r>
+        <w:rPr>
+          <w:lang w:val="en-US"/>
+        </w:rPr>
+        <w:t>” would be turned into “</w:t>
+      </w:r>
+      <w:r>
+        <w:t>ειμαι</w:t>
+      </w:r>
+      <w:r>
+        <w:rPr>
+          <w:lang w:val="en-US"/>
+        </w:rPr>
+        <w:t>”.</w:t>
+      </w:r>
     </w:p>
     <w:p>
       <w:pPr>
@@ -7941,7 +8559,7 @@
           <w:lang w:val="en-US"/>
         </w:rPr>
       </w:pPr>
-      <w:bookmarkStart w:id="18" w:name="_Toc218709478"/>
+      <w:bookmarkStart w:id="18" w:name="_Toc220599737"/>
       <w:r>
         <w:rPr>
           <w:lang w:val="en-US"/>
@@ -8088,7 +8706,70 @@
           <w:rFonts w:eastAsiaTheme="minorEastAsia"/>
           <w:lang w:val="en-US"/>
         </w:rPr>
-        <w:t>Inverse document frequency (IDF) measures how important a term is. However, terms like "is", "</w:t>
+        <w:t>Inverse document frequency (IDF)</w:t>
+      </w:r>
+      <w:sdt>
+        <w:sdtPr>
+          <w:rPr>
+            <w:rFonts w:eastAsiaTheme="minorEastAsia"/>
+            <w:lang w:val="en-US"/>
+          </w:rPr>
+          <w:id w:val="134070064"/>
+          <w:citation/>
+        </w:sdtPr>
+        <w:sdtContent>
+          <w:r>
+            <w:rPr>
+              <w:rFonts w:eastAsiaTheme="minorEastAsia"/>
+              <w:lang w:val="en-US"/>
+            </w:rPr>
+            <w:fldChar w:fldCharType="begin"/>
+          </w:r>
+          <w:r>
+            <w:rPr>
+              <w:rFonts w:eastAsiaTheme="minorEastAsia"/>
+              <w:lang w:val="en-US"/>
+            </w:rPr>
+            <w:instrText xml:space="preserve"> CITATION Kar72 \l 1033 </w:instrText>
+          </w:r>
+          <w:r>
+            <w:rPr>
+              <w:rFonts w:eastAsiaTheme="minorEastAsia"/>
+              <w:lang w:val="en-US"/>
+            </w:rPr>
+            <w:fldChar w:fldCharType="separate"/>
+          </w:r>
+          <w:r>
+            <w:rPr>
+              <w:rFonts w:eastAsiaTheme="minorEastAsia"/>
+              <w:noProof/>
+              <w:lang w:val="en-US"/>
+            </w:rPr>
+            <w:t xml:space="preserve"> </w:t>
+          </w:r>
+          <w:r>
+            <w:rPr>
+              <w:rFonts w:eastAsiaTheme="minorEastAsia"/>
+              <w:noProof/>
+              <w:lang w:val="en-US"/>
+            </w:rPr>
+            <w:t>(Jones, 1972)</w:t>
+          </w:r>
+          <w:r>
+            <w:rPr>
+              <w:rFonts w:eastAsiaTheme="minorEastAsia"/>
+              <w:lang w:val="en-US"/>
+            </w:rPr>
+            <w:fldChar w:fldCharType="end"/>
+          </w:r>
+        </w:sdtContent>
+      </w:sdt>
+      <w:r>
+        <w:rPr>
+          <w:rFonts w:eastAsiaTheme="minorEastAsia"/>
+          <w:lang w:val="en-US"/>
+        </w:rPr>
+        <w:t xml:space="preserve"> measures how important a term is. However, terms like "is", "</w:t>
       </w:r>
       <w:r>
         <w:rPr>
@@ -8265,6 +8946,14 @@
           <w:lang w:val="en-US"/>
         </w:rPr>
       </w:pPr>
+    </w:p>
+    <w:p>
+      <w:pPr>
+        <w:rPr>
+          <w:rFonts w:eastAsiaTheme="minorEastAsia"/>
+          <w:lang w:val="en-US"/>
+        </w:rPr>
+      </w:pPr>
       <w:r>
         <w:rPr>
           <w:rFonts w:eastAsiaTheme="minorEastAsia"/>
@@ -8387,7 +9076,6 @@
           <w:rFonts w:eastAsiaTheme="minorEastAsia"/>
           <w:lang w:val="en-US"/>
         </w:rPr>
-        <w:lastRenderedPageBreak/>
         <w:t>If the term is not in the corpus, this will lead to a division-by-zero. It is therefore common to adjust the denominator to 1+</w:t>
       </w:r>
       <w:r>
@@ -8736,17 +9424,25 @@
     <w:p>
       <w:pPr>
         <w:pStyle w:val="font-claude-response-body"/>
-      </w:pPr>
-      <w:r>
-        <w:t>During training, the logistic regression algorithm adjusts these weights to minimize classification error on the training data. Words that frequently appear in offensive tweets will learn positive weights, while words associated with non-offensive tweets will learn negative weights.</w:t>
+        <w:jc w:val="both"/>
+      </w:pPr>
+      <w:r>
+        <w:t>During training</w:t>
+      </w:r>
+      <w:r>
+        <w:t>, the logistic regression algorithm adjusts these weights to minimize classification error on the training data. Words that frequently appear in offensive tweets will learn positive weights, while words associated with non-offensive tweets will learn negative weights.</w:t>
       </w:r>
     </w:p>
     <w:p>
       <w:pPr>
         <w:pStyle w:val="font-claude-response-body"/>
-      </w:pPr>
-      <w:r>
-        <w:t>The computed weighted sum (z) is then fed as input into a sigmoid function:</w:t>
+        <w:jc w:val="both"/>
+      </w:pPr>
+      <w:r>
+        <w:t>The</w:t>
+      </w:r>
+      <w:r>
+        <w:t xml:space="preserve"> computed weighted sum (z) is then fed as input into a sigmoid function:</w:t>
       </w:r>
     </w:p>
     <w:p>
@@ -8764,6 +9460,7 @@
               <w:rFonts w:ascii="Cambria Math" w:eastAsiaTheme="minorEastAsia" w:hAnsi="Cambria Math"/>
               <w:lang w:val="en-US"/>
             </w:rPr>
+            <w:lastRenderedPageBreak/>
             <m:t>σ</m:t>
           </m:r>
           <m:d>
@@ -8882,8 +9579,6 @@
       <w:r>
         <w:rPr>
           <w:rFonts w:eastAsiaTheme="minorEastAsia"/>
-          <w:b/>
-          <w:bCs/>
           <w:iCs/>
           <w:lang w:val="en-US"/>
         </w:rPr>
@@ -8900,8 +9595,6 @@
       <w:r>
         <w:rPr>
           <w:rFonts w:eastAsiaTheme="minorEastAsia"/>
-          <w:b/>
-          <w:bCs/>
           <w:iCs/>
           <w:lang w:val="en-US"/>
         </w:rPr>
@@ -8930,7 +9623,6 @@
           <w:iCs/>
           <w:lang w:val="en-US"/>
         </w:rPr>
-        <w:lastRenderedPageBreak/>
         <w:t>This model uses no deep learning as a means of measuring the capabilities of classic machine learning algorithms in our task.</w:t>
       </w:r>
     </w:p>
@@ -8953,7 +9645,7 @@
         </w:rPr>
         <w:t xml:space="preserve"> </w:t>
       </w:r>
-      <w:bookmarkStart w:id="19" w:name="_Toc218709479"/>
+      <w:bookmarkStart w:id="19" w:name="_Toc220599738"/>
       <w:r>
         <w:rPr>
           <w:rFonts w:eastAsiaTheme="minorEastAsia"/>
@@ -9049,7 +9741,62 @@
         <w:rPr>
           <w:lang w:val="en-US"/>
         </w:rPr>
-        <w:t>a Bidirectional Long Short-Term Memory (BiLSTM) classifier on our training and testing data.</w:t>
+        <w:t>a Bidirectional Long Short-Term Memory (BiLSTM)</w:t>
+      </w:r>
+      <w:sdt>
+        <w:sdtPr>
+          <w:rPr>
+            <w:lang w:val="en-US"/>
+          </w:rPr>
+          <w:id w:val="839206457"/>
+          <w:citation/>
+        </w:sdtPr>
+        <w:sdtContent>
+          <w:r>
+            <w:rPr>
+              <w:lang w:val="en-US"/>
+            </w:rPr>
+            <w:fldChar w:fldCharType="begin"/>
+          </w:r>
+          <w:r>
+            <w:rPr>
+              <w:lang w:val="en-US"/>
+            </w:rPr>
+            <w:instrText xml:space="preserve"> CITATION Mik \l 1033 </w:instrText>
+          </w:r>
+          <w:r>
+            <w:rPr>
+              <w:lang w:val="en-US"/>
+            </w:rPr>
+            <w:fldChar w:fldCharType="separate"/>
+          </w:r>
+          <w:r>
+            <w:rPr>
+              <w:noProof/>
+              <w:lang w:val="en-US"/>
+            </w:rPr>
+            <w:t xml:space="preserve"> </w:t>
+          </w:r>
+          <w:r>
+            <w:rPr>
+              <w:noProof/>
+              <w:lang w:val="en-US"/>
+            </w:rPr>
+            <w:t>(Schuster &amp; Paliwal, 1997)</w:t>
+          </w:r>
+          <w:r>
+            <w:rPr>
+              <w:lang w:val="en-US"/>
+            </w:rPr>
+            <w:fldChar w:fldCharType="end"/>
+          </w:r>
+        </w:sdtContent>
+      </w:sdt>
+      <w:r>
+        <w:rPr>
+          <w:lang w:val="en-US"/>
+        </w:rPr>
+        <w:t xml:space="preserve"> classifier on our training and testing data.</w:t>
       </w:r>
     </w:p>
     <w:p>
@@ -9222,6 +9969,7 @@
         <w:rPr>
           <w:lang w:val="en-US"/>
         </w:rPr>
+        <w:lastRenderedPageBreak/>
         <w:t xml:space="preserve">The </w:t>
       </w:r>
       <w:r>
@@ -9271,123 +10019,14 @@
         <w:rPr>
           <w:lang w:val="en-US"/>
         </w:rPr>
-        <w:t xml:space="preserve">Adam optimizer is utilized in this model. Adam optimization was introduced in </w:t>
-      </w:r>
-      <w:r>
-        <w:rPr>
-          <w:lang w:val="en-US"/>
-        </w:rPr>
-        <w:t xml:space="preserve">the </w:t>
-      </w:r>
-      <w:r>
-        <w:rPr>
-          <w:lang w:val="en-US"/>
-        </w:rPr>
-        <w:t>I</w:t>
-      </w:r>
-      <w:r>
-        <w:rPr>
-          <w:lang w:val="en-US"/>
-        </w:rPr>
-        <w:t>nternational</w:t>
-      </w:r>
-      <w:r>
-        <w:rPr>
-          <w:lang w:val="en-US"/>
-        </w:rPr>
-        <w:t xml:space="preserve"> </w:t>
-      </w:r>
-      <w:r>
-        <w:rPr>
-          <w:lang w:val="en-US"/>
-        </w:rPr>
-        <w:t>C</w:t>
-      </w:r>
-      <w:r>
-        <w:rPr>
-          <w:lang w:val="en-US"/>
-        </w:rPr>
-        <w:t xml:space="preserve">onference on </w:t>
-      </w:r>
-      <w:r>
-        <w:rPr>
-          <w:lang w:val="en-US"/>
-        </w:rPr>
-        <w:t>L</w:t>
-      </w:r>
-      <w:r>
-        <w:rPr>
-          <w:lang w:val="en-US"/>
-        </w:rPr>
-        <w:t xml:space="preserve">earning </w:t>
-      </w:r>
-      <w:r>
-        <w:rPr>
-          <w:lang w:val="en-US"/>
-        </w:rPr>
-        <w:t>R</w:t>
-      </w:r>
-      <w:r>
-        <w:rPr>
-          <w:lang w:val="en-US"/>
-        </w:rPr>
-        <w:t xml:space="preserve">epresentations and later published </w:t>
-      </w:r>
-      <w:r>
-        <w:rPr>
-          <w:lang w:val="en-US"/>
-        </w:rPr>
-        <w:lastRenderedPageBreak/>
-        <w:t xml:space="preserve">as a conference paper in </w:t>
-      </w:r>
-      <w:r>
-        <w:rPr>
-          <w:lang w:val="en-US"/>
-        </w:rPr>
-        <w:t>“</w:t>
-      </w:r>
-      <w:r>
-        <w:rPr>
-          <w:lang w:val="en-US"/>
-        </w:rPr>
-        <w:t>A</w:t>
-      </w:r>
-      <w:r>
-        <w:rPr>
-          <w:lang w:val="en-US"/>
-        </w:rPr>
-        <w:t>dam</w:t>
-      </w:r>
-      <w:r>
-        <w:rPr>
-          <w:lang w:val="en-US"/>
-        </w:rPr>
-        <w:t>:</w:t>
-      </w:r>
-      <w:r>
-        <w:rPr>
-          <w:lang w:val="en-US"/>
-        </w:rPr>
-        <w:t xml:space="preserve"> A method for stochastic optimization</w:t>
-      </w:r>
-      <w:r>
-        <w:rPr>
-          <w:lang w:val="en-US"/>
-        </w:rPr>
-        <w:t>”</w:t>
-      </w:r>
-      <w:r>
-        <w:rPr>
-          <w:lang w:val="en-US"/>
-        </w:rPr>
-        <w:t xml:space="preserve"> </w:t>
+        <w:t>Adam optimizer</w:t>
       </w:r>
       <w:sdt>
         <w:sdtPr>
           <w:rPr>
             <w:lang w:val="en-US"/>
           </w:rPr>
-          <w:id w:val="-584907692"/>
+          <w:id w:val="1975259168"/>
           <w:citation/>
         </w:sdtPr>
         <w:sdtContent>
@@ -9401,13 +10040,20 @@
             <w:rPr>
               <w:lang w:val="en-US"/>
             </w:rPr>
-            <w:instrText xml:space="preserve">CITATION Die15 \l 1033 </w:instrText>
+            <w:instrText xml:space="preserve"> CITATION Die15 \l 1033 </w:instrText>
           </w:r>
           <w:r>
             <w:rPr>
               <w:lang w:val="en-US"/>
             </w:rPr>
             <w:fldChar w:fldCharType="separate"/>
+          </w:r>
+          <w:r>
+            <w:rPr>
+              <w:noProof/>
+              <w:lang w:val="en-US"/>
+            </w:rPr>
+            <w:t xml:space="preserve"> </w:t>
           </w:r>
           <w:r>
             <w:rPr>
@@ -9428,6 +10074,108 @@
         <w:rPr>
           <w:lang w:val="en-US"/>
         </w:rPr>
+        <w:t xml:space="preserve"> is utilized in this model. Adam optimization was introduced in </w:t>
+      </w:r>
+      <w:r>
+        <w:rPr>
+          <w:lang w:val="en-US"/>
+        </w:rPr>
+        <w:t xml:space="preserve">the </w:t>
+      </w:r>
+      <w:r>
+        <w:rPr>
+          <w:lang w:val="en-US"/>
+        </w:rPr>
+        <w:t>I</w:t>
+      </w:r>
+      <w:r>
+        <w:rPr>
+          <w:lang w:val="en-US"/>
+        </w:rPr>
+        <w:t>nternational</w:t>
+      </w:r>
+      <w:r>
+        <w:rPr>
+          <w:lang w:val="en-US"/>
+        </w:rPr>
+        <w:t xml:space="preserve"> </w:t>
+      </w:r>
+      <w:r>
+        <w:rPr>
+          <w:lang w:val="en-US"/>
+        </w:rPr>
+        <w:t>C</w:t>
+      </w:r>
+      <w:r>
+        <w:rPr>
+          <w:lang w:val="en-US"/>
+        </w:rPr>
+        <w:t xml:space="preserve">onference on </w:t>
+      </w:r>
+      <w:r>
+        <w:rPr>
+          <w:lang w:val="en-US"/>
+        </w:rPr>
+        <w:t>L</w:t>
+      </w:r>
+      <w:r>
+        <w:rPr>
+          <w:lang w:val="en-US"/>
+        </w:rPr>
+        <w:t xml:space="preserve">earning </w:t>
+      </w:r>
+      <w:r>
+        <w:rPr>
+          <w:lang w:val="en-US"/>
+        </w:rPr>
+        <w:t>R</w:t>
+      </w:r>
+      <w:r>
+        <w:rPr>
+          <w:lang w:val="en-US"/>
+        </w:rPr>
+        <w:t xml:space="preserve">epresentations and later published as a conference paper in </w:t>
+      </w:r>
+      <w:r>
+        <w:rPr>
+          <w:lang w:val="en-US"/>
+        </w:rPr>
+        <w:t>“</w:t>
+      </w:r>
+      <w:r>
+        <w:rPr>
+          <w:lang w:val="en-US"/>
+        </w:rPr>
+        <w:t>A</w:t>
+      </w:r>
+      <w:r>
+        <w:rPr>
+          <w:lang w:val="en-US"/>
+        </w:rPr>
+        <w:t>dam</w:t>
+      </w:r>
+      <w:r>
+        <w:rPr>
+          <w:lang w:val="en-US"/>
+        </w:rPr>
+        <w:t>:</w:t>
+      </w:r>
+      <w:r>
+        <w:rPr>
+          <w:lang w:val="en-US"/>
+        </w:rPr>
+        <w:t xml:space="preserve"> A method for stochastic optimization</w:t>
+      </w:r>
+      <w:r>
+        <w:rPr>
+          <w:lang w:val="en-US"/>
+        </w:rPr>
+        <w:t>”</w:t>
+      </w:r>
+      <w:r>
+        <w:rPr>
+          <w:lang w:val="en-US"/>
+        </w:rPr>
         <w:t>.</w:t>
       </w:r>
       <w:r>
@@ -9440,7 +10188,62 @@
         <w:rPr>
           <w:lang w:val="en-US"/>
         </w:rPr>
-        <w:t>, RMSProp and AdaGrad.</w:t>
+        <w:t>, RMSProp and AdaGrad</w:t>
+      </w:r>
+      <w:sdt>
+        <w:sdtPr>
+          <w:rPr>
+            <w:lang w:val="en-US"/>
+          </w:rPr>
+          <w:id w:val="2001077141"/>
+          <w:citation/>
+        </w:sdtPr>
+        <w:sdtContent>
+          <w:r>
+            <w:rPr>
+              <w:lang w:val="en-US"/>
+            </w:rPr>
+            <w:fldChar w:fldCharType="begin"/>
+          </w:r>
+          <w:r>
+            <w:rPr>
+              <w:lang w:val="en-US"/>
+            </w:rPr>
+            <w:instrText xml:space="preserve"> CITATION Joh11 \l 1033 </w:instrText>
+          </w:r>
+          <w:r>
+            <w:rPr>
+              <w:lang w:val="en-US"/>
+            </w:rPr>
+            <w:fldChar w:fldCharType="separate"/>
+          </w:r>
+          <w:r>
+            <w:rPr>
+              <w:noProof/>
+              <w:lang w:val="en-US"/>
+            </w:rPr>
+            <w:t xml:space="preserve"> </w:t>
+          </w:r>
+          <w:r>
+            <w:rPr>
+              <w:noProof/>
+              <w:lang w:val="en-US"/>
+            </w:rPr>
+            <w:t>(Duchi, Hazan, &amp; Singer, 2011)</w:t>
+          </w:r>
+          <w:r>
+            <w:rPr>
+              <w:lang w:val="en-US"/>
+            </w:rPr>
+            <w:fldChar w:fldCharType="end"/>
+          </w:r>
+        </w:sdtContent>
+      </w:sdt>
+      <w:r>
+        <w:rPr>
+          <w:lang w:val="en-US"/>
+        </w:rPr>
+        <w:t>.</w:t>
       </w:r>
     </w:p>
     <w:p>
@@ -9805,7 +10608,7 @@
           <w:lang w:val="en-US"/>
         </w:rPr>
       </w:pPr>
-      <w:bookmarkStart w:id="20" w:name="_Toc218709480"/>
+      <w:bookmarkStart w:id="20" w:name="_Toc220599739"/>
       <w:r>
         <w:rPr>
           <w:lang w:val="en-US"/>
@@ -9836,50 +10639,8 @@
         <w:rPr>
           <w:lang w:val="en-US"/>
         </w:rPr>
-        <w:t xml:space="preserve">BERT, short for Bidirectional Encoder Representations from Transformers, is a machine learning model for natural language processing. It was introduced in the paper "BERT: Pre-training of Deep Bidirectional Transformers for Language Understanding" </w:t>
-      </w:r>
-      <w:sdt>
-        <w:sdtPr>
-          <w:rPr>
-            <w:lang w:val="en-US"/>
-          </w:rPr>
-          <w:id w:val="1126743021"/>
-          <w:citation/>
-        </w:sdtPr>
-        <w:sdtContent>
-          <w:r>
-            <w:rPr>
-              <w:lang w:val="en-US"/>
-            </w:rPr>
-            <w:fldChar w:fldCharType="begin"/>
-          </w:r>
-          <w:r>
-            <w:rPr>
-              <w:lang w:val="en-US"/>
-            </w:rPr>
-            <w:instrText xml:space="preserve"> CITATION Dev18 \l 1033 </w:instrText>
-          </w:r>
-          <w:r>
-            <w:rPr>
-              <w:lang w:val="en-US"/>
-            </w:rPr>
-            <w:fldChar w:fldCharType="separate"/>
-          </w:r>
-          <w:r>
-            <w:rPr>
-              <w:noProof/>
-              <w:lang w:val="en-US"/>
-            </w:rPr>
-            <w:t>(Devlin, Chang, Lee, &amp; Toutanova, 2018)</w:t>
-          </w:r>
-          <w:r>
-            <w:rPr>
-              <w:lang w:val="en-US"/>
-            </w:rPr>
-            <w:fldChar w:fldCharType="end"/>
-          </w:r>
-        </w:sdtContent>
-      </w:sdt>
+        <w:t>BERT, short for Bidirectional Encoder Representations from Transformers, is a machine learning model for natural language processing. It was introduced in the paper "BERT: Pre-training of Deep Bidirectional Transformers for Language Understanding"</w:t>
+      </w:r>
       <w:r>
         <w:rPr>
           <w:lang w:val="en-US"/>
@@ -9903,7 +10664,26 @@
         <w:rPr>
           <w:lang w:val="en-US"/>
         </w:rPr>
-        <w:t>BERT, as the name suggests, is a multi-layer bidirectional Transformer encoder and was trained on a massive dataset of 3.3 billion words. Specifically, BERT was trained on Wikipedia (~2.5B words) and Google's BooksCorpus (~800M words). BERT is pre-trained using two tasks. The first task, "Masked Language Modeling" (MLM), involves masking a percentage of the words in the input, and the model attempts to predict them based on their context. This is also referred to as the Cloze task in literature. The second task is "Next Sentence Prediction" (NSP), which helps the model understand the relationship between sentences, such as whether one sentence follows another.</w:t>
+        <w:t xml:space="preserve">BERT, is a multi-layer bidirectional </w:t>
+      </w:r>
+      <w:r>
+        <w:rPr>
+          <w:lang w:val="en-US"/>
+        </w:rPr>
+        <w:t>t</w:t>
+      </w:r>
+      <w:r>
+        <w:rPr>
+          <w:lang w:val="en-US"/>
+        </w:rPr>
+        <w:t xml:space="preserve">ransformer encoder and was trained on a massive dataset of 3.3 billion words. Specifically, BERT was trained on Wikipedia (~2.5B words) and Google's BooksCorpus (~800M words). BERT is pre-trained using two tasks. The first task, "Masked Language Modeling" (MLM), involves masking a percentage of the words in the input, and the model attempts to predict them based on their context. This is also referred to as the Cloze task in literature. The second task is "Next Sentence Prediction" </w:t>
+      </w:r>
+      <w:r>
+        <w:rPr>
+          <w:lang w:val="en-US"/>
+        </w:rPr>
+        <w:lastRenderedPageBreak/>
+        <w:t>(NSP), which helps the model understand the relationship between sentences, such as whether one sentence follows another.</w:t>
       </w:r>
     </w:p>
     <w:p>
@@ -9928,69 +10708,7 @@
         <w:rPr>
           <w:lang w:val="en-US"/>
         </w:rPr>
-        <w:t xml:space="preserve"> architecture enables extremely efficient parallelization of machine learning training. This massive parallelization makes it feasible to train BERT on large amounts of data in a relatively short period of time. Transformers </w:t>
-      </w:r>
-      <w:r>
-        <w:rPr>
-          <w:lang w:val="en-US"/>
-        </w:rPr>
-        <w:lastRenderedPageBreak/>
-        <w:t>use an attention mechanism to observe relationships between words, a concept originally proposed in the influential paper "Attention Is All You Need"</w:t>
-      </w:r>
-      <w:sdt>
-        <w:sdtPr>
-          <w:rPr>
-            <w:lang w:val="en-US"/>
-          </w:rPr>
-          <w:id w:val="-59645414"/>
-          <w:citation/>
-        </w:sdtPr>
-        <w:sdtContent>
-          <w:r>
-            <w:rPr>
-              <w:lang w:val="en-US"/>
-            </w:rPr>
-            <w:fldChar w:fldCharType="begin"/>
-          </w:r>
-          <w:r>
-            <w:rPr>
-              <w:lang w:val="en-US"/>
-            </w:rPr>
-            <w:instrText xml:space="preserve"> CITATION Vas \l 1033 </w:instrText>
-          </w:r>
-          <w:r>
-            <w:rPr>
-              <w:lang w:val="en-US"/>
-            </w:rPr>
-            <w:fldChar w:fldCharType="separate"/>
-          </w:r>
-          <w:r>
-            <w:rPr>
-              <w:noProof/>
-              <w:lang w:val="en-US"/>
-            </w:rPr>
-            <w:t xml:space="preserve"> </w:t>
-          </w:r>
-          <w:r>
-            <w:rPr>
-              <w:noProof/>
-              <w:lang w:val="en-US"/>
-            </w:rPr>
-            <w:t>(Vaswani, et al., 2017)</w:t>
-          </w:r>
-          <w:r>
-            <w:rPr>
-              <w:lang w:val="en-US"/>
-            </w:rPr>
-            <w:fldChar w:fldCharType="end"/>
-          </w:r>
-        </w:sdtContent>
-      </w:sdt>
-      <w:r>
-        <w:rPr>
-          <w:lang w:val="en-US"/>
-        </w:rPr>
-        <w:t>, which sparked the widespread use of Transformers in NLP models</w:t>
+        <w:t xml:space="preserve"> architecture enables extremely efficient parallelization of machine learning training. This massive parallelization makes it feasible to train BERT on large amounts of data in a relatively short period of time. Transformers use an attention mechanism to observe relationships between words, a concept originally proposed in the influential paper "Attention Is All You Need", which sparked the widespread use of Transformers in NLP models</w:t>
       </w:r>
       <w:r>
         <w:rPr>
@@ -10132,11 +10850,12 @@
           <w:lang w:val="en-US"/>
         </w:rPr>
       </w:pPr>
-      <w:bookmarkStart w:id="21" w:name="_Toc218709481"/>
-      <w:r>
-        <w:rPr>
-          <w:lang w:val="en-US"/>
-        </w:rPr>
+      <w:bookmarkStart w:id="21" w:name="_Toc220599740"/>
+      <w:r>
+        <w:rPr>
+          <w:lang w:val="en-US"/>
+        </w:rPr>
+        <w:lastRenderedPageBreak/>
         <w:t>4. Results</w:t>
       </w:r>
       <w:bookmarkEnd w:id="21"/>
@@ -10152,7 +10871,7 @@
           <w:lang w:val="en-US"/>
         </w:rPr>
       </w:pPr>
-      <w:bookmarkStart w:id="22" w:name="_Toc218709482"/>
+      <w:bookmarkStart w:id="22" w:name="_Toc220599741"/>
       <w:r>
         <w:rPr>
           <w:lang w:val="en-US"/>
@@ -10286,7 +11005,6 @@
         <w:rPr>
           <w:lang w:val="en-US"/>
         </w:rPr>
-        <w:lastRenderedPageBreak/>
         <w:t>The code used for the development and evaluation of the models was written in Python version 3.13.9 with additional libraries including scikit-learn, TensorFlow, PyTorch, FastText, NumPy, pandas, and transformers</w:t>
       </w:r>
       <w:r>
@@ -10612,6 +11330,7 @@
         <w:rPr>
           <w:lang w:val="en-US"/>
         </w:rPr>
+        <w:lastRenderedPageBreak/>
         <w:t>The dataset was split using a 70/30 ratio, resulting in 3,345 tweets for training and 1,434 tweets for testing.</w:t>
       </w:r>
     </w:p>
@@ -10626,7 +11345,7 @@
           <w:lang w:val="en-US"/>
         </w:rPr>
       </w:pPr>
-      <w:bookmarkStart w:id="23" w:name="_Toc218709483"/>
+      <w:bookmarkStart w:id="23" w:name="_Toc220599742"/>
       <w:r>
         <w:rPr>
           <w:lang w:val="en-US"/>
@@ -10833,7 +11552,6 @@
           <w:rFonts w:eastAsiaTheme="minorEastAsia"/>
           <w:lang w:val="en-US"/>
         </w:rPr>
-        <w:lastRenderedPageBreak/>
         <w:t xml:space="preserve">F1 = 2 * </w:t>
       </w:r>
       <m:oMath>
@@ -10991,7 +11709,7 @@
           <w:lang w:val="en-US"/>
         </w:rPr>
       </w:pPr>
-      <w:bookmarkStart w:id="24" w:name="_Toc218709484"/>
+      <w:bookmarkStart w:id="24" w:name="_Toc220599743"/>
       <w:r>
         <w:rPr>
           <w:rFonts w:eastAsiaTheme="minorEastAsia"/>
@@ -11887,7 +12605,7 @@
           <w:lang w:val="en-US"/>
         </w:rPr>
       </w:pPr>
-      <w:bookmarkStart w:id="25" w:name="_Toc218709485"/>
+      <w:bookmarkStart w:id="25" w:name="_Toc220599744"/>
       <w:r>
         <w:rPr>
           <w:lang w:val="en-US"/>
@@ -12610,7 +13328,19 @@
         <w:rPr>
           <w:lang w:val="en-US"/>
         </w:rPr>
-        <w:t>Advance model Confusion Matrix</w:t>
+        <w:t>Advance</w:t>
+      </w:r>
+      <w:r>
+        <w:rPr>
+          <w:lang w:val="en-US"/>
+        </w:rPr>
+        <w:t>d</w:t>
+      </w:r>
+      <w:r>
+        <w:rPr>
+          <w:lang w:val="en-US"/>
+        </w:rPr>
+        <w:t xml:space="preserve"> model Confusion Matrix</w:t>
       </w:r>
     </w:p>
     <w:p>
@@ -12643,7 +13373,7 @@
           <w:lang w:val="en-US"/>
         </w:rPr>
       </w:pPr>
-      <w:bookmarkStart w:id="26" w:name="_Toc218709486"/>
+      <w:bookmarkStart w:id="26" w:name="_Toc220599745"/>
       <w:r>
         <w:rPr>
           <w:lang w:val="en-US"/>
@@ -12795,7 +13525,7 @@
           <w:lang w:val="en-US"/>
         </w:rPr>
       </w:pPr>
-      <w:bookmarkStart w:id="27" w:name="_Toc218709487"/>
+      <w:bookmarkStart w:id="27" w:name="_Toc220599746"/>
       <w:r>
         <w:rPr>
           <w:lang w:val="en-US"/>
@@ -12815,7 +13545,7 @@
           <w:lang w:val="en-US"/>
         </w:rPr>
       </w:pPr>
-      <w:bookmarkStart w:id="28" w:name="_Toc218709488"/>
+      <w:bookmarkStart w:id="28" w:name="_Toc220599747"/>
       <w:r>
         <w:rPr>
           <w:lang w:val="en-US"/>
@@ -12868,7 +13598,7 @@
           <w:lang w:val="en-US"/>
         </w:rPr>
       </w:pPr>
-      <w:bookmarkStart w:id="29" w:name="_Toc218709489"/>
+      <w:bookmarkStart w:id="29" w:name="_Toc220599748"/>
       <w:r>
         <w:rPr>
           <w:lang w:val="en-US"/>
@@ -12951,7 +13681,7 @@
           <w:lang w:val="en-US"/>
         </w:rPr>
       </w:pPr>
-      <w:bookmarkStart w:id="30" w:name="_Toc218709490"/>
+      <w:bookmarkStart w:id="30" w:name="_Toc220599749"/>
       <w:r>
         <w:rPr>
           <w:lang w:val="en-US"/>
@@ -13048,7 +13778,7 @@
           <w:lang w:val="en-US"/>
         </w:rPr>
       </w:pPr>
-      <w:bookmarkStart w:id="31" w:name="_Toc218709491"/>
+      <w:bookmarkStart w:id="31" w:name="_Toc220599750"/>
       <w:r>
         <w:rPr>
           <w:lang w:val="en-US"/>
@@ -13112,7 +13842,31 @@
           <w:lang w:val="en-US"/>
         </w:rPr>
         <w:lastRenderedPageBreak/>
-        <w:t>Parliament, and the Greek portion of OSCAR, which is a filtered version of Common Crawl. Of these three sources, Wikipedia and Greek Parliament proceedings are unlikely to contain offensive language, leaving only OSCAR as a potential source, which resulted in the model having limited context for recognizing offensive language</w:t>
+        <w:t>Parliament, and the Greek portion of OSCAR</w:t>
+      </w:r>
+      <w:r>
+        <w:rPr>
+          <w:lang w:val="en-US"/>
+        </w:rPr>
+        <w:t xml:space="preserve"> (</w:t>
+      </w:r>
+      <w:r>
+        <w:rPr>
+          <w:lang w:val="en-US"/>
+        </w:rPr>
+        <w:t>Open Super-large Crawled Aggregated coRpus</w:t>
+      </w:r>
+      <w:r>
+        <w:rPr>
+          <w:lang w:val="en-US"/>
+        </w:rPr>
+        <w:t>)</w:t>
+      </w:r>
+      <w:r>
+        <w:rPr>
+          <w:lang w:val="en-US"/>
+        </w:rPr>
+        <w:t>, which is a filtered version of Common Crawl. Of these three sources, Wikipedia and Greek Parliament proceedings are unlikely to contain offensive language, leaving only OSCAR as a potential source, which resulted in the model having limited context for recognizing offensive language</w:t>
       </w:r>
       <w:r>
         <w:rPr>
@@ -13151,7 +13905,7 @@
           <w:lang w:val="en-US"/>
         </w:rPr>
       </w:pPr>
-      <w:bookmarkStart w:id="32" w:name="_Toc218709492"/>
+      <w:bookmarkStart w:id="32" w:name="_Toc220599751"/>
       <w:r>
         <w:rPr>
           <w:lang w:val="en-US"/>
@@ -13303,55 +14057,7 @@
         <w:rPr>
           <w:lang w:val="en-US"/>
         </w:rPr>
-        <w:t xml:space="preserve"> to this study is the paper "Offensive Language Identification in Greek" </w:t>
-      </w:r>
-      <w:sdt>
-        <w:sdtPr>
-          <w:rPr>
-            <w:lang w:val="en-US"/>
-          </w:rPr>
-          <w:id w:val="-1875755908"/>
-          <w:citation/>
-        </w:sdtPr>
-        <w:sdtContent>
-          <w:r>
-            <w:rPr>
-              <w:lang w:val="en-US"/>
-            </w:rPr>
-            <w:fldChar w:fldCharType="begin"/>
-          </w:r>
-          <w:r>
-            <w:rPr>
-              <w:lang w:val="en-US"/>
-            </w:rPr>
-            <w:instrText xml:space="preserve"> CITATION Zes20 \l 1033 </w:instrText>
-          </w:r>
-          <w:r>
-            <w:rPr>
-              <w:lang w:val="en-US"/>
-            </w:rPr>
-            <w:fldChar w:fldCharType="separate"/>
-          </w:r>
-          <w:r>
-            <w:rPr>
-              <w:noProof/>
-              <w:lang w:val="en-US"/>
-            </w:rPr>
-            <w:t>(Pitenis, Zampieri, &amp; Ranasinghe, 2020)</w:t>
-          </w:r>
-          <w:r>
-            <w:rPr>
-              <w:lang w:val="en-US"/>
-            </w:rPr>
-            <w:fldChar w:fldCharType="end"/>
-          </w:r>
-        </w:sdtContent>
-      </w:sdt>
-      <w:r>
-        <w:rPr>
-          <w:lang w:val="en-US"/>
-        </w:rPr>
-        <w:t xml:space="preserve">, which introduced the OGTD dataset used in this research. Multiple classical machine learning and deep learning models were trained and evaluated on the same task using the </w:t>
+        <w:t xml:space="preserve"> to this study is the paper "Offensive Language Identification in Greek", which introduced the OGTD dataset used in this research. Multiple classical machine learning and deep learning models were trained and evaluated on the same task using the </w:t>
       </w:r>
       <w:r>
         <w:rPr>
@@ -13452,55 +14158,7 @@
         <w:rPr>
           <w:lang w:val="en-US"/>
         </w:rPr>
-        <w:t xml:space="preserve">More critically, in "Offensive Language Identification in Greek" </w:t>
-      </w:r>
-      <w:sdt>
-        <w:sdtPr>
-          <w:rPr>
-            <w:lang w:val="en-US"/>
-          </w:rPr>
-          <w:id w:val="1021984764"/>
-          <w:citation/>
-        </w:sdtPr>
-        <w:sdtContent>
-          <w:r>
-            <w:rPr>
-              <w:lang w:val="en-US"/>
-            </w:rPr>
-            <w:fldChar w:fldCharType="begin"/>
-          </w:r>
-          <w:r>
-            <w:rPr>
-              <w:lang w:val="en-US"/>
-            </w:rPr>
-            <w:instrText xml:space="preserve"> CITATION Zes20 \l 1033 </w:instrText>
-          </w:r>
-          <w:r>
-            <w:rPr>
-              <w:lang w:val="en-US"/>
-            </w:rPr>
-            <w:fldChar w:fldCharType="separate"/>
-          </w:r>
-          <w:r>
-            <w:rPr>
-              <w:noProof/>
-              <w:lang w:val="en-US"/>
-            </w:rPr>
-            <w:t>(Pitenis, Zampieri, &amp; Ranasinghe, 2020)</w:t>
-          </w:r>
-          <w:r>
-            <w:rPr>
-              <w:lang w:val="en-US"/>
-            </w:rPr>
-            <w:fldChar w:fldCharType="end"/>
-          </w:r>
-        </w:sdtContent>
-      </w:sdt>
-      <w:r>
-        <w:rPr>
-          <w:lang w:val="en-US"/>
-        </w:rPr>
-        <w:t xml:space="preserve">, the BERT model produced the lowest results among all deep learning models, with a macro-average F1 score of 73%. For reference, the other deep learning models in that study achieved F1 scores ranging from 87% to 89%. The advanced model in this study achieved 84%, representing an improvement over the BERT results </w:t>
+        <w:t xml:space="preserve">More critically, in "Offensive Language Identification in Greek", the BERT model produced the lowest results among all deep learning models, with a macro-average F1 score of 73%. For reference, the other deep learning models in that study achieved F1 scores ranging from 87% to 89%. The advanced model in this study achieved 84%, representing an improvement over the BERT results </w:t>
       </w:r>
       <w:r>
         <w:rPr>
@@ -13560,55 +14218,7 @@
         <w:rPr>
           <w:lang w:val="en-US"/>
         </w:rPr>
-        <w:t xml:space="preserve">The advanced model was also compared to results from two other papers focusing exclusively on toxicity analysis in Greek text. First, "Toxicity Detection on Greek Tweets" </w:t>
-      </w:r>
-      <w:sdt>
-        <w:sdtPr>
-          <w:rPr>
-            <w:lang w:val="en-US"/>
-          </w:rPr>
-          <w:id w:val="-572581503"/>
-          <w:citation/>
-        </w:sdtPr>
-        <w:sdtContent>
-          <w:r>
-            <w:rPr>
-              <w:lang w:val="en-US"/>
-            </w:rPr>
-            <w:fldChar w:fldCharType="begin"/>
-          </w:r>
-          <w:r>
-            <w:rPr>
-              <w:lang w:val="en-US"/>
-            </w:rPr>
-            <w:instrText xml:space="preserve"> CITATION Ana21 \l 1033 </w:instrText>
-          </w:r>
-          <w:r>
-            <w:rPr>
-              <w:lang w:val="en-US"/>
-            </w:rPr>
-            <w:fldChar w:fldCharType="separate"/>
-          </w:r>
-          <w:r>
-            <w:rPr>
-              <w:noProof/>
-              <w:lang w:val="en-US"/>
-            </w:rPr>
-            <w:t>(Anagnostopoulos, 2021)</w:t>
-          </w:r>
-          <w:r>
-            <w:rPr>
-              <w:lang w:val="en-US"/>
-            </w:rPr>
-            <w:fldChar w:fldCharType="end"/>
-          </w:r>
-        </w:sdtContent>
-      </w:sdt>
-      <w:r>
-        <w:rPr>
-          <w:lang w:val="en-US"/>
-        </w:rPr>
-        <w:t xml:space="preserve"> was examined. In his master's thesis, Anagnostopoulos employed GreekBERT along with two other BERT variants and one GRU model. His F1 </w:t>
+        <w:t xml:space="preserve">The advanced model was also compared to results from two other papers focusing exclusively on toxicity analysis in Greek text. First, "Toxicity Detection on Greek Tweets"  was examined. In his master's thesis, Anagnostopoulos employed GreekBERT along with two other BERT variants and one GRU model. His F1 </w:t>
       </w:r>
       <w:r>
         <w:rPr>
@@ -13633,62 +14243,14 @@
         <w:rPr>
           <w:lang w:val="en-US"/>
         </w:rPr>
-        <w:t xml:space="preserve">Second, a comparison was made to "Multimodal Hate Speech Detection in Greek Social Media" </w:t>
-      </w:r>
-      <w:sdt>
-        <w:sdtPr>
-          <w:rPr>
-            <w:lang w:val="en-US"/>
-          </w:rPr>
-          <w:id w:val="2101593872"/>
-          <w:citation/>
-        </w:sdtPr>
-        <w:sdtContent>
-          <w:r>
-            <w:rPr>
-              <w:lang w:val="en-US"/>
-            </w:rPr>
-            <w:fldChar w:fldCharType="begin"/>
-          </w:r>
-          <w:r>
-            <w:rPr>
-              <w:lang w:val="en-US"/>
-            </w:rPr>
-            <w:instrText xml:space="preserve"> CITATION Kon21 \l 1033 </w:instrText>
-          </w:r>
-          <w:r>
-            <w:rPr>
-              <w:lang w:val="en-US"/>
-            </w:rPr>
-            <w:fldChar w:fldCharType="separate"/>
-          </w:r>
-          <w:r>
-            <w:rPr>
-              <w:noProof/>
-              <w:lang w:val="en-US"/>
-            </w:rPr>
-            <w:t>(Perifanos &amp; Goutsos, 2021)</w:t>
-          </w:r>
-          <w:r>
-            <w:rPr>
-              <w:lang w:val="en-US"/>
-            </w:rPr>
-            <w:fldChar w:fldCharType="end"/>
-          </w:r>
-        </w:sdtContent>
-      </w:sdt>
-      <w:r>
-        <w:rPr>
-          <w:lang w:val="en-US"/>
-        </w:rPr>
-        <w:t xml:space="preserve">, in which the authors also used GreekBERT and </w:t>
+        <w:t xml:space="preserve">Second, a comparison was made to "Multimodal Hate Speech Detection in Greek Social Media", in which the authors also used GreekBERT and employed the same preprocessing strategy of removing accents and converting all letters to lowercase. In that study, </w:t>
       </w:r>
       <w:r>
         <w:rPr>
           <w:lang w:val="en-US"/>
         </w:rPr>
         <w:lastRenderedPageBreak/>
-        <w:t>employed the same preprocessing strategy of removing accents and converting all letters to lowercase. In that study, Perifanos and Goutsos used text in combination with accompanying media (images), leading to substantially higher accuracy. Their GreekBERT model achieved an impressive F1 score of 93%, a difference of 9% from the model in this study. This significant difference can be attributed to the multimodal approach, which incorporates visual information alongside textual data.</w:t>
+        <w:t>Perifanos and Goutsos used text in combination with accompanying media (images), leading to substantially higher accuracy. Their GreekBERT model achieved an impressive F1 score of 93%, a difference of 9% from the model in this study. This significant difference can be attributed to the multimodal approach, which incorporates visual information alongside textual data.</w:t>
       </w:r>
     </w:p>
     <w:p>
@@ -13718,55 +14280,7 @@
         <w:rPr>
           <w:lang w:val="en-US"/>
         </w:rPr>
-        <w:t xml:space="preserve">Analysis of the results from "Offensive Language Identification in Greek" </w:t>
-      </w:r>
-      <w:sdt>
-        <w:sdtPr>
-          <w:rPr>
-            <w:lang w:val="en-US"/>
-          </w:rPr>
-          <w:id w:val="834109100"/>
-          <w:citation/>
-        </w:sdtPr>
-        <w:sdtContent>
-          <w:r>
-            <w:rPr>
-              <w:lang w:val="en-US"/>
-            </w:rPr>
-            <w:fldChar w:fldCharType="begin"/>
-          </w:r>
-          <w:r>
-            <w:rPr>
-              <w:lang w:val="en-US"/>
-            </w:rPr>
-            <w:instrText xml:space="preserve"> CITATION Zes20 \l 1033 </w:instrText>
-          </w:r>
-          <w:r>
-            <w:rPr>
-              <w:lang w:val="en-US"/>
-            </w:rPr>
-            <w:fldChar w:fldCharType="separate"/>
-          </w:r>
-          <w:r>
-            <w:rPr>
-              <w:noProof/>
-              <w:lang w:val="en-US"/>
-            </w:rPr>
-            <w:t>(Pitenis, Zampieri, &amp; Ranasinghe, 2020)</w:t>
-          </w:r>
-          <w:r>
-            <w:rPr>
-              <w:lang w:val="en-US"/>
-            </w:rPr>
-            <w:fldChar w:fldCharType="end"/>
-          </w:r>
-        </w:sdtContent>
-      </w:sdt>
-      <w:r>
-        <w:rPr>
-          <w:lang w:val="en-US"/>
-        </w:rPr>
-        <w:t xml:space="preserve"> reveals a similar performance pattern to that observed in this study: all models performed well in classifying non-offensive tweets but demonstrated reduced performance in classifying offensive tweets. This pattern suggests that, given the same dataset, the models developed in this study performed as expected for each label, with results consistent with those reported in the original study.</w:t>
+        <w:t>Analysis of the results from "Offensive Language Identification in Greek" reveals a similar performance pattern to that observed in this study: all models performed well in classifying non-offensive tweets but demonstrated reduced performance in classifying offensive tweets. This pattern suggests that, given the same dataset, the models developed in this study performed as expected for each label, with results consistent with those reported in the original study.</w:t>
       </w:r>
     </w:p>
     <w:p>
@@ -13805,7 +14319,7 @@
           <w:lang w:val="en-US"/>
         </w:rPr>
       </w:pPr>
-      <w:bookmarkStart w:id="33" w:name="_Toc218709493"/>
+      <w:bookmarkStart w:id="33" w:name="_Toc220599752"/>
       <w:r>
         <w:rPr>
           <w:lang w:val="en-US"/>
@@ -13831,7 +14345,7 @@
           <w:lang w:val="en-US"/>
         </w:rPr>
       </w:pPr>
-      <w:bookmarkStart w:id="34" w:name="_Toc218709494"/>
+      <w:bookmarkStart w:id="34" w:name="_Toc220599753"/>
       <w:r>
         <w:rPr>
           <w:lang w:val="en-US"/>
@@ -13864,45 +14378,45 @@
           <w:lang w:val="en-US"/>
         </w:rPr>
       </w:pPr>
-      <w:bookmarkStart w:id="35" w:name="_Toc218709495"/>
+      <w:bookmarkStart w:id="35" w:name="_Toc220599754"/>
+      <w:r>
+        <w:rPr>
+          <w:lang w:val="en-US"/>
+        </w:rPr>
+        <w:t>6.2 Key Finding</w:t>
+      </w:r>
+      <w:r>
+        <w:rPr>
+          <w:lang w:val="en-US"/>
+        </w:rPr>
+        <w:t>s</w:t>
+      </w:r>
+      <w:bookmarkEnd w:id="35"/>
+    </w:p>
+    <w:p>
+      <w:pPr>
+        <w:rPr>
+          <w:lang w:val="en-US"/>
+        </w:rPr>
+      </w:pPr>
+      <w:r>
+        <w:rPr>
+          <w:lang w:val="en-US"/>
+        </w:rPr>
+        <w:t>Throughout this study, the critical impact of preprocessing on languages such as Greek, which include diacritics, was clearly demonstrated. Through the preprocessing process, a performance increase was observed in all models regardless of complexity.</w:t>
+      </w:r>
+    </w:p>
+    <w:p>
+      <w:pPr>
+        <w:rPr>
+          <w:lang w:val="en-US"/>
+        </w:rPr>
+      </w:pPr>
       <w:r>
         <w:rPr>
           <w:lang w:val="en-US"/>
         </w:rPr>
         <w:lastRenderedPageBreak/>
-        <w:t>6.2 Key Finding</w:t>
-      </w:r>
-      <w:r>
-        <w:rPr>
-          <w:lang w:val="en-US"/>
-        </w:rPr>
-        <w:t>s</w:t>
-      </w:r>
-      <w:bookmarkEnd w:id="35"/>
-    </w:p>
-    <w:p>
-      <w:pPr>
-        <w:rPr>
-          <w:lang w:val="en-US"/>
-        </w:rPr>
-      </w:pPr>
-      <w:r>
-        <w:rPr>
-          <w:lang w:val="en-US"/>
-        </w:rPr>
-        <w:t>Throughout this study, the critical impact of preprocessing on languages such as Greek, which include diacritics, was clearly demonstrated. Through the preprocessing process, a performance increase was observed in all models regardless of complexity.</w:t>
-      </w:r>
-    </w:p>
-    <w:p>
-      <w:pPr>
-        <w:rPr>
-          <w:lang w:val="en-US"/>
-        </w:rPr>
-      </w:pPr>
-      <w:r>
-        <w:rPr>
-          <w:lang w:val="en-US"/>
-        </w:rPr>
         <w:t xml:space="preserve">The </w:t>
       </w:r>
       <w:r>
@@ -13961,7 +14475,7 @@
           <w:lang w:val="en-US"/>
         </w:rPr>
       </w:pPr>
-      <w:bookmarkStart w:id="36" w:name="_Toc218709496"/>
+      <w:bookmarkStart w:id="36" w:name="_Toc220599755"/>
       <w:r>
         <w:rPr>
           <w:lang w:val="en-US"/>
@@ -13981,7 +14495,7 @@
           <w:lang w:val="en-US"/>
         </w:rPr>
       </w:pPr>
-      <w:bookmarkStart w:id="37" w:name="_Toc218709497"/>
+      <w:bookmarkStart w:id="37" w:name="_Toc220599756"/>
       <w:r>
         <w:rPr>
           <w:lang w:val="en-US"/>
@@ -14014,12 +14528,11 @@
           <w:lang w:val="en-US"/>
         </w:rPr>
       </w:pPr>
-      <w:bookmarkStart w:id="38" w:name="_Toc218709498"/>
-      <w:r>
-        <w:rPr>
-          <w:lang w:val="en-US"/>
-        </w:rPr>
-        <w:lastRenderedPageBreak/>
+      <w:bookmarkStart w:id="38" w:name="_Toc220599757"/>
+      <w:r>
+        <w:rPr>
+          <w:lang w:val="en-US"/>
+        </w:rPr>
         <w:t>7.2</w:t>
       </w:r>
       <w:r>
@@ -14050,22 +14563,7 @@
         </w:rPr>
       </w:pPr>
     </w:p>
-    <w:p>
-      <w:pPr>
-        <w:rPr>
-          <w:lang w:val="en-US"/>
-        </w:rPr>
-      </w:pPr>
-      <w:r>
-        <w:rPr>
-          <w:rFonts w:cs="Times New Roman"/>
-          <w:i/>
-          <w:lang w:val="en-US"/>
-        </w:rPr>
-        <w:br w:type="page"/>
-      </w:r>
-    </w:p>
-    <w:bookmarkStart w:id="39" w:name="_Toc218709499" w:displacedByCustomXml="next"/>
+    <w:bookmarkStart w:id="39" w:name="_Toc220599758" w:displacedByCustomXml="next"/>
     <w:sdt>
       <w:sdtPr>
         <w:rPr>
@@ -14118,6 +14616,7 @@
                 <w:rPr>
                   <w:noProof/>
                   <w:szCs w:val="24"/>
+                  <w:lang w:val="en-US"/>
                 </w:rPr>
               </w:pPr>
               <w:r>
@@ -14135,6 +14634,7 @@
               <w:r>
                 <w:rPr>
                   <w:noProof/>
+                  <w:lang w:val="en-US"/>
                 </w:rPr>
                 <w:t xml:space="preserve">Anagnostopoulos, T. (2021). </w:t>
               </w:r>
@@ -14143,12 +14643,14 @@
                   <w:i/>
                   <w:iCs/>
                   <w:noProof/>
+                  <w:lang w:val="en-US"/>
                 </w:rPr>
                 <w:t>Toxicity Detection on Greek Tweets.</w:t>
               </w:r>
               <w:r>
                 <w:rPr>
                   <w:noProof/>
+                  <w:lang w:val="en-US"/>
                 </w:rPr>
                 <w:t xml:space="preserve"> Athens.</w:t>
               </w:r>
@@ -14159,11 +14661,13 @@
                 <w:ind w:left="720" w:hanging="720"/>
                 <w:rPr>
                   <w:noProof/>
+                  <w:lang w:val="en-US"/>
                 </w:rPr>
               </w:pPr>
               <w:r>
                 <w:rPr>
                   <w:noProof/>
+                  <w:lang w:val="en-US"/>
                 </w:rPr>
                 <w:t xml:space="preserve">Bojanowski, P., Grave, E., Joulin, A., &amp; Mikolov, T. (2017). </w:t>
               </w:r>
@@ -14172,12 +14676,560 @@
                   <w:i/>
                   <w:iCs/>
                   <w:noProof/>
+                  <w:lang w:val="en-US"/>
                 </w:rPr>
                 <w:t>Enriching Word Vectors with Subword Information.</w:t>
               </w:r>
               <w:r>
                 <w:rPr>
                   <w:noProof/>
+                  <w:lang w:val="en-US"/>
+                </w:rPr>
+                <w:t xml:space="preserve"> </w:t>
+              </w:r>
+            </w:p>
+            <w:p>
+              <w:pPr>
+                <w:pStyle w:val="Bibliography"/>
+                <w:ind w:left="720" w:hanging="720"/>
+                <w:rPr>
+                  <w:noProof/>
+                  <w:lang w:val="en-US"/>
+                </w:rPr>
+              </w:pPr>
+              <w:r>
+                <w:rPr>
+                  <w:noProof/>
+                  <w:lang w:val="en-US"/>
+                </w:rPr>
+                <w:t xml:space="preserve">Cho, K., Merrienboer, B. v., Bahdanau, C. G., Bougares, F., Schwenk, H., &amp; Bengio, Y. (2014). </w:t>
+              </w:r>
+              <w:r>
+                <w:rPr>
+                  <w:i/>
+                  <w:iCs/>
+                  <w:noProof/>
+                  <w:lang w:val="en-US"/>
+                </w:rPr>
+                <w:t>Learning Phrase Representations using RNN Encoder–Decoder.</w:t>
+              </w:r>
+              <w:r>
+                <w:rPr>
+                  <w:noProof/>
+                  <w:lang w:val="en-US"/>
+                </w:rPr>
+                <w:t xml:space="preserve"> </w:t>
+              </w:r>
+            </w:p>
+            <w:p>
+              <w:pPr>
+                <w:pStyle w:val="Bibliography"/>
+                <w:ind w:left="720" w:hanging="720"/>
+                <w:rPr>
+                  <w:noProof/>
+                  <w:lang w:val="en-US"/>
+                </w:rPr>
+              </w:pPr>
+              <w:r>
+                <w:rPr>
+                  <w:noProof/>
+                  <w:lang w:val="en-US"/>
+                </w:rPr>
+                <w:t xml:space="preserve">Devlin, J., Chang, M.-W., Lee, K., &amp; Toutanova, K. (2018). </w:t>
+              </w:r>
+              <w:r>
+                <w:rPr>
+                  <w:i/>
+                  <w:iCs/>
+                  <w:noProof/>
+                  <w:lang w:val="en-US"/>
+                </w:rPr>
+                <w:t>BERT: Pre-training of Deep Bidirectional Transformers for.</w:t>
+              </w:r>
+              <w:r>
+                <w:rPr>
+                  <w:noProof/>
+                  <w:lang w:val="en-US"/>
+                </w:rPr>
+                <w:t xml:space="preserve"> </w:t>
+              </w:r>
+            </w:p>
+            <w:p>
+              <w:pPr>
+                <w:pStyle w:val="Bibliography"/>
+                <w:ind w:left="720" w:hanging="720"/>
+                <w:rPr>
+                  <w:noProof/>
+                  <w:lang w:val="en-US"/>
+                </w:rPr>
+              </w:pPr>
+              <w:r>
+                <w:rPr>
+                  <w:noProof/>
+                  <w:lang w:val="en-US"/>
+                </w:rPr>
+                <w:t xml:space="preserve">Duchi, J., Hazan, E., &amp; Singer, Y. (2011). Adaptive Subgradient Methods for. </w:t>
+              </w:r>
+              <w:r>
+                <w:rPr>
+                  <w:i/>
+                  <w:iCs/>
+                  <w:noProof/>
+                  <w:lang w:val="en-US"/>
+                </w:rPr>
+                <w:t>Journal of Machine Learning Research 12</w:t>
+              </w:r>
+              <w:r>
+                <w:rPr>
+                  <w:noProof/>
+                  <w:lang w:val="en-US"/>
+                </w:rPr>
+                <w:t>.</w:t>
+              </w:r>
+            </w:p>
+            <w:p>
+              <w:pPr>
+                <w:pStyle w:val="Bibliography"/>
+                <w:ind w:left="720" w:hanging="720"/>
+                <w:rPr>
+                  <w:noProof/>
+                  <w:lang w:val="en-US"/>
+                </w:rPr>
+              </w:pPr>
+              <w:r>
+                <w:rPr>
+                  <w:noProof/>
+                  <w:lang w:val="en-US"/>
+                </w:rPr>
+                <w:t xml:space="preserve">ELSTAT. (2023). </w:t>
+              </w:r>
+              <w:r>
+                <w:rPr>
+                  <w:i/>
+                  <w:iCs/>
+                  <w:noProof/>
+                  <w:lang w:val="en-US"/>
+                </w:rPr>
+                <w:t>SURVEY ON THE USE OF INFORMATION AND COMMUNICATION TECHNOLOGIES.</w:t>
+              </w:r>
+              <w:r>
+                <w:rPr>
+                  <w:noProof/>
+                  <w:lang w:val="en-US"/>
+                </w:rPr>
+                <w:t xml:space="preserve"> </w:t>
+              </w:r>
+            </w:p>
+            <w:p>
+              <w:pPr>
+                <w:pStyle w:val="Bibliography"/>
+                <w:ind w:left="720" w:hanging="720"/>
+                <w:rPr>
+                  <w:noProof/>
+                  <w:lang w:val="en-US"/>
+                </w:rPr>
+              </w:pPr>
+              <w:r>
+                <w:rPr>
+                  <w:noProof/>
+                  <w:lang w:val="en-US"/>
+                </w:rPr>
+                <w:t xml:space="preserve">Hochreiter, S., &amp; Schmidhuber, J. (1997). </w:t>
+              </w:r>
+              <w:r>
+                <w:rPr>
+                  <w:i/>
+                  <w:iCs/>
+                  <w:noProof/>
+                  <w:lang w:val="en-US"/>
+                </w:rPr>
+                <w:t>Long Short-Term Memory. Neural Computation.</w:t>
+              </w:r>
+              <w:r>
+                <w:rPr>
+                  <w:noProof/>
+                  <w:lang w:val="en-US"/>
+                </w:rPr>
+                <w:t xml:space="preserve"> </w:t>
+              </w:r>
+            </w:p>
+            <w:p>
+              <w:pPr>
+                <w:pStyle w:val="Bibliography"/>
+                <w:ind w:left="720" w:hanging="720"/>
+                <w:rPr>
+                  <w:noProof/>
+                  <w:lang w:val="en-US"/>
+                </w:rPr>
+              </w:pPr>
+              <w:r>
+                <w:rPr>
+                  <w:noProof/>
+                  <w:lang w:val="en-US"/>
+                </w:rPr>
+                <w:t xml:space="preserve">Jones, K. S. (1972). </w:t>
+              </w:r>
+              <w:r>
+                <w:rPr>
+                  <w:i/>
+                  <w:iCs/>
+                  <w:noProof/>
+                  <w:lang w:val="en-US"/>
+                </w:rPr>
+                <w:t>A statistical interpretation of term specificity.</w:t>
+              </w:r>
+              <w:r>
+                <w:rPr>
+                  <w:noProof/>
+                  <w:lang w:val="en-US"/>
+                </w:rPr>
+                <w:t xml:space="preserve"> University of Cambridge.</w:t>
+              </w:r>
+            </w:p>
+            <w:p>
+              <w:pPr>
+                <w:pStyle w:val="Bibliography"/>
+                <w:ind w:left="720" w:hanging="720"/>
+                <w:rPr>
+                  <w:noProof/>
+                  <w:lang w:val="en-US"/>
+                </w:rPr>
+              </w:pPr>
+              <w:r>
+                <w:rPr>
+                  <w:noProof/>
+                  <w:lang w:val="en-US"/>
+                </w:rPr>
+                <w:t xml:space="preserve">Kingma, D. P., &amp; Ba, J. L. (2015). Adam: A method for stochastic optimization. </w:t>
+              </w:r>
+              <w:r>
+                <w:rPr>
+                  <w:i/>
+                  <w:iCs/>
+                  <w:noProof/>
+                  <w:lang w:val="en-US"/>
+                </w:rPr>
+                <w:t>ICLR conference.</w:t>
+              </w:r>
+              <w:r>
+                <w:rPr>
+                  <w:noProof/>
+                  <w:lang w:val="en-US"/>
+                </w:rPr>
+                <w:t xml:space="preserve"> San Diego.</w:t>
+              </w:r>
+            </w:p>
+            <w:p>
+              <w:pPr>
+                <w:pStyle w:val="Bibliography"/>
+                <w:ind w:left="720" w:hanging="720"/>
+                <w:rPr>
+                  <w:noProof/>
+                  <w:lang w:val="en-US"/>
+                </w:rPr>
+              </w:pPr>
+              <w:r>
+                <w:rPr>
+                  <w:noProof/>
+                  <w:lang w:val="en-US"/>
+                </w:rPr>
+                <w:t xml:space="preserve">Koehn, P. (2005). Europarl: A Parallel Corpus for Statistical Machine Translation. </w:t>
+              </w:r>
+              <w:r>
+                <w:rPr>
+                  <w:i/>
+                  <w:iCs/>
+                  <w:noProof/>
+                  <w:lang w:val="en-US"/>
+                </w:rPr>
+                <w:t>Machine Translation Summit X: Papers</w:t>
+              </w:r>
+              <w:r>
+                <w:rPr>
+                  <w:noProof/>
+                  <w:lang w:val="en-US"/>
+                </w:rPr>
+                <w:t>, (p. 8). Phuket, Thailand.</w:t>
+              </w:r>
+            </w:p>
+            <w:p>
+              <w:pPr>
+                <w:pStyle w:val="Bibliography"/>
+                <w:ind w:left="720" w:hanging="720"/>
+                <w:rPr>
+                  <w:noProof/>
+                  <w:lang w:val="en-US"/>
+                </w:rPr>
+              </w:pPr>
+              <w:r>
+                <w:rPr>
+                  <w:noProof/>
+                  <w:lang w:val="en-US"/>
+                </w:rPr>
+                <w:t xml:space="preserve">Koutsikakis, J., Chalkidis, I., Malakasiotis, P., &amp; Androutsopoulos, I. (2020). </w:t>
+              </w:r>
+              <w:r>
+                <w:rPr>
+                  <w:i/>
+                  <w:iCs/>
+                  <w:noProof/>
+                  <w:lang w:val="en-US"/>
+                </w:rPr>
+                <w:t>GREEK-BERT: The Greeks visiting Sesame Street.</w:t>
+              </w:r>
+              <w:r>
+                <w:rPr>
+                  <w:noProof/>
+                  <w:lang w:val="en-US"/>
+                </w:rPr>
+                <w:t xml:space="preserve"> </w:t>
+              </w:r>
+            </w:p>
+            <w:p>
+              <w:pPr>
+                <w:pStyle w:val="Bibliography"/>
+                <w:ind w:left="720" w:hanging="720"/>
+                <w:rPr>
+                  <w:noProof/>
+                  <w:lang w:val="en-US"/>
+                </w:rPr>
+              </w:pPr>
+              <w:r>
+                <w:rPr>
+                  <w:noProof/>
+                  <w:lang w:val="en-US"/>
+                </w:rPr>
+                <w:t xml:space="preserve">Liu, Y., Ott, M., Goyal, N., Du, J., Joshi, M., Chen, D., . . . Stoyanov, V. (2019). </w:t>
+              </w:r>
+              <w:r>
+                <w:rPr>
+                  <w:i/>
+                  <w:iCs/>
+                  <w:noProof/>
+                  <w:lang w:val="en-US"/>
+                </w:rPr>
+                <w:t>RoBERTa: A Robustly Optimized BERT Pretraining Approach.</w:t>
+              </w:r>
+              <w:r>
+                <w:rPr>
+                  <w:noProof/>
+                  <w:lang w:val="en-US"/>
+                </w:rPr>
+                <w:t xml:space="preserve"> </w:t>
+              </w:r>
+            </w:p>
+            <w:p>
+              <w:pPr>
+                <w:pStyle w:val="Bibliography"/>
+                <w:ind w:left="720" w:hanging="720"/>
+                <w:rPr>
+                  <w:noProof/>
+                  <w:lang w:val="en-US"/>
+                </w:rPr>
+              </w:pPr>
+              <w:r>
+                <w:rPr>
+                  <w:noProof/>
+                  <w:lang w:val="en-US"/>
+                </w:rPr>
+                <w:lastRenderedPageBreak/>
+                <w:t xml:space="preserve">Madriaza, P., Hassan, G., Brouillette-Alarie, S., Mounchingam, A. N., Durocher-Corfa, L., Borokhovski, E., . . . Paillé, S. (2025). </w:t>
+              </w:r>
+              <w:r>
+                <w:rPr>
+                  <w:i/>
+                  <w:iCs/>
+                  <w:noProof/>
+                  <w:lang w:val="en-US"/>
+                </w:rPr>
+                <w:t>Exposure to hate in online and traditional media: A systematic review and meta‐analysis of the impact of this exposure on individuals and communities.</w:t>
+              </w:r>
+              <w:r>
+                <w:rPr>
+                  <w:noProof/>
+                  <w:lang w:val="en-US"/>
+                </w:rPr>
+                <w:t xml:space="preserve"> </w:t>
+              </w:r>
+            </w:p>
+            <w:p>
+              <w:pPr>
+                <w:pStyle w:val="Bibliography"/>
+                <w:ind w:left="720" w:hanging="720"/>
+                <w:rPr>
+                  <w:noProof/>
+                  <w:lang w:val="en-US"/>
+                </w:rPr>
+              </w:pPr>
+              <w:r>
+                <w:rPr>
+                  <w:noProof/>
+                  <w:lang w:val="en-US"/>
+                </w:rPr>
+                <w:t xml:space="preserve">Mikolov, T., Chen, K., Corrado, G., &amp; Dean, J. (2013). </w:t>
+              </w:r>
+              <w:r>
+                <w:rPr>
+                  <w:i/>
+                  <w:iCs/>
+                  <w:noProof/>
+                  <w:lang w:val="en-US"/>
+                </w:rPr>
+                <w:t>Efficient Estimation of Word Representations in.</w:t>
+              </w:r>
+              <w:r>
+                <w:rPr>
+                  <w:noProof/>
+                  <w:lang w:val="en-US"/>
+                </w:rPr>
+                <w:t xml:space="preserve"> </w:t>
+              </w:r>
+            </w:p>
+            <w:p>
+              <w:pPr>
+                <w:pStyle w:val="Bibliography"/>
+                <w:ind w:left="720" w:hanging="720"/>
+                <w:rPr>
+                  <w:noProof/>
+                  <w:lang w:val="en-US"/>
+                </w:rPr>
+              </w:pPr>
+              <w:r>
+                <w:rPr>
+                  <w:noProof/>
+                  <w:lang w:val="en-US"/>
+                </w:rPr>
+                <w:t>Perifanos, K., &amp; Goutsos, D. (2021). Multimodal Hate Speech Detection in Greek Social Media.</w:t>
+              </w:r>
+            </w:p>
+            <w:p>
+              <w:pPr>
+                <w:pStyle w:val="Bibliography"/>
+                <w:ind w:left="720" w:hanging="720"/>
+                <w:rPr>
+                  <w:noProof/>
+                  <w:lang w:val="en-US"/>
+                </w:rPr>
+              </w:pPr>
+              <w:r>
+                <w:rPr>
+                  <w:noProof/>
+                  <w:lang w:val="en-US"/>
+                </w:rPr>
+                <w:t xml:space="preserve">Pitenis, Z., Zampieri, M., &amp; Ranasinghe, T. (2020). </w:t>
+              </w:r>
+              <w:r>
+                <w:rPr>
+                  <w:i/>
+                  <w:iCs/>
+                  <w:noProof/>
+                  <w:lang w:val="en-US"/>
+                </w:rPr>
+                <w:t>Offensive Language Identification in Greek.</w:t>
+              </w:r>
+              <w:r>
+                <w:rPr>
+                  <w:noProof/>
+                  <w:lang w:val="en-US"/>
+                </w:rPr>
+                <w:t xml:space="preserve"> </w:t>
+              </w:r>
+            </w:p>
+            <w:p>
+              <w:pPr>
+                <w:pStyle w:val="Bibliography"/>
+                <w:ind w:left="720" w:hanging="720"/>
+                <w:rPr>
+                  <w:noProof/>
+                  <w:lang w:val="en-US"/>
+                </w:rPr>
+              </w:pPr>
+              <w:r>
+                <w:rPr>
+                  <w:noProof/>
+                  <w:lang w:val="en-US"/>
+                </w:rPr>
+                <w:t xml:space="preserve">Schuster, M., &amp; Paliwal, K. K. (1997). </w:t>
+              </w:r>
+              <w:r>
+                <w:rPr>
+                  <w:i/>
+                  <w:iCs/>
+                  <w:noProof/>
+                  <w:lang w:val="en-US"/>
+                </w:rPr>
+                <w:t>Bidirectional Recurrent Neural Networks.</w:t>
+              </w:r>
+              <w:r>
+                <w:rPr>
+                  <w:noProof/>
+                  <w:lang w:val="en-US"/>
+                </w:rPr>
+                <w:t xml:space="preserve"> </w:t>
+              </w:r>
+            </w:p>
+            <w:p>
+              <w:pPr>
+                <w:pStyle w:val="Bibliography"/>
+                <w:ind w:left="720" w:hanging="720"/>
+                <w:rPr>
+                  <w:noProof/>
+                  <w:lang w:val="en-US"/>
+                </w:rPr>
+              </w:pPr>
+              <w:r>
+                <w:rPr>
+                  <w:noProof/>
+                  <w:lang w:val="en-US"/>
+                </w:rPr>
+                <w:t xml:space="preserve">Shmulewitz, D. (2025). </w:t>
+              </w:r>
+              <w:r>
+                <w:rPr>
+                  <w:i/>
+                  <w:iCs/>
+                  <w:noProof/>
+                  <w:lang w:val="en-US"/>
+                </w:rPr>
+                <w:t>Exposure to online hate speech is positively associated with post-traumatic stress disorder symptom severity.</w:t>
+              </w:r>
+              <w:r>
+                <w:rPr>
+                  <w:noProof/>
+                  <w:lang w:val="en-US"/>
+                </w:rPr>
+                <w:t xml:space="preserve"> Jerusalem.</w:t>
+              </w:r>
+            </w:p>
+            <w:p>
+              <w:pPr>
+                <w:pStyle w:val="Bibliography"/>
+                <w:ind w:left="720" w:hanging="720"/>
+                <w:rPr>
+                  <w:noProof/>
+                  <w:lang w:val="en-US"/>
+                </w:rPr>
+              </w:pPr>
+              <w:r>
+                <w:rPr>
+                  <w:noProof/>
+                  <w:lang w:val="en-US"/>
+                </w:rPr>
+                <w:t xml:space="preserve">Vaswani, A., Shazeer, N., Parmar, N., Uszkoreit, J., Jones, L., Gomez, A. N., &amp; Kaiser, Ł. (2017). </w:t>
+              </w:r>
+              <w:r>
+                <w:rPr>
+                  <w:i/>
+                  <w:iCs/>
+                  <w:noProof/>
+                  <w:lang w:val="en-US"/>
+                </w:rPr>
+                <w:t>Attention Is All You Need.</w:t>
+              </w:r>
+              <w:r>
+                <w:rPr>
+                  <w:noProof/>
+                  <w:lang w:val="en-US"/>
                 </w:rPr>
                 <w:t xml:space="preserve"> </w:t>
               </w:r>
@@ -14193,284 +15245,8 @@
               <w:r>
                 <w:rPr>
                   <w:noProof/>
+                  <w:lang w:val="en-US"/>
                 </w:rPr>
-                <w:t xml:space="preserve">Devlin, J., Chang, M.-W., Lee, K., &amp; Toutanova, K. (2018). </w:t>
-              </w:r>
-              <w:r>
-                <w:rPr>
-                  <w:i/>
-                  <w:iCs/>
-                  <w:noProof/>
-                </w:rPr>
-                <w:t>BERT: Pre-training of Deep Bidirectional Transformers for.</w:t>
-              </w:r>
-              <w:r>
-                <w:rPr>
-                  <w:noProof/>
-                </w:rPr>
-                <w:t xml:space="preserve"> </w:t>
-              </w:r>
-            </w:p>
-            <w:p>
-              <w:pPr>
-                <w:pStyle w:val="Bibliography"/>
-                <w:ind w:left="720" w:hanging="720"/>
-                <w:rPr>
-                  <w:noProof/>
-                </w:rPr>
-              </w:pPr>
-              <w:r>
-                <w:rPr>
-                  <w:noProof/>
-                </w:rPr>
-                <w:t xml:space="preserve">ELSTAT. (2023). </w:t>
-              </w:r>
-              <w:r>
-                <w:rPr>
-                  <w:i/>
-                  <w:iCs/>
-                  <w:noProof/>
-                </w:rPr>
-                <w:t>SURVEY ON THE USE OF INFORMATION AND COMMUNICATION TECHNOLOGIES.</w:t>
-              </w:r>
-              <w:r>
-                <w:rPr>
-                  <w:noProof/>
-                </w:rPr>
-                <w:t xml:space="preserve"> </w:t>
-              </w:r>
-            </w:p>
-            <w:p>
-              <w:pPr>
-                <w:pStyle w:val="Bibliography"/>
-                <w:ind w:left="720" w:hanging="720"/>
-                <w:rPr>
-                  <w:noProof/>
-                </w:rPr>
-              </w:pPr>
-              <w:r>
-                <w:rPr>
-                  <w:noProof/>
-                </w:rPr>
-                <w:t xml:space="preserve">Hochreiter, S., &amp; Schmidhuber, J. (1997). </w:t>
-              </w:r>
-              <w:r>
-                <w:rPr>
-                  <w:i/>
-                  <w:iCs/>
-                  <w:noProof/>
-                </w:rPr>
-                <w:t>Long Short-Term Memory. Neural Computation.</w:t>
-              </w:r>
-              <w:r>
-                <w:rPr>
-                  <w:noProof/>
-                </w:rPr>
-                <w:t xml:space="preserve"> </w:t>
-              </w:r>
-            </w:p>
-            <w:p>
-              <w:pPr>
-                <w:pStyle w:val="Bibliography"/>
-                <w:ind w:left="720" w:hanging="720"/>
-                <w:rPr>
-                  <w:noProof/>
-                </w:rPr>
-              </w:pPr>
-              <w:r>
-                <w:rPr>
-                  <w:noProof/>
-                </w:rPr>
-                <w:t xml:space="preserve">Kingma, D. P., &amp; Ba, J. L. (2015). Adam: A method for stochastic optimization. </w:t>
-              </w:r>
-              <w:r>
-                <w:rPr>
-                  <w:i/>
-                  <w:iCs/>
-                  <w:noProof/>
-                </w:rPr>
-                <w:t>ICLR conference.</w:t>
-              </w:r>
-              <w:r>
-                <w:rPr>
-                  <w:noProof/>
-                </w:rPr>
-                <w:t xml:space="preserve"> San Diego.</w:t>
-              </w:r>
-            </w:p>
-            <w:p>
-              <w:pPr>
-                <w:pStyle w:val="Bibliography"/>
-                <w:ind w:left="720" w:hanging="720"/>
-                <w:rPr>
-                  <w:noProof/>
-                </w:rPr>
-              </w:pPr>
-              <w:r>
-                <w:rPr>
-                  <w:noProof/>
-                </w:rPr>
-                <w:t xml:space="preserve">Koutsikakis, J., Chalkidis, I., Malakasiotis, P., &amp; Androutsopoulos, I. (2020). </w:t>
-              </w:r>
-              <w:r>
-                <w:rPr>
-                  <w:i/>
-                  <w:iCs/>
-                  <w:noProof/>
-                </w:rPr>
-                <w:t>GREEK-BERT: The Greeks visiting Sesame Street.</w:t>
-              </w:r>
-              <w:r>
-                <w:rPr>
-                  <w:noProof/>
-                </w:rPr>
-                <w:t xml:space="preserve"> </w:t>
-              </w:r>
-            </w:p>
-            <w:p>
-              <w:pPr>
-                <w:pStyle w:val="Bibliography"/>
-                <w:ind w:left="720" w:hanging="720"/>
-                <w:rPr>
-                  <w:noProof/>
-                </w:rPr>
-              </w:pPr>
-              <w:r>
-                <w:rPr>
-                  <w:noProof/>
-                </w:rPr>
-                <w:t xml:space="preserve">Madriaza, P., Hassan, G., Brouillette-Alarie, S., Mounchingam, A. N., Durocher-Corfa, L., Borokhovski, E., . . . Paillé, S. (2025). </w:t>
-              </w:r>
-              <w:r>
-                <w:rPr>
-                  <w:i/>
-                  <w:iCs/>
-                  <w:noProof/>
-                </w:rPr>
-                <w:t>Exposure to hate in online and traditional media: A systematic review and meta‐analysis of the impact of this exposure on individuals and communities.</w:t>
-              </w:r>
-              <w:r>
-                <w:rPr>
-                  <w:noProof/>
-                </w:rPr>
-                <w:t xml:space="preserve"> </w:t>
-              </w:r>
-            </w:p>
-            <w:p>
-              <w:pPr>
-                <w:pStyle w:val="Bibliography"/>
-                <w:ind w:left="720" w:hanging="720"/>
-                <w:rPr>
-                  <w:noProof/>
-                </w:rPr>
-              </w:pPr>
-              <w:r>
-                <w:rPr>
-                  <w:noProof/>
-                </w:rPr>
-                <w:t>Perifanos, K., &amp; Goutsos, D. (2021). Multimodal Hate Speech Detection in Greek Social Media.</w:t>
-              </w:r>
-            </w:p>
-            <w:p>
-              <w:pPr>
-                <w:pStyle w:val="Bibliography"/>
-                <w:ind w:left="720" w:hanging="720"/>
-                <w:rPr>
-                  <w:noProof/>
-                </w:rPr>
-              </w:pPr>
-              <w:r>
-                <w:rPr>
-                  <w:noProof/>
-                </w:rPr>
-                <w:t xml:space="preserve">Pitenis, Z., Zampieri, M., &amp; Ranasinghe, T. (2020). </w:t>
-              </w:r>
-              <w:r>
-                <w:rPr>
-                  <w:i/>
-                  <w:iCs/>
-                  <w:noProof/>
-                </w:rPr>
-                <w:t>Offensive Language Identification in Greek.</w:t>
-              </w:r>
-              <w:r>
-                <w:rPr>
-                  <w:noProof/>
-                </w:rPr>
-                <w:t xml:space="preserve"> </w:t>
-              </w:r>
-            </w:p>
-            <w:p>
-              <w:pPr>
-                <w:pStyle w:val="Bibliography"/>
-                <w:ind w:left="720" w:hanging="720"/>
-                <w:rPr>
-                  <w:noProof/>
-                </w:rPr>
-              </w:pPr>
-              <w:r>
-                <w:rPr>
-                  <w:noProof/>
-                </w:rPr>
-                <w:t xml:space="preserve">Shmulewitz, D. (2025). </w:t>
-              </w:r>
-              <w:r>
-                <w:rPr>
-                  <w:i/>
-                  <w:iCs/>
-                  <w:noProof/>
-                </w:rPr>
-                <w:t>Exposure to online hate speech is positively associated with post-traumatic stress disorder symptom severity.</w:t>
-              </w:r>
-              <w:r>
-                <w:rPr>
-                  <w:noProof/>
-                </w:rPr>
-                <w:t xml:space="preserve"> Jerusalem.</w:t>
-              </w:r>
-            </w:p>
-            <w:p>
-              <w:pPr>
-                <w:pStyle w:val="Bibliography"/>
-                <w:ind w:left="720" w:hanging="720"/>
-                <w:rPr>
-                  <w:noProof/>
-                </w:rPr>
-              </w:pPr>
-              <w:r>
-                <w:rPr>
-                  <w:noProof/>
-                </w:rPr>
-                <w:t xml:space="preserve">Vaswani, A., Shazeer, N., Parmar, N., Uszkoreit, J., Jones, L., Gomez, A. N., &amp; Kaiser, Ł. (2017). </w:t>
-              </w:r>
-              <w:r>
-                <w:rPr>
-                  <w:i/>
-                  <w:iCs/>
-                  <w:noProof/>
-                </w:rPr>
-                <w:t>Attention Is All You Need.</w:t>
-              </w:r>
-              <w:r>
-                <w:rPr>
-                  <w:noProof/>
-                </w:rPr>
-                <w:t xml:space="preserve"> </w:t>
-              </w:r>
-            </w:p>
-            <w:p>
-              <w:pPr>
-                <w:pStyle w:val="Bibliography"/>
-                <w:ind w:left="720" w:hanging="720"/>
-                <w:rPr>
-                  <w:noProof/>
-                </w:rPr>
-              </w:pPr>
-              <w:r>
-                <w:rPr>
-                  <w:noProof/>
-                </w:rPr>
-                <w:lastRenderedPageBreak/>
                 <w:t xml:space="preserve">Zampieri, M., Malmasi, S., Nakov, P., Rosenthal, S., Farra, N., &amp; Kumar, R. (2019). </w:t>
               </w:r>
               <w:r>
@@ -14478,14 +15254,22 @@
                   <w:i/>
                   <w:iCs/>
                   <w:noProof/>
+                  <w:lang w:val="en-US"/>
                 </w:rPr>
                 <w:t>SemEval-2019 Task 6: Identifying and Categorizing Offensive Language in Social Media.</w:t>
               </w:r>
               <w:r>
                 <w:rPr>
                   <w:noProof/>
+                  <w:lang w:val="en-US"/>
                 </w:rPr>
-                <w:t xml:space="preserve"> Minneapolis, Minnesota, USA: Association for Computational Linguistics.</w:t>
+                <w:t xml:space="preserve"> </w:t>
+              </w:r>
+              <w:r>
+                <w:rPr>
+                  <w:noProof/>
+                </w:rPr>
+                <w:t>Minneapolis, Minnesota, USA: Association for Computational Linguistics.</w:t>
               </w:r>
             </w:p>
             <w:p>
@@ -14550,40 +15334,6 @@
           <w:lang w:val="en-US"/>
         </w:rPr>
       </w:pPr>
-    </w:p>
-    <w:p>
-      <w:pPr>
-        <w:ind w:right="282"/>
-        <w:rPr>
-          <w:rFonts w:cs="Times New Roman"/>
-          <w:sz w:val="28"/>
-          <w:szCs w:val="28"/>
-        </w:rPr>
-      </w:pPr>
-      <w:r>
-        <w:rPr>
-          <w:rFonts w:cs="Times New Roman"/>
-          <w:sz w:val="28"/>
-          <w:szCs w:val="28"/>
-        </w:rPr>
-        <w:t xml:space="preserve">[Οπισθόφυλλο. </w:t>
-      </w:r>
-      <w:r>
-        <w:rPr>
-          <w:rFonts w:cs="Times New Roman"/>
-          <w:sz w:val="28"/>
-          <w:szCs w:val="28"/>
-        </w:rPr>
-        <w:t>Κενή σελίδα</w:t>
-      </w:r>
-      <w:r>
-        <w:rPr>
-          <w:rFonts w:cs="Times New Roman"/>
-          <w:sz w:val="28"/>
-          <w:szCs w:val="28"/>
-        </w:rPr>
-        <w:t>]</w:t>
-      </w:r>
     </w:p>
     <w:p>
       <w:pPr>
@@ -18948,7 +19698,7 @@
     </b:Author>
     <b:Title>BERT: Pre-training of Deep Bidirectional Transformers for</b:Title>
     <b:Year>2018</b:Year>
-    <b:RefOrder>10</b:RefOrder>
+    <b:RefOrder>6</b:RefOrder>
   </b:Source>
   <b:Source>
     <b:Tag>Die15</b:Tag>
@@ -18974,7 +19724,7 @@
     <b:Year>2015</b:Year>
     <b:City>San Diego</b:City>
     <b:ConferenceName>ICLR conference</b:ConferenceName>
-    <b:RefOrder>9</b:RefOrder>
+    <b:RefOrder>18</b:RefOrder>
   </b:Source>
   <b:Source>
     <b:Tag>Kon21</b:Tag>
@@ -18996,7 +19746,7 @@
     </b:Author>
     <b:Title>Multimodal Hate Speech Detection in Greek Social Media</b:Title>
     <b:Year>2021</b:Year>
-    <b:RefOrder>6</b:RefOrder>
+    <b:RefOrder>5</b:RefOrder>
   </b:Source>
   <b:Source>
     <b:Tag>Pio17</b:Tag>
@@ -19026,7 +19776,7 @@
     </b:Author>
     <b:Title>Enriching Word Vectors with Subword Information</b:Title>
     <b:Year>2017</b:Year>
-    <b:RefOrder>7</b:RefOrder>
+    <b:RefOrder>12</b:RefOrder>
   </b:Source>
   <b:Source>
     <b:Tag>Vas</b:Tag>
@@ -19109,7 +19859,7 @@
     <b:Year>2019</b:Year>
     <b:Publisher>Association for Computational Linguistics</b:Publisher>
     <b:City>Minneapolis, Minnesota, USA</b:City>
-    <b:RefOrder>13</b:RefOrder>
+    <b:RefOrder>20</b:RefOrder>
   </b:Source>
   <b:Source>
     <b:Tag>Ana21</b:Tag>
@@ -19128,7 +19878,7 @@
     <b:Title>Toxicity Detection on Greek Tweets</b:Title>
     <b:Year>2021</b:Year>
     <b:City>Athens</b:City>
-    <b:RefOrder>5</b:RefOrder>
+    <b:RefOrder>9</b:RefOrder>
   </b:Source>
   <b:Source>
     <b:Tag>Zes20</b:Tag>
@@ -19231,7 +19981,7 @@
     </b:Author>
     <b:Title>GREEK-BERT: The Greeks visiting Sesame Street</b:Title>
     <b:Year>2020</b:Year>
-    <b:RefOrder>12</b:RefOrder>
+    <b:RefOrder>7</b:RefOrder>
   </b:Source>
   <b:Source>
     <b:Tag>Sep97</b:Tag>
@@ -19253,13 +20003,228 @@
         </b:NameList>
       </b:Author>
     </b:Author>
+    <b:RefOrder>17</b:RefOrder>
+  </b:Source>
+  <b:Source>
+    <b:Tag>Yin19</b:Tag>
+    <b:SourceType>Report</b:SourceType>
+    <b:Guid>{5AE97761-9B23-40D4-8C27-817D218557B0}</b:Guid>
+    <b:Title>RoBERTa: A Robustly Optimized BERT Pretraining Approach</b:Title>
+    <b:Year>2019</b:Year>
+    <b:Author>
+      <b:Author>
+        <b:NameList>
+          <b:Person>
+            <b:Last>Liu</b:Last>
+            <b:First>Yinhan</b:First>
+          </b:Person>
+          <b:Person>
+            <b:Last>Ott</b:Last>
+            <b:First>Myle</b:First>
+          </b:Person>
+          <b:Person>
+            <b:Last>Goyal</b:Last>
+            <b:First>Naman</b:First>
+          </b:Person>
+          <b:Person>
+            <b:Last>Du</b:Last>
+            <b:First>Jingfei</b:First>
+          </b:Person>
+          <b:Person>
+            <b:Last>Joshi</b:Last>
+            <b:First>Mandar</b:First>
+          </b:Person>
+          <b:Person>
+            <b:Last>Chen</b:Last>
+            <b:First>Danqi</b:First>
+          </b:Person>
+          <b:Person>
+            <b:Last>Levy</b:Last>
+            <b:First>Omer</b:First>
+          </b:Person>
+          <b:Person>
+            <b:Last>Lewis</b:Last>
+            <b:First>Mike</b:First>
+          </b:Person>
+          <b:Person>
+            <b:Last>Zettlemoyer</b:Last>
+            <b:First>Luke</b:First>
+          </b:Person>
+          <b:Person>
+            <b:Last>Stoyanov</b:Last>
+            <b:First>Veselin</b:First>
+          </b:Person>
+        </b:NameList>
+      </b:Author>
+    </b:Author>
     <b:RefOrder>8</b:RefOrder>
+  </b:Source>
+  <b:Source>
+    <b:Tag>Kyu14</b:Tag>
+    <b:SourceType>Report</b:SourceType>
+    <b:Guid>{147EB1E7-3E39-4BF2-AF60-CDF0ED275307}</b:Guid>
+    <b:Title>Learning Phrase Representations using RNN Encoder–Decoder</b:Title>
+    <b:Year>2014</b:Year>
+    <b:Author>
+      <b:Author>
+        <b:NameList>
+          <b:Person>
+            <b:Last>Cho</b:Last>
+            <b:First>Kyunghyun</b:First>
+          </b:Person>
+          <b:Person>
+            <b:Last>Merrienboer</b:Last>
+            <b:First>Bart</b:First>
+            <b:Middle>van</b:Middle>
+          </b:Person>
+          <b:Person>
+            <b:Last>Bahdanau</b:Last>
+            <b:First>Caglar</b:First>
+            <b:Middle>GulcehreDzmitry</b:Middle>
+          </b:Person>
+          <b:Person>
+            <b:Last>Bougares</b:Last>
+            <b:First>Fethi</b:First>
+          </b:Person>
+          <b:Person>
+            <b:Last>Schwenk</b:Last>
+            <b:First>Holger</b:First>
+          </b:Person>
+          <b:Person>
+            <b:Last>Bengio</b:Last>
+            <b:First>Yoshua</b:First>
+          </b:Person>
+        </b:NameList>
+      </b:Author>
+    </b:Author>
+    <b:RefOrder>10</b:RefOrder>
+  </b:Source>
+  <b:Source>
+    <b:Tag>Tom13</b:Tag>
+    <b:SourceType>Report</b:SourceType>
+    <b:Guid>{D1792FFE-DD15-4DCD-946C-D4454F41A503}</b:Guid>
+    <b:Author>
+      <b:Author>
+        <b:NameList>
+          <b:Person>
+            <b:Last>Mikolov</b:Last>
+            <b:First>Tomas</b:First>
+          </b:Person>
+          <b:Person>
+            <b:Last>Chen</b:Last>
+            <b:First>Kai</b:First>
+          </b:Person>
+          <b:Person>
+            <b:Last>Corrado</b:Last>
+            <b:First>Greg</b:First>
+          </b:Person>
+          <b:Person>
+            <b:Last>Dean</b:Last>
+            <b:First>Jeffrey</b:First>
+          </b:Person>
+        </b:NameList>
+      </b:Author>
+    </b:Author>
+    <b:Title>Efficient Estimation of Word Representations in</b:Title>
+    <b:Year>2013</b:Year>
+    <b:RefOrder>13</b:RefOrder>
+  </b:Source>
+  <b:Source>
+    <b:Tag>Phi05</b:Tag>
+    <b:SourceType>ConferenceProceedings</b:SourceType>
+    <b:Guid>{8DDAD8E3-C252-403B-9939-FDC40B97ABC0}</b:Guid>
+    <b:Title>Europarl: A Parallel Corpus for Statistical Machine Translation</b:Title>
+    <b:Year>2005</b:Year>
+    <b:City>Phuket, Thailand</b:City>
+    <b:Author>
+      <b:Author>
+        <b:NameList>
+          <b:Person>
+            <b:Last>Koehn</b:Last>
+            <b:First>Philipp</b:First>
+          </b:Person>
+        </b:NameList>
+      </b:Author>
+    </b:Author>
+    <b:Pages>8</b:Pages>
+    <b:ConferenceName>Machine Translation Summit X: Papers</b:ConferenceName>
+    <b:RefOrder>14</b:RefOrder>
+  </b:Source>
+  <b:Source>
+    <b:Tag>Kar72</b:Tag>
+    <b:SourceType>Report</b:SourceType>
+    <b:Guid>{F878A0DD-963E-4EA8-A73C-DB1DA16526DC}</b:Guid>
+    <b:Title>A statistical interpretation of term specificity</b:Title>
+    <b:Year>1972</b:Year>
+    <b:Publisher>University of Cambridge</b:Publisher>
+    <b:Author>
+      <b:Author>
+        <b:NameList>
+          <b:Person>
+            <b:Last>Jones</b:Last>
+            <b:First>Karen</b:First>
+            <b:Middle>Spärck</b:Middle>
+          </b:Person>
+        </b:NameList>
+      </b:Author>
+    </b:Author>
+    <b:RefOrder>15</b:RefOrder>
+  </b:Source>
+  <b:Source>
+    <b:Tag>Mik</b:Tag>
+    <b:SourceType>Report</b:SourceType>
+    <b:Guid>{8FEE4514-27F9-493A-BCC4-B16685562335}</b:Guid>
+    <b:Author>
+      <b:Author>
+        <b:NameList>
+          <b:Person>
+            <b:Last>Schuster</b:Last>
+            <b:First>Mike</b:First>
+          </b:Person>
+          <b:Person>
+            <b:Last>Paliwal</b:Last>
+            <b:First>Kuldip</b:First>
+            <b:Middle>K.</b:Middle>
+          </b:Person>
+        </b:NameList>
+      </b:Author>
+    </b:Author>
+    <b:Title>Bidirectional Recurrent Neural Networks</b:Title>
+    <b:Year>1997</b:Year>
+    <b:RefOrder>16</b:RefOrder>
+  </b:Source>
+  <b:Source>
+    <b:Tag>Joh11</b:Tag>
+    <b:SourceType>JournalArticle</b:SourceType>
+    <b:Guid>{186404F9-87D9-4708-B58A-E3B2FD0EF99B}</b:Guid>
+    <b:Title>Adaptive Subgradient Methods for</b:Title>
+    <b:Year>2011</b:Year>
+    <b:Author>
+      <b:Author>
+        <b:NameList>
+          <b:Person>
+            <b:Last>Duchi</b:Last>
+            <b:First>John</b:First>
+          </b:Person>
+          <b:Person>
+            <b:Last>Hazan</b:Last>
+            <b:First>Elad</b:First>
+          </b:Person>
+          <b:Person>
+            <b:Last>Singer</b:Last>
+            <b:First>Yoram</b:First>
+          </b:Person>
+        </b:NameList>
+      </b:Author>
+    </b:Author>
+    <b:JournalName>Journal of Machine Learning Research 12</b:JournalName>
+    <b:RefOrder>19</b:RefOrder>
   </b:Source>
 </b:Sources>
 </file>
 
 <file path=customXml/itemProps1.xml><?xml version="1.0" encoding="utf-8"?>
-<ds:datastoreItem xmlns:ds="http://schemas.openxmlformats.org/officeDocument/2006/customXml" ds:itemID="{26A481DD-2F98-47E7-9CC7-1A7DD35E50D1}">
+<ds:datastoreItem xmlns:ds="http://schemas.openxmlformats.org/officeDocument/2006/customXml" ds:itemID="{A5C9446B-2BEA-4F01-BBB0-4D9F0FFC85BB}">
   <ds:schemaRefs>
     <ds:schemaRef ds:uri="http://schemas.openxmlformats.org/officeDocument/2006/bibliography"/>
   </ds:schemaRefs>

</xml_diff>